<commit_message>
Added more skills and MSI links
</commit_message>
<xml_diff>
--- a/cv/Richard Clough cv.docx
+++ b/cv/Richard Clough cv.docx
@@ -76,10 +76,8 @@
           <w:rPr>
             <w:rStyle w:val="Hyperlink"/>
             <w:rFonts w:eastAsia="Arial" w:cs="Arial"/>
-            <w:color w:val="000000"/>
             <w:sz w:val="20"/>
             <w:szCs w:val="20"/>
-            <w:u w:val="single"/>
           </w:rPr>
           <w:t>https://linkedin.com/in/richard-clough</w:t>
         </w:r>
@@ -99,10 +97,8 @@
           <w:rPr>
             <w:rStyle w:val="Hyperlink"/>
             <w:rFonts w:eastAsia="Arial" w:cs="Arial"/>
-            <w:color w:val="000000"/>
             <w:sz w:val="20"/>
             <w:szCs w:val="20"/>
-            <w:u w:val="single"/>
           </w:rPr>
           <w:t>https://richardjclough.github.io/folio</w:t>
         </w:r>
@@ -143,34 +139,7 @@
           <w:sz w:val="20"/>
           <w:szCs w:val="20"/>
         </w:rPr>
-        <w:t xml:space="preserve">Digital Experience Designer and UI/UX practitioner with 7+ years delivering user-centred web solutions across Healthcare, Media, Retail, EdTech, and Not-for-Profit. Experienced in the full design and delivery cycle, from UX research, Figma prototyping, and information architecture through to hands-on front-end development, QA, and deployment. Equally comfortable owning digital </w:t>
-      </w:r>
-      <w:r>
-        <w:rPr>
-          <w:rFonts w:eastAsia="Arial" w:cs="Arial"/>
-          <w:color w:val="1A1A1A"/>
-          <w:sz w:val="20"/>
-          <w:szCs w:val="20"/>
-        </w:rPr>
-        <w:t>p</w:t>
-      </w:r>
-      <w:r>
-        <w:rPr>
-          <w:rFonts w:eastAsia="Arial" w:cs="Arial"/>
-          <w:color w:val="1A1A1A"/>
-          <w:sz w:val="20"/>
-          <w:szCs w:val="20"/>
-        </w:rPr>
-        <w:t>latforms</w:t>
-      </w:r>
-      <w:r>
-        <w:rPr>
-          <w:rFonts w:eastAsia="Arial" w:cs="Arial"/>
-          <w:color w:val="1A1A1A"/>
-          <w:sz w:val="20"/>
-          <w:szCs w:val="20"/>
-        </w:rPr>
-        <w:t xml:space="preserve"> end-to-end as a Website Manager or embedded as a UI/UX designer within a cross-functional team. A natural problem-solver who identifies gaps in the user experience and builds practical, creative solutions, evidenced by a portfolio of live work at </w:t>
+        <w:t xml:space="preserve">Digital Experience Designer and UI/UX practitioner with 7+ years delivering user-centred web solutions across Healthcare, Media, Retail, EdTech, and Not-for-Profit. Experienced in the full design and delivery cycle, from UX research, Figma prototyping, and information architecture through to hands-on front-end development, QA, and deployment. Equally comfortable owning digital platforms end-to-end as a Website Manager or embedded as a UI/UX designer within a cross-functional team. A natural problem-solver who identifies gaps in the user experience and builds practical, creative solutions, evidenced by a portfolio of live work at </w:t>
       </w:r>
       <w:r>
         <w:fldChar w:fldCharType="begin"/>
@@ -179,7 +148,6 @@
         <w:rPr>
           <w:rStyle w:val="Hyperlink"/>
           <w:rFonts w:eastAsia="Arial" w:cs="Arial"/>
-          <w:color w:val="1A1A1A"/>
           <w:sz w:val="20"/>
           <w:szCs w:val="20"/>
         </w:rPr>
@@ -189,7 +157,6 @@
         <w:rPr>
           <w:rStyle w:val="Hyperlink"/>
           <w:rFonts w:eastAsia="Arial" w:cs="Arial"/>
-          <w:color w:val="1A1A1A"/>
           <w:sz w:val="20"/>
           <w:szCs w:val="20"/>
         </w:rPr>
@@ -199,7 +166,6 @@
         <w:rPr>
           <w:rStyle w:val="Hyperlink"/>
           <w:rFonts w:eastAsia="Arial" w:cs="Arial"/>
-          <w:color w:val="1A1A1A"/>
           <w:sz w:val="20"/>
           <w:szCs w:val="20"/>
         </w:rPr>
@@ -209,7 +175,6 @@
         <w:rPr>
           <w:rStyle w:val="Hyperlink"/>
           <w:rFonts w:eastAsia="Arial" w:cs="Arial"/>
-          <w:color w:val="1A1A1A"/>
           <w:sz w:val="20"/>
           <w:szCs w:val="20"/>
         </w:rPr>
@@ -289,7 +254,7 @@
         <w:pStyle w:val="ListParagraph"/>
         <w:numPr>
           <w:ilvl w:val="0"/>
-          <w:numId w:val="6"/>
+          <w:numId w:val="7"/>
         </w:numPr>
         <w:spacing w:before="0" w:after="40"/>
         <w:rPr/>
@@ -309,7 +274,7 @@
         <w:pStyle w:val="ListParagraph"/>
         <w:numPr>
           <w:ilvl w:val="0"/>
-          <w:numId w:val="6"/>
+          <w:numId w:val="7"/>
         </w:numPr>
         <w:spacing w:before="0" w:after="40"/>
         <w:rPr/>
@@ -329,7 +294,7 @@
         <w:pStyle w:val="ListParagraph"/>
         <w:numPr>
           <w:ilvl w:val="0"/>
-          <w:numId w:val="6"/>
+          <w:numId w:val="7"/>
         </w:numPr>
         <w:spacing w:before="0" w:after="40"/>
         <w:rPr/>
@@ -349,7 +314,7 @@
         <w:pStyle w:val="ListParagraph"/>
         <w:numPr>
           <w:ilvl w:val="0"/>
-          <w:numId w:val="6"/>
+          <w:numId w:val="7"/>
         </w:numPr>
         <w:spacing w:before="0" w:after="40"/>
         <w:rPr/>
@@ -369,7 +334,7 @@
         <w:pStyle w:val="ListParagraph"/>
         <w:numPr>
           <w:ilvl w:val="0"/>
-          <w:numId w:val="6"/>
+          <w:numId w:val="7"/>
         </w:numPr>
         <w:spacing w:before="0" w:after="40"/>
         <w:rPr/>
@@ -389,7 +354,7 @@
         <w:pStyle w:val="ListParagraph"/>
         <w:numPr>
           <w:ilvl w:val="0"/>
-          <w:numId w:val="6"/>
+          <w:numId w:val="7"/>
         </w:numPr>
         <w:spacing w:before="0" w:after="40"/>
         <w:rPr/>
@@ -409,8 +374,9 @@
         <w:pStyle w:val="ListParagraph"/>
         <w:numPr>
           <w:ilvl w:val="0"/>
-          <w:numId w:val="6"/>
-        </w:numPr>
+          <w:numId w:val="7"/>
+        </w:numPr>
+        <w:bidi w:val="0"/>
         <w:spacing w:before="0" w:after="40"/>
         <w:rPr/>
       </w:pPr>
@@ -421,15 +387,15 @@
           <w:sz w:val="20"/>
           <w:szCs w:val="20"/>
         </w:rPr>
-        <w:t>Adobe Creative Suite &amp; video editing</w:t>
-      </w:r>
-    </w:p>
-    <w:p>
-      <w:pPr>
-        <w:pStyle w:val="ListParagraph"/>
-        <w:numPr>
-          <w:ilvl w:val="0"/>
-          <w:numId w:val="6"/>
+        <w:t>Adobe Creative Suite inc video editing (Photoshop, Illustrator, InDesign and Premiere), Canva, Affinity</w:t>
+      </w:r>
+    </w:p>
+    <w:p>
+      <w:pPr>
+        <w:pStyle w:val="ListParagraph"/>
+        <w:numPr>
+          <w:ilvl w:val="0"/>
+          <w:numId w:val="7"/>
         </w:numPr>
         <w:spacing w:before="0" w:after="40"/>
         <w:rPr/>
@@ -449,7 +415,7 @@
         <w:pStyle w:val="ListParagraph"/>
         <w:numPr>
           <w:ilvl w:val="0"/>
-          <w:numId w:val="6"/>
+          <w:numId w:val="7"/>
         </w:numPr>
         <w:spacing w:before="0" w:after="40"/>
         <w:rPr/>
@@ -469,7 +435,7 @@
         <w:pStyle w:val="ListParagraph"/>
         <w:numPr>
           <w:ilvl w:val="0"/>
-          <w:numId w:val="6"/>
+          <w:numId w:val="7"/>
         </w:numPr>
         <w:spacing w:before="0" w:after="40"/>
         <w:rPr/>
@@ -489,7 +455,7 @@
         <w:pStyle w:val="ListParagraph"/>
         <w:numPr>
           <w:ilvl w:val="0"/>
-          <w:numId w:val="6"/>
+          <w:numId w:val="7"/>
         </w:numPr>
         <w:spacing w:before="0" w:after="40"/>
         <w:rPr/>
@@ -527,7 +493,7 @@
         <w:pStyle w:val="ListParagraph"/>
         <w:numPr>
           <w:ilvl w:val="0"/>
-          <w:numId w:val="3"/>
+          <w:numId w:val="4"/>
         </w:numPr>
         <w:spacing w:before="0" w:after="40"/>
         <w:rPr/>
@@ -547,7 +513,7 @@
         <w:pStyle w:val="ListParagraph"/>
         <w:numPr>
           <w:ilvl w:val="0"/>
-          <w:numId w:val="3"/>
+          <w:numId w:val="4"/>
         </w:numPr>
         <w:spacing w:before="0" w:after="40"/>
         <w:rPr/>
@@ -567,7 +533,7 @@
         <w:pStyle w:val="ListParagraph"/>
         <w:numPr>
           <w:ilvl w:val="0"/>
-          <w:numId w:val="3"/>
+          <w:numId w:val="4"/>
         </w:numPr>
         <w:spacing w:before="0" w:after="40"/>
         <w:rPr/>
@@ -587,7 +553,7 @@
         <w:pStyle w:val="ListParagraph"/>
         <w:numPr>
           <w:ilvl w:val="0"/>
-          <w:numId w:val="3"/>
+          <w:numId w:val="4"/>
         </w:numPr>
         <w:spacing w:before="0" w:after="40"/>
         <w:rPr/>
@@ -607,7 +573,7 @@
         <w:pStyle w:val="ListParagraph"/>
         <w:numPr>
           <w:ilvl w:val="0"/>
-          <w:numId w:val="3"/>
+          <w:numId w:val="4"/>
         </w:numPr>
         <w:spacing w:before="0" w:after="40"/>
         <w:rPr/>
@@ -627,7 +593,7 @@
         <w:pStyle w:val="ListParagraph"/>
         <w:numPr>
           <w:ilvl w:val="0"/>
-          <w:numId w:val="3"/>
+          <w:numId w:val="4"/>
         </w:numPr>
         <w:spacing w:before="0" w:after="40"/>
         <w:rPr/>
@@ -647,7 +613,7 @@
         <w:pStyle w:val="ListParagraph"/>
         <w:numPr>
           <w:ilvl w:val="0"/>
-          <w:numId w:val="3"/>
+          <w:numId w:val="4"/>
         </w:numPr>
         <w:spacing w:before="0" w:after="40"/>
         <w:rPr/>
@@ -667,7 +633,7 @@
         <w:pStyle w:val="ListParagraph"/>
         <w:numPr>
           <w:ilvl w:val="0"/>
-          <w:numId w:val="3"/>
+          <w:numId w:val="4"/>
         </w:numPr>
         <w:spacing w:before="0" w:after="40"/>
         <w:rPr/>
@@ -687,7 +653,7 @@
         <w:pStyle w:val="ListParagraph"/>
         <w:numPr>
           <w:ilvl w:val="0"/>
-          <w:numId w:val="3"/>
+          <w:numId w:val="4"/>
         </w:numPr>
         <w:spacing w:before="0" w:after="40"/>
         <w:rPr/>
@@ -707,7 +673,7 @@
         <w:pStyle w:val="ListParagraph"/>
         <w:numPr>
           <w:ilvl w:val="0"/>
-          <w:numId w:val="3"/>
+          <w:numId w:val="4"/>
         </w:numPr>
         <w:spacing w:before="0" w:after="40"/>
         <w:rPr/>
@@ -719,8 +685,19 @@
           <w:sz w:val="20"/>
           <w:szCs w:val="20"/>
         </w:rPr>
-        <w:t xml:space="preserve">Agile delivery &amp; sprint planning (Jira, </w:t>
-      </w:r>
+        <w:t>Agile delivery &amp; sprint planning (Jira, Confluence)</w:t>
+      </w:r>
+    </w:p>
+    <w:p>
+      <w:pPr>
+        <w:pStyle w:val="ListParagraph"/>
+        <w:numPr>
+          <w:ilvl w:val="0"/>
+          <w:numId w:val="4"/>
+        </w:numPr>
+        <w:spacing w:before="0" w:after="40"/>
+        <w:rPr/>
+      </w:pPr>
       <w:r>
         <w:rPr>
           <w:rFonts w:eastAsia="Arial" w:cs="Arial"/>
@@ -728,35 +705,6 @@
           <w:sz w:val="20"/>
           <w:szCs w:val="20"/>
         </w:rPr>
-        <w:t>Confluence</w:t>
-      </w:r>
-      <w:r>
-        <w:rPr>
-          <w:rFonts w:eastAsia="Arial" w:cs="Arial"/>
-          <w:color w:val="000000"/>
-          <w:sz w:val="20"/>
-          <w:szCs w:val="20"/>
-        </w:rPr>
-        <w:t>)</w:t>
-      </w:r>
-    </w:p>
-    <w:p>
-      <w:pPr>
-        <w:pStyle w:val="ListParagraph"/>
-        <w:numPr>
-          <w:ilvl w:val="0"/>
-          <w:numId w:val="3"/>
-        </w:numPr>
-        <w:spacing w:before="0" w:after="40"/>
-        <w:rPr/>
-      </w:pPr>
-      <w:r>
-        <w:rPr>
-          <w:rFonts w:eastAsia="Arial" w:cs="Arial"/>
-          <w:color w:val="000000"/>
-          <w:sz w:val="20"/>
-          <w:szCs w:val="20"/>
-        </w:rPr>
         <w:t>Google Business Profile management</w:t>
       </w:r>
     </w:p>
@@ -765,7 +713,7 @@
         <w:pStyle w:val="ListParagraph"/>
         <w:numPr>
           <w:ilvl w:val="0"/>
-          <w:numId w:val="3"/>
+          <w:numId w:val="4"/>
         </w:numPr>
         <w:spacing w:before="0" w:after="40"/>
         <w:rPr/>
@@ -803,7 +751,7 @@
         <w:pStyle w:val="ListParagraph"/>
         <w:numPr>
           <w:ilvl w:val="0"/>
-          <w:numId w:val="4"/>
+          <w:numId w:val="5"/>
         </w:numPr>
         <w:spacing w:before="0" w:after="40"/>
         <w:rPr/>
@@ -823,7 +771,7 @@
         <w:pStyle w:val="ListParagraph"/>
         <w:numPr>
           <w:ilvl w:val="0"/>
-          <w:numId w:val="4"/>
+          <w:numId w:val="5"/>
         </w:numPr>
         <w:spacing w:before="0" w:after="40"/>
         <w:rPr/>
@@ -843,7 +791,7 @@
         <w:pStyle w:val="ListParagraph"/>
         <w:numPr>
           <w:ilvl w:val="0"/>
-          <w:numId w:val="4"/>
+          <w:numId w:val="5"/>
         </w:numPr>
         <w:spacing w:before="0" w:after="40"/>
         <w:rPr/>
@@ -863,7 +811,7 @@
         <w:pStyle w:val="ListParagraph"/>
         <w:numPr>
           <w:ilvl w:val="0"/>
-          <w:numId w:val="4"/>
+          <w:numId w:val="5"/>
         </w:numPr>
         <w:spacing w:before="0" w:after="40"/>
         <w:rPr/>
@@ -883,7 +831,7 @@
         <w:pStyle w:val="ListParagraph"/>
         <w:numPr>
           <w:ilvl w:val="0"/>
-          <w:numId w:val="4"/>
+          <w:numId w:val="5"/>
         </w:numPr>
         <w:spacing w:before="0" w:after="40"/>
         <w:rPr/>
@@ -903,7 +851,7 @@
         <w:pStyle w:val="ListParagraph"/>
         <w:numPr>
           <w:ilvl w:val="0"/>
-          <w:numId w:val="4"/>
+          <w:numId w:val="5"/>
         </w:numPr>
         <w:spacing w:before="0" w:after="40"/>
         <w:rPr/>
@@ -995,27 +943,7 @@
         <w:pStyle w:val="ListParagraph"/>
         <w:numPr>
           <w:ilvl w:val="0"/>
-          <w:numId w:val="1"/>
-        </w:numPr>
-        <w:spacing w:before="40" w:after="40"/>
-        <w:rPr/>
-      </w:pPr>
-      <w:r>
-        <w:rPr>
-          <w:rFonts w:eastAsia="Arial" w:cs="Arial"/>
-          <w:color w:val="1A1A1A"/>
-          <w:sz w:val="20"/>
-          <w:szCs w:val="20"/>
-        </w:rPr>
-        <w:t>Applied human-centred design and GA4 A/B testing to redesign a high-traffic costs and pricing page, delivering two Figma-prototyped layout variants and using behavioural data to identify the approach that best reduced friction and improved conversion for prospective patients.</w:t>
-      </w:r>
-    </w:p>
-    <w:p>
-      <w:pPr>
-        <w:pStyle w:val="ListParagraph"/>
-        <w:numPr>
-          <w:ilvl w:val="0"/>
-          <w:numId w:val="1"/>
+          <w:numId w:val="2"/>
         </w:numPr>
         <w:bidi w:val="0"/>
         <w:spacing w:before="40" w:after="40"/>
@@ -1041,93 +969,61 @@
         <w:pStyle w:val="ListParagraph"/>
         <w:numPr>
           <w:ilvl w:val="1"/>
-          <w:numId w:val="2"/>
+          <w:numId w:val="3"/>
         </w:numPr>
         <w:bidi w:val="0"/>
         <w:spacing w:before="40" w:after="40"/>
-        <w:rPr/>
-      </w:pPr>
-      <w:r>
-        <w:rPr>
-          <w:rFonts w:eastAsia="Arial" w:cs="Arial"/>
-          <w:color w:val="1A1A1A"/>
-          <w:sz w:val="20"/>
-          <w:szCs w:val="20"/>
-        </w:rPr>
-        <w:t>Built a combined Google Maps clinic locator integrating Google Business Profile data (</w:t>
-      </w:r>
-      <w:r>
-        <w:fldChar w:fldCharType="begin"/>
-      </w:r>
-      <w:r>
-        <w:rPr>
-          <w:rStyle w:val="Hyperlink"/>
-          <w:rFonts w:eastAsia="Arial" w:cs="Arial"/>
-          <w:color w:val="1A1A1A"/>
-          <w:sz w:val="20"/>
-          <w:szCs w:val="20"/>
-        </w:rPr>
-        <w:instrText xml:space="preserve"> HYPERLINK "https://vasectomy.org.au/locations/vic/melbourne/" \l "location"</w:instrText>
-      </w:r>
-      <w:r>
-        <w:rPr>
-          <w:rStyle w:val="Hyperlink"/>
-          <w:rFonts w:eastAsia="Arial" w:cs="Arial"/>
-          <w:color w:val="1A1A1A"/>
-          <w:sz w:val="20"/>
-          <w:szCs w:val="20"/>
-        </w:rPr>
-        <w:fldChar w:fldCharType="separate"/>
-      </w:r>
-      <w:r>
-        <w:rPr>
-          <w:rStyle w:val="Hyperlink"/>
-          <w:rFonts w:eastAsia="Arial" w:cs="Arial"/>
-          <w:color w:val="1A1A1A"/>
-          <w:sz w:val="20"/>
-          <w:szCs w:val="20"/>
-        </w:rPr>
-        <w:t>https://vasectomy.org.au/locations/vic/melbourne/#location</w:t>
-      </w:r>
-      <w:r>
-        <w:rPr>
-          <w:rStyle w:val="Hyperlink"/>
-          <w:rFonts w:eastAsia="Arial" w:cs="Arial"/>
-          <w:color w:val="1A1A1A"/>
-          <w:sz w:val="20"/>
-          <w:szCs w:val="20"/>
-        </w:rPr>
-        <w:fldChar w:fldCharType="end"/>
-      </w:r>
-      <w:r>
-        <w:rPr>
-          <w:rFonts w:eastAsia="Arial" w:cs="Arial"/>
-          <w:color w:val="1A1A1A"/>
-          <w:sz w:val="20"/>
-          <w:szCs w:val="20"/>
-        </w:rPr>
-        <w:t>)</w:t>
-      </w:r>
-    </w:p>
-    <w:p>
-      <w:pPr>
-        <w:pStyle w:val="ListParagraph"/>
-        <w:numPr>
-          <w:ilvl w:val="1"/>
-          <w:numId w:val="2"/>
-        </w:numPr>
-        <w:bidi w:val="0"/>
-        <w:spacing w:before="40" w:after="40"/>
-        <w:rPr/>
-      </w:pPr>
-      <w:r>
-        <w:rPr>
-          <w:rFonts w:eastAsia="Arial" w:cs="Arial"/>
-          <w:color w:val="1A1A1A"/>
-          <w:sz w:val="20"/>
-          <w:szCs w:val="20"/>
-        </w:rPr>
-        <w:t>Designed and deployed a web chat feature to increase patient engagement (</w:t>
+        <w:rPr>
+          <w:rFonts w:eastAsia="Arial" w:cs="Arial"/>
+          <w:color w:val="1A1A1A"/>
+          <w:sz w:val="20"/>
+          <w:szCs w:val="20"/>
+        </w:rPr>
+      </w:pPr>
+      <w:r>
+        <w:rPr>
+          <w:rFonts w:eastAsia="Arial" w:cs="Arial"/>
+          <w:color w:val="1A1A1A"/>
+          <w:sz w:val="20"/>
+          <w:szCs w:val="20"/>
+        </w:rPr>
+        <w:t xml:space="preserve">Applied human-centred design and GA4 A/B testing to redesign a high-traffic costs and pricing page. The </w:t>
+      </w:r>
+      <w:r>
+        <w:rPr>
+          <w:rFonts w:eastAsia="Arial" w:cs="Arial"/>
+          <w:color w:val="1A1A1A"/>
+          <w:sz w:val="20"/>
+          <w:szCs w:val="20"/>
+        </w:rPr>
+        <w:t xml:space="preserve">main issue was that the </w:t>
+      </w:r>
+      <w:r>
+        <w:rPr>
+          <w:rFonts w:eastAsia="Arial" w:cs="Arial"/>
+          <w:color w:val="1A1A1A"/>
+          <w:sz w:val="20"/>
+          <w:szCs w:val="20"/>
+        </w:rPr>
+        <w:t xml:space="preserve">original page was very long and </w:t>
+      </w:r>
+      <w:r>
+        <w:rPr>
+          <w:rFonts w:eastAsia="Arial" w:cs="Arial"/>
+          <w:color w:val="1A1A1A"/>
+          <w:sz w:val="20"/>
+          <w:szCs w:val="20"/>
+        </w:rPr>
+        <w:t>induced</w:t>
+      </w:r>
+      <w:r>
+        <w:rPr>
+          <w:rFonts w:eastAsia="Arial" w:cs="Arial"/>
+          <w:color w:val="1A1A1A"/>
+          <w:sz w:val="20"/>
+          <w:szCs w:val="20"/>
+        </w:rPr>
+        <w:t xml:space="preserve"> scroll fatigue, which is especially an issue on mobile devices (</w:t>
       </w:r>
       <w:hyperlink r:id="rId4">
         <w:r>
@@ -1138,6 +1034,154 @@
             <w:sz w:val="20"/>
             <w:szCs w:val="20"/>
           </w:rPr>
+          <w:t>https://www.msiaustralia.org.au/costs-and-prices</w:t>
+        </w:r>
+      </w:hyperlink>
+      <w:r>
+        <w:rPr>
+          <w:rFonts w:eastAsia="Arial" w:cs="Arial"/>
+          <w:color w:val="1A1A1A"/>
+          <w:sz w:val="20"/>
+          <w:szCs w:val="20"/>
+        </w:rPr>
+        <w:t xml:space="preserve">). One of the improved variations is at </w:t>
+      </w:r>
+      <w:r>
+        <w:rPr>
+          <w:rFonts w:eastAsia="Arial" w:cs="Arial"/>
+          <w:color w:val="000000"/>
+          <w:sz w:val="20"/>
+          <w:szCs w:val="20"/>
+        </w:rPr>
+        <w:t>(</w:t>
+      </w:r>
+      <w:r>
+        <w:rPr>
+          <w:rStyle w:val="Hyperlink"/>
+          <w:rFonts w:eastAsia="Arial" w:cs="Arial"/>
+          <w:sz w:val="20"/>
+          <w:szCs w:val="20"/>
+        </w:rPr>
+        <w:t>h</w:t>
+      </w:r>
+      <w:hyperlink r:id="rId5">
+        <w:r>
+          <w:rPr>
+            <w:rStyle w:val="Hyperlink"/>
+            <w:rFonts w:eastAsia="Arial" w:cs="Arial"/>
+            <w:sz w:val="20"/>
+            <w:szCs w:val="20"/>
+          </w:rPr>
+          <w:t>ttps://dev.msiaustralia.org.au/costs-and-prices-button-tabs/</w:t>
+        </w:r>
+      </w:hyperlink>
+      <w:r>
+        <w:rPr>
+          <w:rFonts w:eastAsia="Arial" w:cs="Arial"/>
+          <w:color w:val="000000"/>
+          <w:sz w:val="20"/>
+          <w:szCs w:val="20"/>
+        </w:rPr>
+        <w:t>).</w:t>
+      </w:r>
+    </w:p>
+    <w:p>
+      <w:pPr>
+        <w:pStyle w:val="ListParagraph"/>
+        <w:numPr>
+          <w:ilvl w:val="1"/>
+          <w:numId w:val="3"/>
+        </w:numPr>
+        <w:bidi w:val="0"/>
+        <w:spacing w:before="40" w:after="40"/>
+        <w:rPr/>
+      </w:pPr>
+      <w:r>
+        <w:rPr>
+          <w:rFonts w:eastAsia="Arial" w:cs="Arial"/>
+          <w:color w:val="1A1A1A"/>
+          <w:sz w:val="20"/>
+          <w:szCs w:val="20"/>
+        </w:rPr>
+        <w:t>Built a combined Google Maps clinic locator integrating Google Business Profile data to increase user engagement (</w:t>
+      </w:r>
+      <w:r>
+        <w:fldChar w:fldCharType="begin"/>
+      </w:r>
+      <w:r>
+        <w:rPr>
+          <w:rStyle w:val="Hyperlink"/>
+          <w:rFonts w:eastAsia="Arial" w:cs="Arial"/>
+          <w:sz w:val="20"/>
+          <w:szCs w:val="20"/>
+        </w:rPr>
+        <w:instrText xml:space="preserve"> HYPERLINK "https://vasectomy.org.au/locations/vic/melbourne/" \l "location"</w:instrText>
+      </w:r>
+      <w:r>
+        <w:rPr>
+          <w:rStyle w:val="Hyperlink"/>
+          <w:rFonts w:eastAsia="Arial" w:cs="Arial"/>
+          <w:sz w:val="20"/>
+          <w:szCs w:val="20"/>
+        </w:rPr>
+        <w:fldChar w:fldCharType="separate"/>
+      </w:r>
+      <w:r>
+        <w:rPr>
+          <w:rStyle w:val="Hyperlink"/>
+          <w:rFonts w:eastAsia="Arial" w:cs="Arial"/>
+          <w:sz w:val="20"/>
+          <w:szCs w:val="20"/>
+        </w:rPr>
+        <w:t>https://vasectomy.org.au/locations/vic/melbourne/#location</w:t>
+      </w:r>
+      <w:r>
+        <w:rPr>
+          <w:rStyle w:val="Hyperlink"/>
+          <w:rFonts w:eastAsia="Arial" w:cs="Arial"/>
+          <w:sz w:val="20"/>
+          <w:szCs w:val="20"/>
+        </w:rPr>
+        <w:fldChar w:fldCharType="end"/>
+      </w:r>
+      <w:r>
+        <w:rPr>
+          <w:rFonts w:eastAsia="Arial" w:cs="Arial"/>
+          <w:color w:val="1A1A1A"/>
+          <w:sz w:val="20"/>
+          <w:szCs w:val="20"/>
+        </w:rPr>
+        <w:t>)</w:t>
+      </w:r>
+    </w:p>
+    <w:p>
+      <w:pPr>
+        <w:pStyle w:val="ListParagraph"/>
+        <w:numPr>
+          <w:ilvl w:val="1"/>
+          <w:numId w:val="3"/>
+        </w:numPr>
+        <w:bidi w:val="0"/>
+        <w:spacing w:before="40" w:after="40"/>
+        <w:rPr/>
+      </w:pPr>
+      <w:r>
+        <w:rPr>
+          <w:rFonts w:eastAsia="Arial" w:cs="Arial"/>
+          <w:color w:val="1A1A1A"/>
+          <w:sz w:val="20"/>
+          <w:szCs w:val="20"/>
+        </w:rPr>
+        <w:t>Designed and deployed a web chat feature to increase patient engagement (</w:t>
+      </w:r>
+      <w:hyperlink r:id="rId6">
+        <w:r>
+          <w:rPr>
+            <w:rStyle w:val="Hyperlink"/>
+            <w:rFonts w:eastAsia="Arial" w:cs="Arial"/>
+            <w:sz w:val="20"/>
+            <w:szCs w:val="20"/>
+          </w:rPr>
           <w:t>https://msiaustralia.org.au/</w:t>
         </w:r>
       </w:hyperlink>
@@ -1156,7 +1200,7 @@
         <w:pStyle w:val="ListParagraph"/>
         <w:numPr>
           <w:ilvl w:val="1"/>
-          <w:numId w:val="2"/>
+          <w:numId w:val="3"/>
         </w:numPr>
         <w:bidi w:val="0"/>
         <w:spacing w:before="40" w:after="40"/>
@@ -1169,7 +1213,7 @@
           <w:sz w:val="20"/>
           <w:szCs w:val="20"/>
         </w:rPr>
-        <w:t>Applied AI tooling to translate medical booklets across six languages (</w:t>
+        <w:t>Used AI to translate medical booklets across six languages to increase accessibility for English as a second language users (</w:t>
       </w:r>
       <w:r>
         <w:fldChar w:fldCharType="begin"/>
@@ -1178,7 +1222,6 @@
         <w:rPr>
           <w:rStyle w:val="Hyperlink"/>
           <w:rFonts w:eastAsia="Arial" w:cs="Arial"/>
-          <w:color w:val="1A1A1A"/>
           <w:sz w:val="20"/>
           <w:szCs w:val="20"/>
         </w:rPr>
@@ -1188,7 +1231,6 @@
         <w:rPr>
           <w:rStyle w:val="Hyperlink"/>
           <w:rFonts w:eastAsia="Arial" w:cs="Arial"/>
-          <w:color w:val="1A1A1A"/>
           <w:sz w:val="20"/>
           <w:szCs w:val="20"/>
         </w:rPr>
@@ -1198,7 +1240,6 @@
         <w:rPr>
           <w:rStyle w:val="Hyperlink"/>
           <w:rFonts w:eastAsia="Arial" w:cs="Arial"/>
-          <w:color w:val="1A1A1A"/>
           <w:sz w:val="20"/>
           <w:szCs w:val="20"/>
         </w:rPr>
@@ -1208,7 +1249,6 @@
         <w:rPr>
           <w:rStyle w:val="Hyperlink"/>
           <w:rFonts w:eastAsia="Arial" w:cs="Arial"/>
-          <w:color w:val="1A1A1A"/>
           <w:sz w:val="20"/>
           <w:szCs w:val="20"/>
         </w:rPr>
@@ -1229,7 +1269,7 @@
         <w:pStyle w:val="ListParagraph"/>
         <w:numPr>
           <w:ilvl w:val="1"/>
-          <w:numId w:val="2"/>
+          <w:numId w:val="3"/>
         </w:numPr>
         <w:bidi w:val="0"/>
         <w:spacing w:before="40" w:after="40"/>
@@ -1242,7 +1282,7 @@
           <w:sz w:val="20"/>
           <w:szCs w:val="20"/>
         </w:rPr>
-        <w:t>Designed and built an interactive contraceptive education module using CSS-only 3D techniques (</w:t>
+        <w:t>Designed and built an interactive contraceptive education module using CSS-only 3D techniques to increase user engagement (</w:t>
       </w:r>
       <w:r>
         <w:fldChar w:fldCharType="begin"/>
@@ -1251,17 +1291,15 @@
         <w:rPr>
           <w:rStyle w:val="Hyperlink"/>
           <w:rFonts w:eastAsia="Arial" w:cs="Arial"/>
-          <w:color w:val="1A1A1A"/>
-          <w:sz w:val="20"/>
-          <w:szCs w:val="20"/>
-        </w:rPr>
-        <w:instrText xml:space="preserve"> HYPERLINK "https://www.msiaustralia.org.au/contraception-services" \l "contraception-interactive"</w:instrText>
-      </w:r>
-      <w:r>
-        <w:rPr>
-          <w:rStyle w:val="Hyperlink"/>
-          <w:rFonts w:eastAsia="Arial" w:cs="Arial"/>
-          <w:color w:val="1A1A1A"/>
+          <w:sz w:val="20"/>
+          <w:szCs w:val="20"/>
+        </w:rPr>
+        <w:instrText xml:space="preserve"> HYPERLINK "https://msiaustralia.org.au/translated-booklets/" \l "sedation-information"</w:instrText>
+      </w:r>
+      <w:r>
+        <w:rPr>
+          <w:rStyle w:val="Hyperlink"/>
+          <w:rFonts w:eastAsia="Arial" w:cs="Arial"/>
           <w:sz w:val="20"/>
           <w:szCs w:val="20"/>
         </w:rPr>
@@ -1271,17 +1309,15 @@
         <w:rPr>
           <w:rStyle w:val="Hyperlink"/>
           <w:rFonts w:eastAsia="Arial" w:cs="Arial"/>
-          <w:color w:val="1A1A1A"/>
-          <w:sz w:val="20"/>
-          <w:szCs w:val="20"/>
-        </w:rPr>
-        <w:t>https://www.msiaustralia.org.au/contraception-services#contraception-interactive</w:t>
-      </w:r>
-      <w:r>
-        <w:rPr>
-          <w:rStyle w:val="Hyperlink"/>
-          <w:rFonts w:eastAsia="Arial" w:cs="Arial"/>
-          <w:color w:val="1A1A1A"/>
+          <w:sz w:val="20"/>
+          <w:szCs w:val="20"/>
+        </w:rPr>
+        <w:t>https://msiaustralia.org.au/translated-booklets/#sedation-information</w:t>
+      </w:r>
+      <w:r>
+        <w:rPr>
+          <w:rStyle w:val="Hyperlink"/>
+          <w:rFonts w:eastAsia="Arial" w:cs="Arial"/>
           <w:sz w:val="20"/>
           <w:szCs w:val="20"/>
         </w:rPr>
@@ -1289,11 +1325,282 @@
       </w:r>
       <w:r>
         <w:rPr>
-          <w:rStyle w:val="Hyperlink"/>
-          <w:rFonts w:eastAsia="Arial" w:cs="Arial"/>
-          <w:color w:val="1A1A1A"/>
-          <w:sz w:val="20"/>
-          <w:szCs w:val="20"/>
+          <w:rFonts w:eastAsia="Arial" w:cs="Arial"/>
+          <w:color w:val="1A1A1A"/>
+          <w:sz w:val="20"/>
+          <w:szCs w:val="20"/>
+        </w:rPr>
+        <w:t>)</w:t>
+      </w:r>
+    </w:p>
+    <w:p>
+      <w:pPr>
+        <w:pStyle w:val="ListParagraph"/>
+        <w:numPr>
+          <w:ilvl w:val="1"/>
+          <w:numId w:val="3"/>
+        </w:numPr>
+        <w:bidi w:val="0"/>
+        <w:spacing w:before="40" w:after="40"/>
+        <w:rPr/>
+      </w:pPr>
+      <w:r>
+        <w:rPr>
+          <w:rStyle w:val="Hyperlink"/>
+          <w:rFonts w:eastAsia="Arial" w:cs="Arial"/>
+          <w:color w:val="1A1A1A"/>
+          <w:sz w:val="20"/>
+          <w:szCs w:val="20"/>
+          <w:u w:val="none"/>
+        </w:rPr>
+        <w:t>T</w:t>
+      </w:r>
+      <w:r>
+        <w:rPr>
+          <w:rStyle w:val="Hyperlink"/>
+          <w:rFonts w:eastAsia="Arial" w:cs="Arial"/>
+          <w:color w:val="1A1A1A"/>
+          <w:sz w:val="20"/>
+          <w:szCs w:val="20"/>
+          <w:u w:val="none"/>
+        </w:rPr>
+        <w:t>r</w:t>
+      </w:r>
+      <w:r>
+        <w:rPr>
+          <w:rStyle w:val="Hyperlink"/>
+          <w:rFonts w:eastAsia="Arial" w:cs="Arial"/>
+          <w:color w:val="1A1A1A"/>
+          <w:sz w:val="20"/>
+          <w:szCs w:val="20"/>
+          <w:u w:val="none"/>
+        </w:rPr>
+        <w:t>ansformed</w:t>
+      </w:r>
+      <w:r>
+        <w:rPr>
+          <w:rStyle w:val="Hyperlink"/>
+          <w:rFonts w:eastAsia="Arial" w:cs="Arial"/>
+          <w:color w:val="1A1A1A"/>
+          <w:sz w:val="20"/>
+          <w:szCs w:val="20"/>
+          <w:u w:val="none"/>
+        </w:rPr>
+        <w:t xml:space="preserve"> long </w:t>
+      </w:r>
+      <w:r>
+        <w:rPr>
+          <w:rStyle w:val="Hyperlink"/>
+          <w:rFonts w:eastAsia="Arial" w:cs="Arial"/>
+          <w:color w:val="1A1A1A"/>
+          <w:sz w:val="20"/>
+          <w:szCs w:val="20"/>
+          <w:u w:val="none"/>
+        </w:rPr>
+        <w:t>p</w:t>
+      </w:r>
+      <w:r>
+        <w:rPr>
+          <w:rStyle w:val="Hyperlink"/>
+          <w:rFonts w:eastAsia="Arial" w:cs="Arial"/>
+          <w:color w:val="1A1A1A"/>
+          <w:sz w:val="20"/>
+          <w:szCs w:val="20"/>
+          <w:u w:val="none"/>
+        </w:rPr>
+        <w:t>a</w:t>
+      </w:r>
+      <w:r>
+        <w:rPr>
+          <w:rStyle w:val="Hyperlink"/>
+          <w:rFonts w:eastAsia="Arial" w:cs="Arial"/>
+          <w:color w:val="1A1A1A"/>
+          <w:sz w:val="20"/>
+          <w:szCs w:val="20"/>
+          <w:u w:val="none"/>
+        </w:rPr>
+        <w:t xml:space="preserve">ge </w:t>
+      </w:r>
+      <w:r>
+        <w:rPr>
+          <w:rStyle w:val="Hyperlink"/>
+          <w:rFonts w:eastAsia="Arial" w:cs="Arial"/>
+          <w:color w:val="1A1A1A"/>
+          <w:sz w:val="20"/>
+          <w:szCs w:val="20"/>
+          <w:u w:val="none"/>
+        </w:rPr>
+        <w:t>content into a Quick Guide and buil</w:t>
+      </w:r>
+      <w:r>
+        <w:rPr>
+          <w:rStyle w:val="Hyperlink"/>
+          <w:rFonts w:eastAsia="Arial" w:cs="Arial"/>
+          <w:color w:val="1A1A1A"/>
+          <w:sz w:val="20"/>
+          <w:szCs w:val="20"/>
+          <w:u w:val="none"/>
+        </w:rPr>
+        <w:t>t</w:t>
+      </w:r>
+      <w:r>
+        <w:rPr>
+          <w:rStyle w:val="Hyperlink"/>
+          <w:rFonts w:eastAsia="Arial" w:cs="Arial"/>
+          <w:color w:val="1A1A1A"/>
+          <w:sz w:val="20"/>
+          <w:szCs w:val="20"/>
+          <w:u w:val="none"/>
+        </w:rPr>
+        <w:t xml:space="preserve"> a</w:t>
+      </w:r>
+      <w:r>
+        <w:rPr>
+          <w:rStyle w:val="Hyperlink"/>
+          <w:rFonts w:eastAsia="Arial" w:cs="Arial"/>
+          <w:color w:val="1A1A1A"/>
+          <w:sz w:val="20"/>
+          <w:szCs w:val="20"/>
+          <w:u w:val="none"/>
+        </w:rPr>
+        <w:t xml:space="preserve"> </w:t>
+      </w:r>
+      <w:r>
+        <w:rPr>
+          <w:rStyle w:val="Hyperlink"/>
+          <w:rFonts w:eastAsia="Arial" w:cs="Arial"/>
+          <w:color w:val="1A1A1A"/>
+          <w:sz w:val="20"/>
+          <w:szCs w:val="20"/>
+          <w:u w:val="none"/>
+        </w:rPr>
+        <w:t>n</w:t>
+      </w:r>
+      <w:r>
+        <w:rPr>
+          <w:rStyle w:val="Hyperlink"/>
+          <w:rFonts w:eastAsia="Arial" w:cs="Arial"/>
+          <w:color w:val="1A1A1A"/>
+          <w:sz w:val="20"/>
+          <w:szCs w:val="20"/>
+          <w:u w:val="none"/>
+        </w:rPr>
+        <w:t>ice</w:t>
+      </w:r>
+      <w:r>
+        <w:rPr>
+          <w:rStyle w:val="Hyperlink"/>
+          <w:rFonts w:eastAsia="Arial" w:cs="Arial"/>
+          <w:color w:val="1A1A1A"/>
+          <w:sz w:val="20"/>
+          <w:szCs w:val="20"/>
+          <w:u w:val="none"/>
+        </w:rPr>
+        <w:t xml:space="preserve"> flowing animated interface to improve user engagement </w:t>
+      </w:r>
+      <w:r>
+        <w:rPr>
+          <w:rStyle w:val="Hyperlink"/>
+          <w:rFonts w:eastAsia="Arial" w:cs="Arial"/>
+          <w:color w:val="1A1A1A"/>
+          <w:sz w:val="20"/>
+          <w:szCs w:val="20"/>
+          <w:u w:val="none"/>
+        </w:rPr>
+        <w:t>(</w:t>
+      </w:r>
+      <w:r>
+        <w:fldChar w:fldCharType="begin"/>
+      </w:r>
+      <w:r>
+        <w:rPr>
+          <w:rStyle w:val="Hyperlink"/>
+          <w:rFonts w:eastAsia="Arial" w:cs="Arial"/>
+          <w:sz w:val="20"/>
+          <w:szCs w:val="20"/>
+        </w:rPr>
+        <w:instrText xml:space="preserve"> HYPERLINK "https://www.vasectomy.org.au/faqs/vasectomy-your-comprehensive-guide/" \l "quickguide"</w:instrText>
+      </w:r>
+      <w:r>
+        <w:rPr>
+          <w:rStyle w:val="Hyperlink"/>
+          <w:rFonts w:eastAsia="Arial" w:cs="Arial"/>
+          <w:sz w:val="20"/>
+          <w:szCs w:val="20"/>
+        </w:rPr>
+        <w:fldChar w:fldCharType="separate"/>
+      </w:r>
+      <w:r>
+        <w:rPr>
+          <w:rStyle w:val="Hyperlink"/>
+          <w:rFonts w:eastAsia="Arial" w:cs="Arial"/>
+          <w:sz w:val="20"/>
+          <w:szCs w:val="20"/>
+        </w:rPr>
+        <w:t>https://www.vasectomy.org.au/faqs/vasectomy-your-comprehensive-guide/#quickguide</w:t>
+      </w:r>
+      <w:r>
+        <w:rPr>
+          <w:rStyle w:val="Hyperlink"/>
+          <w:rFonts w:eastAsia="Arial" w:cs="Arial"/>
+          <w:sz w:val="20"/>
+          <w:szCs w:val="20"/>
+        </w:rPr>
+        <w:fldChar w:fldCharType="end"/>
+      </w:r>
+      <w:r>
+        <w:rPr>
+          <w:rStyle w:val="Hyperlink"/>
+          <w:rFonts w:eastAsia="Arial" w:cs="Arial"/>
+          <w:color w:val="1A1A1A"/>
+          <w:sz w:val="20"/>
+          <w:szCs w:val="20"/>
+          <w:u w:val="none"/>
+        </w:rPr>
+        <w:t>)</w:t>
+      </w:r>
+    </w:p>
+    <w:p>
+      <w:pPr>
+        <w:pStyle w:val="ListParagraph"/>
+        <w:numPr>
+          <w:ilvl w:val="1"/>
+          <w:numId w:val="3"/>
+        </w:numPr>
+        <w:bidi w:val="0"/>
+        <w:spacing w:before="40" w:after="40"/>
+        <w:rPr/>
+      </w:pPr>
+      <w:r>
+        <w:rPr>
+          <w:rStyle w:val="Hyperlink"/>
+          <w:rFonts w:eastAsia="Arial" w:cs="Arial"/>
+          <w:color w:val="1A1A1A"/>
+          <w:sz w:val="20"/>
+          <w:szCs w:val="20"/>
+          <w:u w:val="none"/>
+        </w:rPr>
+        <w:t>Applied a modern UI to all forms to make them less clunky and more enticing to fill out which helps to increase ROI (</w:t>
+      </w:r>
+      <w:hyperlink r:id="rId7">
+        <w:r>
+          <w:rPr>
+            <w:rStyle w:val="Hyperlink"/>
+            <w:rFonts w:eastAsia="Arial" w:cs="Arial"/>
+            <w:sz w:val="20"/>
+            <w:szCs w:val="20"/>
+          </w:rPr>
+          <w:t>https://www.msiaustralia.org.au/call-back-register-form/</w:t>
+        </w:r>
+      </w:hyperlink>
+      <w:r>
+        <w:rPr>
+          <w:rStyle w:val="Hyperlink"/>
+          <w:rFonts w:eastAsia="Arial" w:cs="Arial"/>
+          <w:color w:val="1A1A1A"/>
+          <w:sz w:val="20"/>
+          <w:szCs w:val="20"/>
+          <w:u w:val="none"/>
         </w:rPr>
         <w:t>).</w:t>
       </w:r>
@@ -1302,14 +1609,103 @@
       <w:pPr>
         <w:pStyle w:val="ListParagraph"/>
         <w:numPr>
-          <w:ilvl w:val="0"/>
-          <w:numId w:val="1"/>
-        </w:numPr>
+          <w:ilvl w:val="1"/>
+          <w:numId w:val="3"/>
+        </w:numPr>
+        <w:bidi w:val="0"/>
         <w:spacing w:before="40" w:after="40"/>
         <w:rPr/>
       </w:pPr>
       <w:r>
         <w:rPr>
+          <w:rStyle w:val="Hyperlink"/>
+          <w:rFonts w:eastAsia="Arial" w:cs="Arial"/>
+          <w:color w:val="1A1A1A"/>
+          <w:sz w:val="20"/>
+          <w:szCs w:val="20"/>
+          <w:u w:val="none"/>
+        </w:rPr>
+        <w:t>Redesigned and built a Find a clinic page to increase bookings. The original is here (</w:t>
+      </w:r>
+      <w:hyperlink r:id="rId8">
+        <w:r>
+          <w:rPr>
+            <w:rStyle w:val="Hyperlink"/>
+            <w:rFonts w:eastAsia="Arial" w:cs="Arial"/>
+            <w:sz w:val="20"/>
+            <w:szCs w:val="20"/>
+          </w:rPr>
+          <w:t>https://web.archive.org/web/20240405003050/https://www.msiaustralia.org.au/find-a-clinic/</w:t>
+        </w:r>
+      </w:hyperlink>
+      <w:r>
+        <w:rPr>
+          <w:rStyle w:val="Hyperlink"/>
+          <w:rFonts w:eastAsia="Arial" w:cs="Arial"/>
+          <w:color w:val="1A1A1A"/>
+          <w:sz w:val="20"/>
+          <w:szCs w:val="20"/>
+          <w:u w:val="none"/>
+        </w:rPr>
+        <w:t xml:space="preserve">) and the updated </w:t>
+      </w:r>
+      <w:r>
+        <w:rPr>
+          <w:rStyle w:val="Hyperlink"/>
+          <w:rFonts w:eastAsia="Arial" w:cs="Arial"/>
+          <w:color w:val="1A1A1A"/>
+          <w:sz w:val="20"/>
+          <w:szCs w:val="20"/>
+          <w:u w:val="none"/>
+        </w:rPr>
+        <w:t xml:space="preserve">current live </w:t>
+      </w:r>
+      <w:r>
+        <w:rPr>
+          <w:rStyle w:val="Hyperlink"/>
+          <w:rFonts w:eastAsia="Arial" w:cs="Arial"/>
+          <w:color w:val="1A1A1A"/>
+          <w:sz w:val="20"/>
+          <w:szCs w:val="20"/>
+          <w:u w:val="none"/>
+        </w:rPr>
+        <w:t>version is here (</w:t>
+      </w:r>
+      <w:hyperlink r:id="rId9">
+        <w:r>
+          <w:rPr>
+            <w:rStyle w:val="Hyperlink"/>
+            <w:rFonts w:eastAsia="Arial" w:cs="Arial"/>
+            <w:sz w:val="20"/>
+            <w:szCs w:val="20"/>
+          </w:rPr>
+          <w:t>https://www.msiaustralia.org.au/find-a-clinic/</w:t>
+        </w:r>
+      </w:hyperlink>
+      <w:r>
+        <w:rPr>
+          <w:rStyle w:val="Hyperlink"/>
+          <w:rFonts w:eastAsia="Arial" w:cs="Arial"/>
+          <w:color w:val="1A1A1A"/>
+          <w:sz w:val="20"/>
+          <w:szCs w:val="20"/>
+          <w:u w:val="none"/>
+        </w:rPr>
+        <w:t xml:space="preserve">) </w:t>
+      </w:r>
+    </w:p>
+    <w:p>
+      <w:pPr>
+        <w:pStyle w:val="ListParagraph"/>
+        <w:numPr>
+          <w:ilvl w:val="0"/>
+          <w:numId w:val="2"/>
+        </w:numPr>
+        <w:spacing w:before="40" w:after="40"/>
+        <w:rPr/>
+      </w:pPr>
+      <w:r>
+        <w:rPr>
           <w:rFonts w:eastAsia="Arial" w:cs="Arial"/>
           <w:color w:val="1A1A1A"/>
           <w:sz w:val="20"/>
@@ -1323,7 +1719,7 @@
         <w:pStyle w:val="ListParagraph"/>
         <w:numPr>
           <w:ilvl w:val="0"/>
-          <w:numId w:val="1"/>
+          <w:numId w:val="2"/>
         </w:numPr>
         <w:spacing w:before="40" w:after="40"/>
         <w:rPr/>
@@ -1335,150 +1731,15 @@
           <w:sz w:val="20"/>
           <w:szCs w:val="20"/>
         </w:rPr>
-        <w:t xml:space="preserve">Built and deployed a </w:t>
-      </w:r>
-      <w:r>
-        <w:rPr>
-          <w:rFonts w:eastAsia="Arial" w:cs="Arial"/>
-          <w:color w:val="1A1A1A"/>
-          <w:sz w:val="20"/>
-          <w:szCs w:val="20"/>
-        </w:rPr>
-        <w:t>M</w:t>
-      </w:r>
-      <w:r>
-        <w:rPr>
-          <w:rFonts w:eastAsia="Arial" w:cs="Arial"/>
-          <w:color w:val="1A1A1A"/>
-          <w:sz w:val="20"/>
-          <w:szCs w:val="20"/>
-        </w:rPr>
-        <w:t>icrosoft</w:t>
-      </w:r>
-      <w:r>
-        <w:rPr>
-          <w:rFonts w:eastAsia="Arial" w:cs="Arial"/>
-          <w:color w:val="1A1A1A"/>
-          <w:sz w:val="20"/>
-          <w:szCs w:val="20"/>
-        </w:rPr>
-        <w:t xml:space="preserve"> </w:t>
-      </w:r>
-      <w:r>
-        <w:rPr>
-          <w:rFonts w:eastAsia="Arial" w:cs="Arial"/>
-          <w:color w:val="1A1A1A"/>
-          <w:sz w:val="20"/>
-          <w:szCs w:val="20"/>
-        </w:rPr>
-        <w:t>Outlook signature template</w:t>
-      </w:r>
-      <w:r>
-        <w:rPr>
-          <w:rFonts w:eastAsia="Arial" w:cs="Arial"/>
-          <w:color w:val="1A1A1A"/>
-          <w:sz w:val="20"/>
-          <w:szCs w:val="20"/>
-        </w:rPr>
-        <w:t xml:space="preserve"> </w:t>
-      </w:r>
-      <w:r>
-        <w:rPr>
-          <w:rFonts w:eastAsia="Arial" w:cs="Arial"/>
-          <w:color w:val="1A1A1A"/>
-          <w:sz w:val="20"/>
-          <w:szCs w:val="20"/>
-        </w:rPr>
-        <w:t>t</w:t>
-      </w:r>
-      <w:r>
-        <w:rPr>
-          <w:rFonts w:eastAsia="Arial" w:cs="Arial"/>
-          <w:color w:val="1A1A1A"/>
-          <w:sz w:val="20"/>
-          <w:szCs w:val="20"/>
-        </w:rPr>
-        <w:t xml:space="preserve">hat </w:t>
-      </w:r>
-      <w:r>
-        <w:rPr>
-          <w:rFonts w:eastAsia="Arial" w:cs="Arial"/>
-          <w:color w:val="1A1A1A"/>
-          <w:sz w:val="20"/>
-          <w:szCs w:val="20"/>
-        </w:rPr>
-        <w:t>h</w:t>
-      </w:r>
-      <w:r>
-        <w:rPr>
-          <w:rFonts w:eastAsia="Arial" w:cs="Arial"/>
-          <w:color w:val="1A1A1A"/>
-          <w:sz w:val="20"/>
-          <w:szCs w:val="20"/>
-        </w:rPr>
-        <w:t>andles</w:t>
-      </w:r>
-      <w:r>
-        <w:rPr>
-          <w:rFonts w:eastAsia="Arial" w:cs="Arial"/>
-          <w:color w:val="1A1A1A"/>
-          <w:sz w:val="20"/>
-          <w:szCs w:val="20"/>
-        </w:rPr>
-        <w:t xml:space="preserve"> 1</w:t>
-      </w:r>
-      <w:r>
-        <w:rPr>
-          <w:rFonts w:eastAsia="Arial" w:cs="Arial"/>
-          <w:color w:val="1A1A1A"/>
-          <w:sz w:val="20"/>
-          <w:szCs w:val="20"/>
-        </w:rPr>
-        <w:t>1</w:t>
-      </w:r>
-      <w:r>
-        <w:rPr>
-          <w:rFonts w:eastAsia="Arial" w:cs="Arial"/>
-          <w:color w:val="1A1A1A"/>
-          <w:sz w:val="20"/>
-          <w:szCs w:val="20"/>
-        </w:rPr>
-        <w:t xml:space="preserve"> role types </w:t>
-      </w:r>
-      <w:r>
-        <w:rPr>
-          <w:rFonts w:eastAsia="Arial" w:cs="Arial"/>
-          <w:color w:val="1A1A1A"/>
-          <w:sz w:val="20"/>
-          <w:szCs w:val="20"/>
-        </w:rPr>
-        <w:t>a</w:t>
-      </w:r>
-      <w:r>
-        <w:rPr>
-          <w:rFonts w:eastAsia="Arial" w:cs="Arial"/>
-          <w:color w:val="1A1A1A"/>
-          <w:sz w:val="20"/>
-          <w:szCs w:val="20"/>
-        </w:rPr>
-        <w:t xml:space="preserve">cross </w:t>
-      </w:r>
-      <w:r>
-        <w:rPr>
-          <w:rFonts w:eastAsia="Arial" w:cs="Arial"/>
-          <w:color w:val="1A1A1A"/>
-          <w:sz w:val="20"/>
-          <w:szCs w:val="20"/>
-        </w:rPr>
-        <w:t>all Australian staff, requiring precise front-end logic, cross-device QA, and accessibility compliance throughout.</w:t>
-      </w:r>
-    </w:p>
-    <w:p>
-      <w:pPr>
-        <w:pStyle w:val="ListParagraph"/>
-        <w:numPr>
-          <w:ilvl w:val="0"/>
-          <w:numId w:val="1"/>
+        <w:t>Built and deployed a Microsoft Outlook signature template that handles 11 role types across all Australian staff, requiring precise front-end logic, cross-device QA, and accessibility compliance throughout.</w:t>
+      </w:r>
+    </w:p>
+    <w:p>
+      <w:pPr>
+        <w:pStyle w:val="ListParagraph"/>
+        <w:numPr>
+          <w:ilvl w:val="0"/>
+          <w:numId w:val="2"/>
         </w:numPr>
         <w:spacing w:before="40" w:after="40"/>
         <w:rPr/>
@@ -1490,15 +1751,15 @@
           <w:sz w:val="20"/>
           <w:szCs w:val="20"/>
         </w:rPr>
-        <w:t>Led a full CMS platform migration across three live sites in Dec 2025, managing scope, risk, and stakeholder coordination, delivered with zero downtime over a 2.5-week window.</w:t>
-      </w:r>
-    </w:p>
-    <w:p>
-      <w:pPr>
-        <w:pStyle w:val="ListParagraph"/>
-        <w:numPr>
-          <w:ilvl w:val="0"/>
-          <w:numId w:val="1"/>
+        <w:t>Led a full platform migration involving php, Wordpress and associated plugins across three live sites in Dec 2025, managing scope, risk, and stakeholder coordination, delivered with zero downtime over a 2.5-week window. This saved the organisation around $5000 which is roughly what it would’ve cost if this task was outsourced.</w:t>
+      </w:r>
+    </w:p>
+    <w:p>
+      <w:pPr>
+        <w:pStyle w:val="ListParagraph"/>
+        <w:numPr>
+          <w:ilvl w:val="0"/>
+          <w:numId w:val="2"/>
         </w:numPr>
         <w:spacing w:before="40" w:after="40"/>
         <w:rPr/>
@@ -1511,16 +1772,6 @@
           <w:szCs w:val="20"/>
         </w:rPr>
         <w:t>Coached and guided staff on CMS publishing standards, digital governance, and best practice, uplifting digital capability across the organisation.</w:t>
-      </w:r>
-    </w:p>
-    <w:p>
-      <w:pPr>
-        <w:pStyle w:val="Normal"/>
-        <w:spacing w:before="80" w:after="0"/>
-        <w:rPr/>
-      </w:pPr>
-      <w:r>
-        <w:rPr/>
       </w:r>
     </w:p>
     <w:p>
@@ -1582,7 +1833,7 @@
         <w:pStyle w:val="ListParagraph"/>
         <w:numPr>
           <w:ilvl w:val="0"/>
-          <w:numId w:val="1"/>
+          <w:numId w:val="2"/>
         </w:numPr>
         <w:spacing w:before="40" w:after="40"/>
         <w:rPr/>
@@ -1602,7 +1853,7 @@
         <w:pStyle w:val="ListParagraph"/>
         <w:numPr>
           <w:ilvl w:val="0"/>
-          <w:numId w:val="1"/>
+          <w:numId w:val="2"/>
         </w:numPr>
         <w:spacing w:before="40" w:after="40"/>
         <w:rPr/>
@@ -1622,7 +1873,7 @@
         <w:pStyle w:val="ListParagraph"/>
         <w:numPr>
           <w:ilvl w:val="0"/>
-          <w:numId w:val="1"/>
+          <w:numId w:val="2"/>
         </w:numPr>
         <w:spacing w:before="40" w:after="40"/>
         <w:rPr/>
@@ -1650,7 +1901,6 @@
           <w:sz w:val="22"/>
           <w:szCs w:val="22"/>
         </w:rPr>
-        <w:br/>
         <w:t>UI/UX Designer &amp; Developer</w:t>
       </w:r>
       <w:r>
@@ -1695,27 +1945,32 @@
         <w:pStyle w:val="ListParagraph"/>
         <w:numPr>
           <w:ilvl w:val="0"/>
-          <w:numId w:val="1"/>
+          <w:numId w:val="2"/>
         </w:numPr>
         <w:spacing w:before="40" w:after="40"/>
-        <w:rPr/>
-      </w:pPr>
-      <w:r>
-        <w:rPr>
-          <w:rFonts w:eastAsia="Arial" w:cs="Arial"/>
-          <w:color w:val="1A1A1A"/>
-          <w:sz w:val="20"/>
-          <w:szCs w:val="20"/>
-        </w:rPr>
-        <w:t>Designed high-fidelity member portal interfaces in Figma from brand style guides, acting as in-house UX and accessibility advisor to cross-functional teams and applying WCAG standards across all digital outputs.</w:t>
-      </w:r>
-    </w:p>
-    <w:p>
-      <w:pPr>
-        <w:pStyle w:val="ListParagraph"/>
-        <w:numPr>
-          <w:ilvl w:val="0"/>
-          <w:numId w:val="1"/>
+        <w:rPr>
+          <w:rFonts w:eastAsia="Arial" w:cs="Arial"/>
+          <w:color w:val="1A1A1A"/>
+          <w:sz w:val="20"/>
+          <w:szCs w:val="20"/>
+        </w:rPr>
+      </w:pPr>
+      <w:r>
+        <w:rPr>
+          <w:rFonts w:eastAsia="Arial" w:cs="Arial"/>
+          <w:color w:val="1A1A1A"/>
+          <w:sz w:val="20"/>
+          <w:szCs w:val="20"/>
+        </w:rPr>
+        <w:t>Designed high-fidelity member portal interfaces in Figma from brand style guides, acting as in-house UX and accessibility advisor to cross-functional teams and applying WCAG standards across all digital outputs,</w:t>
+      </w:r>
+    </w:p>
+    <w:p>
+      <w:pPr>
+        <w:pStyle w:val="ListParagraph"/>
+        <w:numPr>
+          <w:ilvl w:val="0"/>
+          <w:numId w:val="2"/>
         </w:numPr>
         <w:spacing w:before="40" w:after="40"/>
         <w:rPr/>
@@ -1727,6 +1982,44 @@
           <w:sz w:val="20"/>
           <w:szCs w:val="20"/>
         </w:rPr>
+        <w:t xml:space="preserve">Designing and contributing to building org wide intranet in </w:t>
+      </w:r>
+      <w:r>
+        <w:rPr>
+          <w:rFonts w:eastAsia="Arial" w:cs="Arial"/>
+          <w:color w:val="000000"/>
+          <w:sz w:val="20"/>
+          <w:szCs w:val="20"/>
+        </w:rPr>
+        <w:t>SharePoint</w:t>
+      </w:r>
+      <w:r>
+        <w:rPr>
+          <w:rFonts w:eastAsia="Arial" w:cs="Arial"/>
+          <w:color w:val="1A1A1A"/>
+          <w:sz w:val="20"/>
+          <w:szCs w:val="20"/>
+        </w:rPr>
+        <w:t>.</w:t>
+      </w:r>
+    </w:p>
+    <w:p>
+      <w:pPr>
+        <w:pStyle w:val="ListParagraph"/>
+        <w:numPr>
+          <w:ilvl w:val="0"/>
+          <w:numId w:val="2"/>
+        </w:numPr>
+        <w:spacing w:before="40" w:after="40"/>
+        <w:rPr/>
+      </w:pPr>
+      <w:r>
+        <w:rPr>
+          <w:rFonts w:eastAsia="Arial" w:cs="Arial"/>
+          <w:color w:val="1A1A1A"/>
+          <w:sz w:val="20"/>
+          <w:szCs w:val="20"/>
+        </w:rPr>
         <w:t>Demonstrated problem-solving by diagnosing and resolving a critical platform bug (escalated to Microsoft) via a targeted jQuery fix, restoring service for 7,000+ users without a full development sprint.</w:t>
       </w:r>
     </w:p>
@@ -1735,7 +2028,7 @@
         <w:pStyle w:val="ListParagraph"/>
         <w:numPr>
           <w:ilvl w:val="0"/>
-          <w:numId w:val="1"/>
+          <w:numId w:val="2"/>
         </w:numPr>
         <w:spacing w:before="40" w:after="40"/>
         <w:rPr/>
@@ -1748,16 +2041,6 @@
           <w:szCs w:val="20"/>
         </w:rPr>
         <w:t>Implemented fluid responsive CSS layouts using calc() to deliver consistent, accessible digital experiences across all device widths.</w:t>
-      </w:r>
-    </w:p>
-    <w:p>
-      <w:pPr>
-        <w:pStyle w:val="Normal"/>
-        <w:spacing w:before="80" w:after="0"/>
-        <w:rPr/>
-      </w:pPr>
-      <w:r>
-        <w:rPr/>
       </w:r>
     </w:p>
     <w:p>
@@ -1819,7 +2102,7 @@
         <w:pStyle w:val="ListParagraph"/>
         <w:numPr>
           <w:ilvl w:val="0"/>
-          <w:numId w:val="1"/>
+          <w:numId w:val="2"/>
         </w:numPr>
         <w:spacing w:before="40" w:after="40"/>
         <w:rPr/>
@@ -1831,15 +2114,63 @@
           <w:sz w:val="20"/>
           <w:szCs w:val="20"/>
         </w:rPr>
-        <w:t>Delivered UX improvements across multiple product portals, improving the digital experience for parents, educators, and clinical users.</w:t>
-      </w:r>
-    </w:p>
-    <w:p>
-      <w:pPr>
-        <w:pStyle w:val="ListParagraph"/>
-        <w:numPr>
-          <w:ilvl w:val="0"/>
-          <w:numId w:val="1"/>
+        <w:t>Solved a technical rendering problem in web-delivered PDF reports by diagnosing how web fonts and server-delivered assets were being processed and implementing a targeted fix (</w:t>
+      </w:r>
+      <w:r>
+        <w:fldChar w:fldCharType="begin"/>
+      </w:r>
+      <w:r>
+        <w:rPr>
+          <w:rStyle w:val="Hyperlink"/>
+          <w:rFonts w:eastAsia="Arial" w:cs="Arial"/>
+          <w:sz w:val="20"/>
+          <w:szCs w:val="20"/>
+        </w:rPr>
+        <w:instrText xml:space="preserve"> HYPERLINK "https://richardjclough.github.io/folio/" \l "font-rendering"</w:instrText>
+      </w:r>
+      <w:r>
+        <w:rPr>
+          <w:rStyle w:val="Hyperlink"/>
+          <w:rFonts w:eastAsia="Arial" w:cs="Arial"/>
+          <w:sz w:val="20"/>
+          <w:szCs w:val="20"/>
+        </w:rPr>
+        <w:fldChar w:fldCharType="separate"/>
+      </w:r>
+      <w:r>
+        <w:rPr>
+          <w:rStyle w:val="Hyperlink"/>
+          <w:rFonts w:eastAsia="Arial" w:cs="Arial"/>
+          <w:sz w:val="20"/>
+          <w:szCs w:val="20"/>
+        </w:rPr>
+        <w:t>https://richardjclough.github.io/folio/#font-rendering</w:t>
+      </w:r>
+      <w:r>
+        <w:rPr>
+          <w:rStyle w:val="Hyperlink"/>
+          <w:rFonts w:eastAsia="Arial" w:cs="Arial"/>
+          <w:sz w:val="20"/>
+          <w:szCs w:val="20"/>
+        </w:rPr>
+        <w:fldChar w:fldCharType="end"/>
+      </w:r>
+      <w:r>
+        <w:rPr>
+          <w:rFonts w:eastAsia="Arial" w:cs="Arial"/>
+          <w:color w:val="1A1A1A"/>
+          <w:sz w:val="20"/>
+          <w:szCs w:val="20"/>
+        </w:rPr>
+        <w:t>).</w:t>
+      </w:r>
+    </w:p>
+    <w:p>
+      <w:pPr>
+        <w:pStyle w:val="ListParagraph"/>
+        <w:numPr>
+          <w:ilvl w:val="0"/>
+          <w:numId w:val="2"/>
         </w:numPr>
         <w:spacing w:before="40" w:after="40"/>
         <w:rPr/>
@@ -1851,89 +2182,7 @@
           <w:sz w:val="20"/>
           <w:szCs w:val="20"/>
         </w:rPr>
-        <w:t>Solved a technical rendering problem in web-delivered PDF reports by diagnosing how web fonts and server-delivered assets were being processed and implementing a targeted fix (</w:t>
-      </w:r>
-      <w:r>
-        <w:fldChar w:fldCharType="begin"/>
-      </w:r>
-      <w:r>
-        <w:rPr>
-          <w:rStyle w:val="Hyperlink"/>
-          <w:rFonts w:eastAsia="Arial" w:cs="Arial"/>
-          <w:color w:val="1A1A1A"/>
-          <w:sz w:val="20"/>
-          <w:szCs w:val="20"/>
-        </w:rPr>
-        <w:instrText xml:space="preserve"> HYPERLINK "https://richardjclough.github.io/folio/" \l "font-rendering"</w:instrText>
-      </w:r>
-      <w:r>
-        <w:rPr>
-          <w:rStyle w:val="Hyperlink"/>
-          <w:rFonts w:eastAsia="Arial" w:cs="Arial"/>
-          <w:color w:val="1A1A1A"/>
-          <w:sz w:val="20"/>
-          <w:szCs w:val="20"/>
-        </w:rPr>
-        <w:fldChar w:fldCharType="separate"/>
-      </w:r>
-      <w:r>
-        <w:rPr>
-          <w:rStyle w:val="Hyperlink"/>
-          <w:rFonts w:eastAsia="Arial" w:cs="Arial"/>
-          <w:color w:val="1A1A1A"/>
-          <w:sz w:val="20"/>
-          <w:szCs w:val="20"/>
-        </w:rPr>
-        <w:t>https://richardjclough.github.io/folio/#font-rendering</w:t>
-      </w:r>
-      <w:r>
-        <w:rPr>
-          <w:rStyle w:val="Hyperlink"/>
-          <w:rFonts w:eastAsia="Arial" w:cs="Arial"/>
-          <w:color w:val="1A1A1A"/>
-          <w:sz w:val="20"/>
-          <w:szCs w:val="20"/>
-        </w:rPr>
-        <w:fldChar w:fldCharType="end"/>
-      </w:r>
-      <w:r>
-        <w:rPr>
-          <w:rFonts w:eastAsia="Arial" w:cs="Arial"/>
-          <w:color w:val="1A1A1A"/>
-          <w:sz w:val="20"/>
-          <w:szCs w:val="20"/>
-        </w:rPr>
-        <w:t>).</w:t>
-      </w:r>
-    </w:p>
-    <w:p>
-      <w:pPr>
-        <w:pStyle w:val="ListParagraph"/>
-        <w:numPr>
-          <w:ilvl w:val="0"/>
-          <w:numId w:val="1"/>
-        </w:numPr>
-        <w:spacing w:before="40" w:after="40"/>
-        <w:rPr/>
-      </w:pPr>
-      <w:r>
-        <w:rPr>
-          <w:rFonts w:eastAsia="Arial" w:cs="Arial"/>
-          <w:color w:val="1A1A1A"/>
-          <w:sz w:val="20"/>
-          <w:szCs w:val="20"/>
-        </w:rPr>
         <w:t>Built and managed eDM campaigns via HubSpot for the international product launch across multiple markets.</w:t>
-      </w:r>
-    </w:p>
-    <w:p>
-      <w:pPr>
-        <w:pStyle w:val="Normal"/>
-        <w:spacing w:before="80" w:after="0"/>
-        <w:rPr/>
-      </w:pPr>
-      <w:r>
-        <w:rPr/>
       </w:r>
     </w:p>
     <w:p>
@@ -1979,7 +2228,7 @@
         <w:pStyle w:val="ListParagraph"/>
         <w:numPr>
           <w:ilvl w:val="0"/>
-          <w:numId w:val="1"/>
+          <w:numId w:val="2"/>
         </w:numPr>
         <w:spacing w:before="40" w:after="40"/>
         <w:rPr/>
@@ -1999,7 +2248,7 @@
         <w:pStyle w:val="ListParagraph"/>
         <w:numPr>
           <w:ilvl w:val="0"/>
-          <w:numId w:val="1"/>
+          <w:numId w:val="2"/>
         </w:numPr>
         <w:spacing w:before="40" w:after="40"/>
         <w:rPr/>
@@ -2012,16 +2261,6 @@
           <w:szCs w:val="20"/>
         </w:rPr>
         <w:t>Managed multiple concurrent projects in an agile team environment, balancing stakeholder priorities and iterative delivery.</w:t>
-      </w:r>
-    </w:p>
-    <w:p>
-      <w:pPr>
-        <w:pStyle w:val="Normal"/>
-        <w:spacing w:before="80" w:after="0"/>
-        <w:rPr/>
-      </w:pPr>
-      <w:r>
-        <w:rPr/>
       </w:r>
     </w:p>
     <w:p>
@@ -2067,7 +2306,7 @@
         <w:pStyle w:val="ListParagraph"/>
         <w:numPr>
           <w:ilvl w:val="0"/>
-          <w:numId w:val="1"/>
+          <w:numId w:val="2"/>
         </w:numPr>
         <w:spacing w:before="40" w:after="40"/>
         <w:rPr/>
@@ -2087,7 +2326,7 @@
         <w:pStyle w:val="ListParagraph"/>
         <w:numPr>
           <w:ilvl w:val="0"/>
-          <w:numId w:val="1"/>
+          <w:numId w:val="2"/>
         </w:numPr>
         <w:spacing w:before="40" w:after="40"/>
         <w:rPr/>
@@ -2107,7 +2346,7 @@
         <w:pStyle w:val="ListParagraph"/>
         <w:numPr>
           <w:ilvl w:val="0"/>
-          <w:numId w:val="1"/>
+          <w:numId w:val="2"/>
         </w:numPr>
         <w:spacing w:before="40" w:after="40"/>
         <w:rPr/>
@@ -2127,7 +2366,7 @@
         <w:pStyle w:val="ListParagraph"/>
         <w:numPr>
           <w:ilvl w:val="0"/>
-          <w:numId w:val="1"/>
+          <w:numId w:val="2"/>
         </w:numPr>
         <w:spacing w:before="40" w:after="40"/>
         <w:rPr/>
@@ -2191,9 +2430,6 @@
       <w:pPr>
         <w:pStyle w:val="Normal"/>
         <w:spacing w:before="60" w:after="40"/>
-        <w:rPr/>
-      </w:pPr>
-      <w:r>
         <w:rPr>
           <w:rFonts w:eastAsia="Arial" w:cs="Arial"/>
           <w:b/>
@@ -2201,14 +2437,28 @@
           <w:sz w:val="20"/>
           <w:szCs w:val="20"/>
         </w:rPr>
+      </w:pPr>
+      <w:r>
+        <w:rPr>
+          <w:rFonts w:eastAsia="Arial" w:cs="Arial"/>
+          <w:b/>
+          <w:bCs/>
+          <w:sz w:val="20"/>
+          <w:szCs w:val="20"/>
+        </w:rPr>
         <w:t>Advanced Diploma of Electronic Design</w:t>
       </w:r>
     </w:p>
     <w:p>
       <w:pPr>
         <w:pStyle w:val="Normal"/>
-        <w:spacing w:before="0" w:after="80"/>
-        <w:rPr/>
+        <w:spacing w:before="60" w:after="40"/>
+        <w:rPr>
+          <w:rFonts w:eastAsia="Arial" w:cs="Arial"/>
+          <w:color w:val="1A1A1A"/>
+          <w:sz w:val="20"/>
+          <w:szCs w:val="20"/>
+        </w:rPr>
       </w:pPr>
       <w:r>
         <w:rPr>
@@ -2461,14 +2711,133 @@
   <w:abstractNum w:abstractNumId="1">
     <w:lvl w:ilvl="0">
       <w:start w:val="1"/>
+      <w:numFmt w:val="none"/>
+      <w:suff w:val="nothing"/>
+      <w:lvlText w:val=""/>
+      <w:lvlJc w:val="left"/>
+      <w:pPr>
+        <w:tabs>
+          <w:tab w:val="num" w:pos="0"/>
+        </w:tabs>
+        <w:ind w:left="0" w:hanging="0"/>
+      </w:pPr>
+    </w:lvl>
+    <w:lvl w:ilvl="1">
+      <w:start w:val="1"/>
+      <w:numFmt w:val="none"/>
+      <w:suff w:val="nothing"/>
+      <w:lvlText w:val=""/>
+      <w:lvlJc w:val="left"/>
+      <w:pPr>
+        <w:tabs>
+          <w:tab w:val="num" w:pos="0"/>
+        </w:tabs>
+        <w:ind w:left="0" w:hanging="0"/>
+      </w:pPr>
+    </w:lvl>
+    <w:lvl w:ilvl="2">
+      <w:start w:val="1"/>
+      <w:numFmt w:val="none"/>
+      <w:suff w:val="nothing"/>
+      <w:lvlText w:val=""/>
+      <w:lvlJc w:val="left"/>
+      <w:pPr>
+        <w:tabs>
+          <w:tab w:val="num" w:pos="0"/>
+        </w:tabs>
+        <w:ind w:left="0" w:hanging="0"/>
+      </w:pPr>
+    </w:lvl>
+    <w:lvl w:ilvl="3">
+      <w:start w:val="1"/>
+      <w:numFmt w:val="none"/>
+      <w:suff w:val="nothing"/>
+      <w:lvlText w:val=""/>
+      <w:lvlJc w:val="left"/>
+      <w:pPr>
+        <w:tabs>
+          <w:tab w:val="num" w:pos="0"/>
+        </w:tabs>
+        <w:ind w:left="0" w:hanging="0"/>
+      </w:pPr>
+    </w:lvl>
+    <w:lvl w:ilvl="4">
+      <w:start w:val="1"/>
+      <w:numFmt w:val="none"/>
+      <w:suff w:val="nothing"/>
+      <w:lvlText w:val=""/>
+      <w:lvlJc w:val="left"/>
+      <w:pPr>
+        <w:tabs>
+          <w:tab w:val="num" w:pos="0"/>
+        </w:tabs>
+        <w:ind w:left="0" w:hanging="0"/>
+      </w:pPr>
+    </w:lvl>
+    <w:lvl w:ilvl="5">
+      <w:start w:val="1"/>
+      <w:numFmt w:val="none"/>
+      <w:suff w:val="nothing"/>
+      <w:lvlText w:val=""/>
+      <w:lvlJc w:val="left"/>
+      <w:pPr>
+        <w:tabs>
+          <w:tab w:val="num" w:pos="0"/>
+        </w:tabs>
+        <w:ind w:left="0" w:hanging="0"/>
+      </w:pPr>
+    </w:lvl>
+    <w:lvl w:ilvl="6">
+      <w:start w:val="1"/>
+      <w:numFmt w:val="none"/>
+      <w:suff w:val="nothing"/>
+      <w:lvlText w:val=""/>
+      <w:lvlJc w:val="left"/>
+      <w:pPr>
+        <w:tabs>
+          <w:tab w:val="num" w:pos="0"/>
+        </w:tabs>
+        <w:ind w:left="0" w:hanging="0"/>
+      </w:pPr>
+    </w:lvl>
+    <w:lvl w:ilvl="7">
+      <w:start w:val="1"/>
+      <w:numFmt w:val="none"/>
+      <w:suff w:val="nothing"/>
+      <w:lvlText w:val=""/>
+      <w:lvlJc w:val="left"/>
+      <w:pPr>
+        <w:tabs>
+          <w:tab w:val="num" w:pos="0"/>
+        </w:tabs>
+        <w:ind w:left="0" w:hanging="0"/>
+      </w:pPr>
+    </w:lvl>
+    <w:lvl w:ilvl="8">
+      <w:start w:val="1"/>
+      <w:numFmt w:val="none"/>
+      <w:suff w:val="nothing"/>
+      <w:lvlText w:val=""/>
+      <w:lvlJc w:val="left"/>
+      <w:pPr>
+        <w:tabs>
+          <w:tab w:val="num" w:pos="0"/>
+        </w:tabs>
+        <w:ind w:left="0" w:hanging="0"/>
+      </w:pPr>
+    </w:lvl>
+  </w:abstractNum>
+  <w:abstractNum w:abstractNumId="2">
+    <w:lvl w:ilvl="0">
+      <w:start w:val="1"/>
       <w:numFmt w:val="bullet"/>
       <w:lvlText w:val=""/>
-      <w:lvlJc w:val="start"/>
+      <w:lvlJc w:val="left"/>
       <w:pPr>
         <w:tabs>
           <w:tab w:val="num" w:pos="0"/>
         </w:tabs>
-        <w:ind w:start="360" w:hanging="200"/>
+        <w:ind w:left="360" w:hanging="200"/>
       </w:pPr>
       <w:rPr>
         <w:rFonts w:ascii="Symbol" w:hAnsi="Symbol" w:cs="Symbol" w:hint="default"/>
@@ -2478,12 +2847,12 @@
       <w:start w:val="1"/>
       <w:numFmt w:val="decimal"/>
       <w:lvlText w:val="%2."/>
-      <w:lvlJc w:val="start"/>
+      <w:lvlJc w:val="left"/>
       <w:pPr>
         <w:tabs>
           <w:tab w:val="num" w:pos="1080"/>
         </w:tabs>
-        <w:ind w:start="1080" w:hanging="360"/>
+        <w:ind w:left="1080" w:hanging="360"/>
       </w:pPr>
       <w:rPr/>
     </w:lvl>
@@ -2491,12 +2860,12 @@
       <w:start w:val="1"/>
       <w:numFmt w:val="decimal"/>
       <w:lvlText w:val="%3."/>
-      <w:lvlJc w:val="start"/>
+      <w:lvlJc w:val="left"/>
       <w:pPr>
         <w:tabs>
           <w:tab w:val="num" w:pos="1440"/>
         </w:tabs>
-        <w:ind w:start="1440" w:hanging="360"/>
+        <w:ind w:left="1440" w:hanging="360"/>
       </w:pPr>
       <w:rPr/>
     </w:lvl>
@@ -2504,12 +2873,12 @@
       <w:start w:val="1"/>
       <w:numFmt w:val="decimal"/>
       <w:lvlText w:val="%4."/>
-      <w:lvlJc w:val="start"/>
+      <w:lvlJc w:val="left"/>
       <w:pPr>
         <w:tabs>
           <w:tab w:val="num" w:pos="1800"/>
         </w:tabs>
-        <w:ind w:start="1800" w:hanging="360"/>
+        <w:ind w:left="1800" w:hanging="360"/>
       </w:pPr>
       <w:rPr/>
     </w:lvl>
@@ -2517,12 +2886,12 @@
       <w:start w:val="1"/>
       <w:numFmt w:val="decimal"/>
       <w:lvlText w:val="%5."/>
-      <w:lvlJc w:val="start"/>
+      <w:lvlJc w:val="left"/>
       <w:pPr>
         <w:tabs>
           <w:tab w:val="num" w:pos="2160"/>
         </w:tabs>
-        <w:ind w:start="2160" w:hanging="360"/>
+        <w:ind w:left="2160" w:hanging="360"/>
       </w:pPr>
       <w:rPr/>
     </w:lvl>
@@ -2530,12 +2899,12 @@
       <w:start w:val="1"/>
       <w:numFmt w:val="decimal"/>
       <w:lvlText w:val="%6."/>
-      <w:lvlJc w:val="start"/>
+      <w:lvlJc w:val="left"/>
       <w:pPr>
         <w:tabs>
           <w:tab w:val="num" w:pos="2520"/>
         </w:tabs>
-        <w:ind w:start="2520" w:hanging="360"/>
+        <w:ind w:left="2520" w:hanging="360"/>
       </w:pPr>
       <w:rPr/>
     </w:lvl>
@@ -2543,12 +2912,12 @@
       <w:start w:val="1"/>
       <w:numFmt w:val="decimal"/>
       <w:lvlText w:val="%7."/>
-      <w:lvlJc w:val="start"/>
+      <w:lvlJc w:val="left"/>
       <w:pPr>
         <w:tabs>
           <w:tab w:val="num" w:pos="2880"/>
         </w:tabs>
-        <w:ind w:start="2880" w:hanging="360"/>
+        <w:ind w:left="2880" w:hanging="360"/>
       </w:pPr>
       <w:rPr/>
     </w:lvl>
@@ -2556,12 +2925,12 @@
       <w:start w:val="1"/>
       <w:numFmt w:val="decimal"/>
       <w:lvlText w:val="%8."/>
-      <w:lvlJc w:val="start"/>
+      <w:lvlJc w:val="left"/>
       <w:pPr>
         <w:tabs>
           <w:tab w:val="num" w:pos="3240"/>
         </w:tabs>
-        <w:ind w:start="3240" w:hanging="360"/>
+        <w:ind w:left="3240" w:hanging="360"/>
       </w:pPr>
       <w:rPr/>
     </w:lvl>
@@ -2569,131 +2938,12 @@
       <w:start w:val="1"/>
       <w:numFmt w:val="decimal"/>
       <w:lvlText w:val="%9."/>
-      <w:lvlJc w:val="start"/>
+      <w:lvlJc w:val="left"/>
       <w:pPr>
         <w:tabs>
           <w:tab w:val="num" w:pos="3600"/>
         </w:tabs>
-        <w:ind w:start="3600" w:hanging="360"/>
-      </w:pPr>
-      <w:rPr/>
-    </w:lvl>
-  </w:abstractNum>
-  <w:abstractNum w:abstractNumId="2">
-    <w:lvl w:ilvl="0">
-      <w:start w:val="1"/>
-      <w:numFmt w:val="decimal"/>
-      <w:lvlText w:val="%1."/>
-      <w:lvlJc w:val="start"/>
-      <w:pPr>
-        <w:tabs>
-          <w:tab w:val="num" w:pos="520"/>
-        </w:tabs>
-        <w:ind w:start="520" w:hanging="360"/>
-      </w:pPr>
-      <w:rPr/>
-    </w:lvl>
-    <w:lvl w:ilvl="1">
-      <w:start w:val="1"/>
-      <w:numFmt w:val="decimal"/>
-      <w:lvlText w:val="%2."/>
-      <w:lvlJc w:val="start"/>
-      <w:pPr>
-        <w:tabs>
-          <w:tab w:val="num" w:pos="880"/>
-        </w:tabs>
-        <w:ind w:start="880" w:hanging="360"/>
-      </w:pPr>
-      <w:rPr/>
-    </w:lvl>
-    <w:lvl w:ilvl="2">
-      <w:start w:val="1"/>
-      <w:numFmt w:val="decimal"/>
-      <w:lvlText w:val="%3."/>
-      <w:lvlJc w:val="start"/>
-      <w:pPr>
-        <w:tabs>
-          <w:tab w:val="num" w:pos="1240"/>
-        </w:tabs>
-        <w:ind w:start="1240" w:hanging="360"/>
-      </w:pPr>
-      <w:rPr/>
-    </w:lvl>
-    <w:lvl w:ilvl="3">
-      <w:start w:val="1"/>
-      <w:numFmt w:val="decimal"/>
-      <w:lvlText w:val="%4."/>
-      <w:lvlJc w:val="start"/>
-      <w:pPr>
-        <w:tabs>
-          <w:tab w:val="num" w:pos="1600"/>
-        </w:tabs>
-        <w:ind w:start="1600" w:hanging="360"/>
-      </w:pPr>
-      <w:rPr/>
-    </w:lvl>
-    <w:lvl w:ilvl="4">
-      <w:start w:val="1"/>
-      <w:numFmt w:val="decimal"/>
-      <w:lvlText w:val="%5."/>
-      <w:lvlJc w:val="start"/>
-      <w:pPr>
-        <w:tabs>
-          <w:tab w:val="num" w:pos="1960"/>
-        </w:tabs>
-        <w:ind w:start="1960" w:hanging="360"/>
-      </w:pPr>
-      <w:rPr/>
-    </w:lvl>
-    <w:lvl w:ilvl="5">
-      <w:start w:val="1"/>
-      <w:numFmt w:val="decimal"/>
-      <w:lvlText w:val="%6."/>
-      <w:lvlJc w:val="start"/>
-      <w:pPr>
-        <w:tabs>
-          <w:tab w:val="num" w:pos="2320"/>
-        </w:tabs>
-        <w:ind w:start="2320" w:hanging="360"/>
-      </w:pPr>
-      <w:rPr/>
-    </w:lvl>
-    <w:lvl w:ilvl="6">
-      <w:start w:val="1"/>
-      <w:numFmt w:val="decimal"/>
-      <w:lvlText w:val="%7."/>
-      <w:lvlJc w:val="start"/>
-      <w:pPr>
-        <w:tabs>
-          <w:tab w:val="num" w:pos="2680"/>
-        </w:tabs>
-        <w:ind w:start="2680" w:hanging="360"/>
-      </w:pPr>
-      <w:rPr/>
-    </w:lvl>
-    <w:lvl w:ilvl="7">
-      <w:start w:val="1"/>
-      <w:numFmt w:val="decimal"/>
-      <w:lvlText w:val="%8."/>
-      <w:lvlJc w:val="start"/>
-      <w:pPr>
-        <w:tabs>
-          <w:tab w:val="num" w:pos="3040"/>
-        </w:tabs>
-        <w:ind w:start="3040" w:hanging="360"/>
-      </w:pPr>
-      <w:rPr/>
-    </w:lvl>
-    <w:lvl w:ilvl="8">
-      <w:start w:val="1"/>
-      <w:numFmt w:val="decimal"/>
-      <w:lvlText w:val="%9."/>
-      <w:lvlJc w:val="start"/>
-      <w:pPr>
-        <w:tabs>
-          <w:tab w:val="num" w:pos="3400"/>
-        </w:tabs>
-        <w:ind w:start="3400" w:hanging="360"/>
+        <w:ind w:left="3600" w:hanging="360"/>
       </w:pPr>
       <w:rPr/>
     </w:lvl>
@@ -2701,14 +2951,133 @@
   <w:abstractNum w:abstractNumId="3">
     <w:lvl w:ilvl="0">
       <w:start w:val="1"/>
+      <w:numFmt w:val="decimal"/>
+      <w:lvlText w:val="%1."/>
+      <w:lvlJc w:val="left"/>
+      <w:pPr>
+        <w:tabs>
+          <w:tab w:val="num" w:pos="520"/>
+        </w:tabs>
+        <w:ind w:left="520" w:hanging="360"/>
+      </w:pPr>
+      <w:rPr/>
+    </w:lvl>
+    <w:lvl w:ilvl="1">
+      <w:start w:val="1"/>
+      <w:numFmt w:val="decimal"/>
+      <w:lvlText w:val="%2."/>
+      <w:lvlJc w:val="left"/>
+      <w:pPr>
+        <w:tabs>
+          <w:tab w:val="num" w:pos="880"/>
+        </w:tabs>
+        <w:ind w:left="880" w:hanging="360"/>
+      </w:pPr>
+      <w:rPr/>
+    </w:lvl>
+    <w:lvl w:ilvl="2">
+      <w:start w:val="1"/>
+      <w:numFmt w:val="decimal"/>
+      <w:lvlText w:val="%3."/>
+      <w:lvlJc w:val="left"/>
+      <w:pPr>
+        <w:tabs>
+          <w:tab w:val="num" w:pos="1240"/>
+        </w:tabs>
+        <w:ind w:left="1240" w:hanging="360"/>
+      </w:pPr>
+      <w:rPr/>
+    </w:lvl>
+    <w:lvl w:ilvl="3">
+      <w:start w:val="1"/>
+      <w:numFmt w:val="decimal"/>
+      <w:lvlText w:val="%4."/>
+      <w:lvlJc w:val="left"/>
+      <w:pPr>
+        <w:tabs>
+          <w:tab w:val="num" w:pos="1600"/>
+        </w:tabs>
+        <w:ind w:left="1600" w:hanging="360"/>
+      </w:pPr>
+      <w:rPr/>
+    </w:lvl>
+    <w:lvl w:ilvl="4">
+      <w:start w:val="1"/>
+      <w:numFmt w:val="decimal"/>
+      <w:lvlText w:val="%5."/>
+      <w:lvlJc w:val="left"/>
+      <w:pPr>
+        <w:tabs>
+          <w:tab w:val="num" w:pos="1960"/>
+        </w:tabs>
+        <w:ind w:left="1960" w:hanging="360"/>
+      </w:pPr>
+      <w:rPr/>
+    </w:lvl>
+    <w:lvl w:ilvl="5">
+      <w:start w:val="1"/>
+      <w:numFmt w:val="decimal"/>
+      <w:lvlText w:val="%6."/>
+      <w:lvlJc w:val="left"/>
+      <w:pPr>
+        <w:tabs>
+          <w:tab w:val="num" w:pos="2320"/>
+        </w:tabs>
+        <w:ind w:left="2320" w:hanging="360"/>
+      </w:pPr>
+      <w:rPr/>
+    </w:lvl>
+    <w:lvl w:ilvl="6">
+      <w:start w:val="1"/>
+      <w:numFmt w:val="decimal"/>
+      <w:lvlText w:val="%7."/>
+      <w:lvlJc w:val="left"/>
+      <w:pPr>
+        <w:tabs>
+          <w:tab w:val="num" w:pos="2680"/>
+        </w:tabs>
+        <w:ind w:left="2680" w:hanging="360"/>
+      </w:pPr>
+      <w:rPr/>
+    </w:lvl>
+    <w:lvl w:ilvl="7">
+      <w:start w:val="1"/>
+      <w:numFmt w:val="decimal"/>
+      <w:lvlText w:val="%8."/>
+      <w:lvlJc w:val="left"/>
+      <w:pPr>
+        <w:tabs>
+          <w:tab w:val="num" w:pos="3040"/>
+        </w:tabs>
+        <w:ind w:left="3040" w:hanging="360"/>
+      </w:pPr>
+      <w:rPr/>
+    </w:lvl>
+    <w:lvl w:ilvl="8">
+      <w:start w:val="1"/>
+      <w:numFmt w:val="decimal"/>
+      <w:lvlText w:val="%9."/>
+      <w:lvlJc w:val="left"/>
+      <w:pPr>
+        <w:tabs>
+          <w:tab w:val="num" w:pos="3400"/>
+        </w:tabs>
+        <w:ind w:left="3400" w:hanging="360"/>
+      </w:pPr>
+      <w:rPr/>
+    </w:lvl>
+  </w:abstractNum>
+  <w:abstractNum w:abstractNumId="4">
+    <w:lvl w:ilvl="0">
+      <w:start w:val="1"/>
       <w:numFmt w:val="bullet"/>
       <w:lvlText w:val=""/>
-      <w:lvlJc w:val="start"/>
+      <w:lvlJc w:val="left"/>
       <w:pPr>
         <w:tabs>
           <w:tab w:val="num" w:pos="720"/>
         </w:tabs>
-        <w:ind w:start="720" w:hanging="360"/>
+        <w:ind w:left="720" w:hanging="360"/>
       </w:pPr>
       <w:rPr>
         <w:rFonts w:ascii="Symbol" w:hAnsi="Symbol" w:cs="Symbol" w:hint="default"/>
@@ -2718,12 +3087,12 @@
       <w:start w:val="1"/>
       <w:numFmt w:val="bullet"/>
       <w:lvlText w:val="◦"/>
-      <w:lvlJc w:val="start"/>
+      <w:lvlJc w:val="left"/>
       <w:pPr>
         <w:tabs>
           <w:tab w:val="num" w:pos="1080"/>
         </w:tabs>
-        <w:ind w:start="1080" w:hanging="360"/>
+        <w:ind w:left="1080" w:hanging="360"/>
       </w:pPr>
       <w:rPr>
         <w:rFonts w:ascii="OpenSymbol" w:hAnsi="OpenSymbol" w:cs="OpenSymbol" w:hint="default"/>
@@ -2733,12 +3102,12 @@
       <w:start w:val="1"/>
       <w:numFmt w:val="bullet"/>
       <w:lvlText w:val="▪"/>
-      <w:lvlJc w:val="start"/>
+      <w:lvlJc w:val="left"/>
       <w:pPr>
         <w:tabs>
           <w:tab w:val="num" w:pos="1440"/>
         </w:tabs>
-        <w:ind w:start="1440" w:hanging="360"/>
+        <w:ind w:left="1440" w:hanging="360"/>
       </w:pPr>
       <w:rPr>
         <w:rFonts w:ascii="OpenSymbol" w:hAnsi="OpenSymbol" w:cs="OpenSymbol" w:hint="default"/>
@@ -2748,12 +3117,12 @@
       <w:start w:val="1"/>
       <w:numFmt w:val="bullet"/>
       <w:lvlText w:val=""/>
-      <w:lvlJc w:val="start"/>
+      <w:lvlJc w:val="left"/>
       <w:pPr>
         <w:tabs>
           <w:tab w:val="num" w:pos="1800"/>
         </w:tabs>
-        <w:ind w:start="1800" w:hanging="360"/>
+        <w:ind w:left="1800" w:hanging="360"/>
       </w:pPr>
       <w:rPr>
         <w:rFonts w:ascii="Symbol" w:hAnsi="Symbol" w:cs="Symbol" w:hint="default"/>
@@ -2763,12 +3132,12 @@
       <w:start w:val="1"/>
       <w:numFmt w:val="bullet"/>
       <w:lvlText w:val="◦"/>
-      <w:lvlJc w:val="start"/>
+      <w:lvlJc w:val="left"/>
       <w:pPr>
         <w:tabs>
           <w:tab w:val="num" w:pos="2160"/>
         </w:tabs>
-        <w:ind w:start="2160" w:hanging="360"/>
+        <w:ind w:left="2160" w:hanging="360"/>
       </w:pPr>
       <w:rPr>
         <w:rFonts w:ascii="OpenSymbol" w:hAnsi="OpenSymbol" w:cs="OpenSymbol" w:hint="default"/>
@@ -2778,12 +3147,12 @@
       <w:start w:val="1"/>
       <w:numFmt w:val="bullet"/>
       <w:lvlText w:val="▪"/>
-      <w:lvlJc w:val="start"/>
+      <w:lvlJc w:val="left"/>
       <w:pPr>
         <w:tabs>
           <w:tab w:val="num" w:pos="2520"/>
         </w:tabs>
-        <w:ind w:start="2520" w:hanging="360"/>
+        <w:ind w:left="2520" w:hanging="360"/>
       </w:pPr>
       <w:rPr>
         <w:rFonts w:ascii="OpenSymbol" w:hAnsi="OpenSymbol" w:cs="OpenSymbol" w:hint="default"/>
@@ -2793,12 +3162,12 @@
       <w:start w:val="1"/>
       <w:numFmt w:val="bullet"/>
       <w:lvlText w:val=""/>
-      <w:lvlJc w:val="start"/>
+      <w:lvlJc w:val="left"/>
       <w:pPr>
         <w:tabs>
           <w:tab w:val="num" w:pos="2880"/>
         </w:tabs>
-        <w:ind w:start="2880" w:hanging="360"/>
+        <w:ind w:left="2880" w:hanging="360"/>
       </w:pPr>
       <w:rPr>
         <w:rFonts w:ascii="Symbol" w:hAnsi="Symbol" w:cs="Symbol" w:hint="default"/>
@@ -2808,12 +3177,12 @@
       <w:start w:val="1"/>
       <w:numFmt w:val="bullet"/>
       <w:lvlText w:val="◦"/>
-      <w:lvlJc w:val="start"/>
+      <w:lvlJc w:val="left"/>
       <w:pPr>
         <w:tabs>
           <w:tab w:val="num" w:pos="3240"/>
         </w:tabs>
-        <w:ind w:start="3240" w:hanging="360"/>
+        <w:ind w:left="3240" w:hanging="360"/>
       </w:pPr>
       <w:rPr>
         <w:rFonts w:ascii="OpenSymbol" w:hAnsi="OpenSymbol" w:cs="OpenSymbol" w:hint="default"/>
@@ -2823,29 +3192,29 @@
       <w:start w:val="1"/>
       <w:numFmt w:val="bullet"/>
       <w:lvlText w:val="▪"/>
-      <w:lvlJc w:val="start"/>
+      <w:lvlJc w:val="left"/>
       <w:pPr>
         <w:tabs>
           <w:tab w:val="num" w:pos="3600"/>
         </w:tabs>
-        <w:ind w:start="3600" w:hanging="360"/>
+        <w:ind w:left="3600" w:hanging="360"/>
       </w:pPr>
       <w:rPr>
         <w:rFonts w:ascii="OpenSymbol" w:hAnsi="OpenSymbol" w:cs="OpenSymbol" w:hint="default"/>
       </w:rPr>
     </w:lvl>
   </w:abstractNum>
-  <w:abstractNum w:abstractNumId="4">
+  <w:abstractNum w:abstractNumId="5">
     <w:lvl w:ilvl="0">
       <w:start w:val="1"/>
       <w:numFmt w:val="bullet"/>
       <w:lvlText w:val=""/>
-      <w:lvlJc w:val="start"/>
+      <w:lvlJc w:val="left"/>
       <w:pPr>
         <w:tabs>
           <w:tab w:val="num" w:pos="720"/>
         </w:tabs>
-        <w:ind w:start="720" w:hanging="360"/>
+        <w:ind w:left="720" w:hanging="360"/>
       </w:pPr>
       <w:rPr>
         <w:rFonts w:ascii="Symbol" w:hAnsi="Symbol" w:cs="Symbol" w:hint="default"/>
@@ -2855,12 +3224,12 @@
       <w:start w:val="1"/>
       <w:numFmt w:val="bullet"/>
       <w:lvlText w:val="◦"/>
-      <w:lvlJc w:val="start"/>
+      <w:lvlJc w:val="left"/>
       <w:pPr>
         <w:tabs>
           <w:tab w:val="num" w:pos="1080"/>
         </w:tabs>
-        <w:ind w:start="1080" w:hanging="360"/>
+        <w:ind w:left="1080" w:hanging="360"/>
       </w:pPr>
       <w:rPr>
         <w:rFonts w:ascii="OpenSymbol" w:hAnsi="OpenSymbol" w:cs="OpenSymbol" w:hint="default"/>
@@ -2870,12 +3239,12 @@
       <w:start w:val="1"/>
       <w:numFmt w:val="bullet"/>
       <w:lvlText w:val="▪"/>
-      <w:lvlJc w:val="start"/>
+      <w:lvlJc w:val="left"/>
       <w:pPr>
         <w:tabs>
           <w:tab w:val="num" w:pos="1440"/>
         </w:tabs>
-        <w:ind w:start="1440" w:hanging="360"/>
+        <w:ind w:left="1440" w:hanging="360"/>
       </w:pPr>
       <w:rPr>
         <w:rFonts w:ascii="OpenSymbol" w:hAnsi="OpenSymbol" w:cs="OpenSymbol" w:hint="default"/>
@@ -2885,12 +3254,12 @@
       <w:start w:val="1"/>
       <w:numFmt w:val="bullet"/>
       <w:lvlText w:val=""/>
-      <w:lvlJc w:val="start"/>
+      <w:lvlJc w:val="left"/>
       <w:pPr>
         <w:tabs>
           <w:tab w:val="num" w:pos="1800"/>
         </w:tabs>
-        <w:ind w:start="1800" w:hanging="360"/>
+        <w:ind w:left="1800" w:hanging="360"/>
       </w:pPr>
       <w:rPr>
         <w:rFonts w:ascii="Symbol" w:hAnsi="Symbol" w:cs="Symbol" w:hint="default"/>
@@ -2900,12 +3269,12 @@
       <w:start w:val="1"/>
       <w:numFmt w:val="bullet"/>
       <w:lvlText w:val="◦"/>
-      <w:lvlJc w:val="start"/>
+      <w:lvlJc w:val="left"/>
       <w:pPr>
         <w:tabs>
           <w:tab w:val="num" w:pos="2160"/>
         </w:tabs>
-        <w:ind w:start="2160" w:hanging="360"/>
+        <w:ind w:left="2160" w:hanging="360"/>
       </w:pPr>
       <w:rPr>
         <w:rFonts w:ascii="OpenSymbol" w:hAnsi="OpenSymbol" w:cs="OpenSymbol" w:hint="default"/>
@@ -2915,12 +3284,12 @@
       <w:start w:val="1"/>
       <w:numFmt w:val="bullet"/>
       <w:lvlText w:val="▪"/>
-      <w:lvlJc w:val="start"/>
+      <w:lvlJc w:val="left"/>
       <w:pPr>
         <w:tabs>
           <w:tab w:val="num" w:pos="2520"/>
         </w:tabs>
-        <w:ind w:start="2520" w:hanging="360"/>
+        <w:ind w:left="2520" w:hanging="360"/>
       </w:pPr>
       <w:rPr>
         <w:rFonts w:ascii="OpenSymbol" w:hAnsi="OpenSymbol" w:cs="OpenSymbol" w:hint="default"/>
@@ -2930,12 +3299,12 @@
       <w:start w:val="1"/>
       <w:numFmt w:val="bullet"/>
       <w:lvlText w:val=""/>
-      <w:lvlJc w:val="start"/>
+      <w:lvlJc w:val="left"/>
       <w:pPr>
         <w:tabs>
           <w:tab w:val="num" w:pos="2880"/>
         </w:tabs>
-        <w:ind w:start="2880" w:hanging="360"/>
+        <w:ind w:left="2880" w:hanging="360"/>
       </w:pPr>
       <w:rPr>
         <w:rFonts w:ascii="Symbol" w:hAnsi="Symbol" w:cs="Symbol" w:hint="default"/>
@@ -2945,12 +3314,12 @@
       <w:start w:val="1"/>
       <w:numFmt w:val="bullet"/>
       <w:lvlText w:val="◦"/>
-      <w:lvlJc w:val="start"/>
+      <w:lvlJc w:val="left"/>
       <w:pPr>
         <w:tabs>
           <w:tab w:val="num" w:pos="3240"/>
         </w:tabs>
-        <w:ind w:start="3240" w:hanging="360"/>
+        <w:ind w:left="3240" w:hanging="360"/>
       </w:pPr>
       <w:rPr>
         <w:rFonts w:ascii="OpenSymbol" w:hAnsi="OpenSymbol" w:cs="OpenSymbol" w:hint="default"/>
@@ -2960,29 +3329,29 @@
       <w:start w:val="1"/>
       <w:numFmt w:val="bullet"/>
       <w:lvlText w:val="▪"/>
-      <w:lvlJc w:val="start"/>
+      <w:lvlJc w:val="left"/>
       <w:pPr>
         <w:tabs>
           <w:tab w:val="num" w:pos="3600"/>
         </w:tabs>
-        <w:ind w:start="3600" w:hanging="360"/>
+        <w:ind w:left="3600" w:hanging="360"/>
       </w:pPr>
       <w:rPr>
         <w:rFonts w:ascii="OpenSymbol" w:hAnsi="OpenSymbol" w:cs="OpenSymbol" w:hint="default"/>
       </w:rPr>
     </w:lvl>
   </w:abstractNum>
-  <w:abstractNum w:abstractNumId="5">
+  <w:abstractNum w:abstractNumId="6">
     <w:lvl w:ilvl="0">
       <w:start w:val="1"/>
       <w:numFmt w:val="bullet"/>
       <w:lvlText w:val=""/>
-      <w:lvlJc w:val="start"/>
+      <w:lvlJc w:val="left"/>
       <w:pPr>
         <w:tabs>
           <w:tab w:val="num" w:pos="720"/>
         </w:tabs>
-        <w:ind w:start="720" w:hanging="360"/>
+        <w:ind w:left="720" w:hanging="360"/>
       </w:pPr>
       <w:rPr>
         <w:rFonts w:ascii="Symbol" w:hAnsi="Symbol" w:cs="Symbol" w:hint="default"/>
@@ -2992,12 +3361,12 @@
       <w:start w:val="1"/>
       <w:numFmt w:val="bullet"/>
       <w:lvlText w:val="◦"/>
-      <w:lvlJc w:val="start"/>
+      <w:lvlJc w:val="left"/>
       <w:pPr>
         <w:tabs>
           <w:tab w:val="num" w:pos="1080"/>
         </w:tabs>
-        <w:ind w:start="1080" w:hanging="360"/>
+        <w:ind w:left="1080" w:hanging="360"/>
       </w:pPr>
       <w:rPr>
         <w:rFonts w:ascii="OpenSymbol" w:hAnsi="OpenSymbol" w:cs="OpenSymbol" w:hint="default"/>
@@ -3007,12 +3376,12 @@
       <w:start w:val="1"/>
       <w:numFmt w:val="bullet"/>
       <w:lvlText w:val="▪"/>
-      <w:lvlJc w:val="start"/>
+      <w:lvlJc w:val="left"/>
       <w:pPr>
         <w:tabs>
           <w:tab w:val="num" w:pos="1440"/>
         </w:tabs>
-        <w:ind w:start="1440" w:hanging="360"/>
+        <w:ind w:left="1440" w:hanging="360"/>
       </w:pPr>
       <w:rPr>
         <w:rFonts w:ascii="OpenSymbol" w:hAnsi="OpenSymbol" w:cs="OpenSymbol" w:hint="default"/>
@@ -3022,12 +3391,12 @@
       <w:start w:val="1"/>
       <w:numFmt w:val="bullet"/>
       <w:lvlText w:val=""/>
-      <w:lvlJc w:val="start"/>
+      <w:lvlJc w:val="left"/>
       <w:pPr>
         <w:tabs>
           <w:tab w:val="num" w:pos="1800"/>
         </w:tabs>
-        <w:ind w:start="1800" w:hanging="360"/>
+        <w:ind w:left="1800" w:hanging="360"/>
       </w:pPr>
       <w:rPr>
         <w:rFonts w:ascii="Symbol" w:hAnsi="Symbol" w:cs="Symbol" w:hint="default"/>
@@ -3037,12 +3406,12 @@
       <w:start w:val="1"/>
       <w:numFmt w:val="bullet"/>
       <w:lvlText w:val="◦"/>
-      <w:lvlJc w:val="start"/>
+      <w:lvlJc w:val="left"/>
       <w:pPr>
         <w:tabs>
           <w:tab w:val="num" w:pos="2160"/>
         </w:tabs>
-        <w:ind w:start="2160" w:hanging="360"/>
+        <w:ind w:left="2160" w:hanging="360"/>
       </w:pPr>
       <w:rPr>
         <w:rFonts w:ascii="OpenSymbol" w:hAnsi="OpenSymbol" w:cs="OpenSymbol" w:hint="default"/>
@@ -3052,12 +3421,12 @@
       <w:start w:val="1"/>
       <w:numFmt w:val="bullet"/>
       <w:lvlText w:val="▪"/>
-      <w:lvlJc w:val="start"/>
+      <w:lvlJc w:val="left"/>
       <w:pPr>
         <w:tabs>
           <w:tab w:val="num" w:pos="2520"/>
         </w:tabs>
-        <w:ind w:start="2520" w:hanging="360"/>
+        <w:ind w:left="2520" w:hanging="360"/>
       </w:pPr>
       <w:rPr>
         <w:rFonts w:ascii="OpenSymbol" w:hAnsi="OpenSymbol" w:cs="OpenSymbol" w:hint="default"/>
@@ -3067,12 +3436,12 @@
       <w:start w:val="1"/>
       <w:numFmt w:val="bullet"/>
       <w:lvlText w:val=""/>
-      <w:lvlJc w:val="start"/>
+      <w:lvlJc w:val="left"/>
       <w:pPr>
         <w:tabs>
           <w:tab w:val="num" w:pos="2880"/>
         </w:tabs>
-        <w:ind w:start="2880" w:hanging="360"/>
+        <w:ind w:left="2880" w:hanging="360"/>
       </w:pPr>
       <w:rPr>
         <w:rFonts w:ascii="Symbol" w:hAnsi="Symbol" w:cs="Symbol" w:hint="default"/>
@@ -3082,12 +3451,12 @@
       <w:start w:val="1"/>
       <w:numFmt w:val="bullet"/>
       <w:lvlText w:val="◦"/>
-      <w:lvlJc w:val="start"/>
+      <w:lvlJc w:val="left"/>
       <w:pPr>
         <w:tabs>
           <w:tab w:val="num" w:pos="3240"/>
         </w:tabs>
-        <w:ind w:start="3240" w:hanging="360"/>
+        <w:ind w:left="3240" w:hanging="360"/>
       </w:pPr>
       <w:rPr>
         <w:rFonts w:ascii="OpenSymbol" w:hAnsi="OpenSymbol" w:cs="OpenSymbol" w:hint="default"/>
@@ -3097,29 +3466,29 @@
       <w:start w:val="1"/>
       <w:numFmt w:val="bullet"/>
       <w:lvlText w:val="▪"/>
-      <w:lvlJc w:val="start"/>
+      <w:lvlJc w:val="left"/>
       <w:pPr>
         <w:tabs>
           <w:tab w:val="num" w:pos="3600"/>
         </w:tabs>
-        <w:ind w:start="3600" w:hanging="360"/>
+        <w:ind w:left="3600" w:hanging="360"/>
       </w:pPr>
       <w:rPr>
         <w:rFonts w:ascii="OpenSymbol" w:hAnsi="OpenSymbol" w:cs="OpenSymbol" w:hint="default"/>
       </w:rPr>
     </w:lvl>
   </w:abstractNum>
-  <w:abstractNum w:abstractNumId="6">
+  <w:abstractNum w:abstractNumId="7">
     <w:lvl w:ilvl="0">
       <w:start w:val="1"/>
       <w:numFmt w:val="bullet"/>
       <w:lvlText w:val=""/>
-      <w:lvlJc w:val="start"/>
+      <w:lvlJc w:val="left"/>
       <w:pPr>
         <w:tabs>
           <w:tab w:val="num" w:pos="720"/>
         </w:tabs>
-        <w:ind w:start="720" w:hanging="360"/>
+        <w:ind w:left="720" w:hanging="360"/>
       </w:pPr>
       <w:rPr>
         <w:rFonts w:ascii="Symbol" w:hAnsi="Symbol" w:cs="Symbol" w:hint="default"/>
@@ -3129,12 +3498,12 @@
       <w:start w:val="1"/>
       <w:numFmt w:val="bullet"/>
       <w:lvlText w:val="◦"/>
-      <w:lvlJc w:val="start"/>
+      <w:lvlJc w:val="left"/>
       <w:pPr>
         <w:tabs>
           <w:tab w:val="num" w:pos="1080"/>
         </w:tabs>
-        <w:ind w:start="1080" w:hanging="360"/>
+        <w:ind w:left="1080" w:hanging="360"/>
       </w:pPr>
       <w:rPr>
         <w:rFonts w:ascii="OpenSymbol" w:hAnsi="OpenSymbol" w:cs="OpenSymbol" w:hint="default"/>
@@ -3144,12 +3513,12 @@
       <w:start w:val="1"/>
       <w:numFmt w:val="bullet"/>
       <w:lvlText w:val="▪"/>
-      <w:lvlJc w:val="start"/>
+      <w:lvlJc w:val="left"/>
       <w:pPr>
         <w:tabs>
           <w:tab w:val="num" w:pos="1440"/>
         </w:tabs>
-        <w:ind w:start="1440" w:hanging="360"/>
+        <w:ind w:left="1440" w:hanging="360"/>
       </w:pPr>
       <w:rPr>
         <w:rFonts w:ascii="OpenSymbol" w:hAnsi="OpenSymbol" w:cs="OpenSymbol" w:hint="default"/>
@@ -3159,12 +3528,12 @@
       <w:start w:val="1"/>
       <w:numFmt w:val="bullet"/>
       <w:lvlText w:val=""/>
-      <w:lvlJc w:val="start"/>
+      <w:lvlJc w:val="left"/>
       <w:pPr>
         <w:tabs>
           <w:tab w:val="num" w:pos="1800"/>
         </w:tabs>
-        <w:ind w:start="1800" w:hanging="360"/>
+        <w:ind w:left="1800" w:hanging="360"/>
       </w:pPr>
       <w:rPr>
         <w:rFonts w:ascii="Symbol" w:hAnsi="Symbol" w:cs="Symbol" w:hint="default"/>
@@ -3174,12 +3543,12 @@
       <w:start w:val="1"/>
       <w:numFmt w:val="bullet"/>
       <w:lvlText w:val="◦"/>
-      <w:lvlJc w:val="start"/>
+      <w:lvlJc w:val="left"/>
       <w:pPr>
         <w:tabs>
           <w:tab w:val="num" w:pos="2160"/>
         </w:tabs>
-        <w:ind w:start="2160" w:hanging="360"/>
+        <w:ind w:left="2160" w:hanging="360"/>
       </w:pPr>
       <w:rPr>
         <w:rFonts w:ascii="OpenSymbol" w:hAnsi="OpenSymbol" w:cs="OpenSymbol" w:hint="default"/>
@@ -3189,12 +3558,12 @@
       <w:start w:val="1"/>
       <w:numFmt w:val="bullet"/>
       <w:lvlText w:val="▪"/>
-      <w:lvlJc w:val="start"/>
+      <w:lvlJc w:val="left"/>
       <w:pPr>
         <w:tabs>
           <w:tab w:val="num" w:pos="2520"/>
         </w:tabs>
-        <w:ind w:start="2520" w:hanging="360"/>
+        <w:ind w:left="2520" w:hanging="360"/>
       </w:pPr>
       <w:rPr>
         <w:rFonts w:ascii="OpenSymbol" w:hAnsi="OpenSymbol" w:cs="OpenSymbol" w:hint="default"/>
@@ -3204,12 +3573,12 @@
       <w:start w:val="1"/>
       <w:numFmt w:val="bullet"/>
       <w:lvlText w:val=""/>
-      <w:lvlJc w:val="start"/>
+      <w:lvlJc w:val="left"/>
       <w:pPr>
         <w:tabs>
           <w:tab w:val="num" w:pos="2880"/>
         </w:tabs>
-        <w:ind w:start="2880" w:hanging="360"/>
+        <w:ind w:left="2880" w:hanging="360"/>
       </w:pPr>
       <w:rPr>
         <w:rFonts w:ascii="Symbol" w:hAnsi="Symbol" w:cs="Symbol" w:hint="default"/>
@@ -3219,12 +3588,12 @@
       <w:start w:val="1"/>
       <w:numFmt w:val="bullet"/>
       <w:lvlText w:val="◦"/>
-      <w:lvlJc w:val="start"/>
+      <w:lvlJc w:val="left"/>
       <w:pPr>
         <w:tabs>
           <w:tab w:val="num" w:pos="3240"/>
         </w:tabs>
-        <w:ind w:start="3240" w:hanging="360"/>
+        <w:ind w:left="3240" w:hanging="360"/>
       </w:pPr>
       <w:rPr>
         <w:rFonts w:ascii="OpenSymbol" w:hAnsi="OpenSymbol" w:cs="OpenSymbol" w:hint="default"/>
@@ -3234,135 +3603,16 @@
       <w:start w:val="1"/>
       <w:numFmt w:val="bullet"/>
       <w:lvlText w:val="▪"/>
-      <w:lvlJc w:val="start"/>
+      <w:lvlJc w:val="left"/>
       <w:pPr>
         <w:tabs>
           <w:tab w:val="num" w:pos="3600"/>
         </w:tabs>
-        <w:ind w:start="3600" w:hanging="360"/>
+        <w:ind w:left="3600" w:hanging="360"/>
       </w:pPr>
       <w:rPr>
         <w:rFonts w:ascii="OpenSymbol" w:hAnsi="OpenSymbol" w:cs="OpenSymbol" w:hint="default"/>
       </w:rPr>
-    </w:lvl>
-  </w:abstractNum>
-  <w:abstractNum w:abstractNumId="7">
-    <w:lvl w:ilvl="0">
-      <w:start w:val="1"/>
-      <w:numFmt w:val="none"/>
-      <w:suff w:val="nothing"/>
-      <w:lvlText w:val=""/>
-      <w:lvlJc w:val="start"/>
-      <w:pPr>
-        <w:tabs>
-          <w:tab w:val="num" w:pos="0"/>
-        </w:tabs>
-        <w:ind w:start="0" w:hanging="0"/>
-      </w:pPr>
-    </w:lvl>
-    <w:lvl w:ilvl="1">
-      <w:start w:val="1"/>
-      <w:numFmt w:val="none"/>
-      <w:suff w:val="nothing"/>
-      <w:lvlText w:val=""/>
-      <w:lvlJc w:val="start"/>
-      <w:pPr>
-        <w:tabs>
-          <w:tab w:val="num" w:pos="0"/>
-        </w:tabs>
-        <w:ind w:start="0" w:hanging="0"/>
-      </w:pPr>
-    </w:lvl>
-    <w:lvl w:ilvl="2">
-      <w:start w:val="1"/>
-      <w:numFmt w:val="none"/>
-      <w:suff w:val="nothing"/>
-      <w:lvlText w:val=""/>
-      <w:lvlJc w:val="start"/>
-      <w:pPr>
-        <w:tabs>
-          <w:tab w:val="num" w:pos="0"/>
-        </w:tabs>
-        <w:ind w:start="0" w:hanging="0"/>
-      </w:pPr>
-    </w:lvl>
-    <w:lvl w:ilvl="3">
-      <w:start w:val="1"/>
-      <w:numFmt w:val="none"/>
-      <w:suff w:val="nothing"/>
-      <w:lvlText w:val=""/>
-      <w:lvlJc w:val="start"/>
-      <w:pPr>
-        <w:tabs>
-          <w:tab w:val="num" w:pos="0"/>
-        </w:tabs>
-        <w:ind w:start="0" w:hanging="0"/>
-      </w:pPr>
-    </w:lvl>
-    <w:lvl w:ilvl="4">
-      <w:start w:val="1"/>
-      <w:numFmt w:val="none"/>
-      <w:suff w:val="nothing"/>
-      <w:lvlText w:val=""/>
-      <w:lvlJc w:val="start"/>
-      <w:pPr>
-        <w:tabs>
-          <w:tab w:val="num" w:pos="0"/>
-        </w:tabs>
-        <w:ind w:start="0" w:hanging="0"/>
-      </w:pPr>
-    </w:lvl>
-    <w:lvl w:ilvl="5">
-      <w:start w:val="1"/>
-      <w:numFmt w:val="none"/>
-      <w:suff w:val="nothing"/>
-      <w:lvlText w:val=""/>
-      <w:lvlJc w:val="start"/>
-      <w:pPr>
-        <w:tabs>
-          <w:tab w:val="num" w:pos="0"/>
-        </w:tabs>
-        <w:ind w:start="0" w:hanging="0"/>
-      </w:pPr>
-    </w:lvl>
-    <w:lvl w:ilvl="6">
-      <w:start w:val="1"/>
-      <w:numFmt w:val="none"/>
-      <w:suff w:val="nothing"/>
-      <w:lvlText w:val=""/>
-      <w:lvlJc w:val="start"/>
-      <w:pPr>
-        <w:tabs>
-          <w:tab w:val="num" w:pos="0"/>
-        </w:tabs>
-        <w:ind w:start="0" w:hanging="0"/>
-      </w:pPr>
-    </w:lvl>
-    <w:lvl w:ilvl="7">
-      <w:start w:val="1"/>
-      <w:numFmt w:val="none"/>
-      <w:suff w:val="nothing"/>
-      <w:lvlText w:val=""/>
-      <w:lvlJc w:val="start"/>
-      <w:pPr>
-        <w:tabs>
-          <w:tab w:val="num" w:pos="0"/>
-        </w:tabs>
-        <w:ind w:start="0" w:hanging="0"/>
-      </w:pPr>
-    </w:lvl>
-    <w:lvl w:ilvl="8">
-      <w:start w:val="1"/>
-      <w:numFmt w:val="none"/>
-      <w:suff w:val="nothing"/>
-      <w:lvlText w:val=""/>
-      <w:lvlJc w:val="start"/>
-      <w:pPr>
-        <w:tabs>
-          <w:tab w:val="num" w:pos="0"/>
-        </w:tabs>
-        <w:ind w:start="0" w:hanging="0"/>
-      </w:pPr>
     </w:lvl>
   </w:abstractNum>
   <w:num w:numId="1">
@@ -3387,7 +3637,7 @@
     <w:abstractNumId w:val="7"/>
   </w:num>
   <w:num w:numId="8">
-    <w:abstractNumId w:val="6"/>
+    <w:abstractNumId w:val="7"/>
     <w:lvlOverride w:ilvl="0">
       <w:startOverride w:val="1"/>
     </w:lvlOverride>
@@ -3417,7 +3667,7 @@
       <w:suppressAutoHyphens w:val="true"/>
       <w:bidi w:val="0"/>
       <w:spacing w:before="0" w:after="0"/>
-      <w:jc w:val="start"/>
+      <w:jc w:val="left"/>
     </w:pPr>
     <w:rPr>
       <w:rFonts w:ascii="Arial" w:hAnsi="Arial" w:eastAsia="Arial" w:cs="Arial"/>
@@ -3653,7 +3903,7 @@
       <w:suppressAutoHyphens w:val="true"/>
       <w:bidi w:val="0"/>
       <w:spacing w:before="0" w:after="0"/>
-      <w:jc w:val="start"/>
+      <w:jc w:val="left"/>
     </w:pPr>
     <w:rPr>
       <w:rFonts w:ascii="Arial" w:hAnsi="Arial" w:eastAsia="Arial" w:cs="Arial"/>
@@ -3674,7 +3924,7 @@
       <w:suppressAutoHyphens w:val="true"/>
       <w:bidi w:val="0"/>
       <w:spacing w:before="0" w:after="0"/>
-      <w:jc w:val="start"/>
+      <w:jc w:val="left"/>
     </w:pPr>
     <w:rPr>
       <w:rFonts w:ascii="Arial" w:hAnsi="Arial" w:eastAsia="Arial" w:cs="Arial"/>
@@ -3734,6 +3984,19 @@
     <w:rPr>
       <w:b/>
       <w:bCs/>
+    </w:rPr>
+  </w:style>
+  <w:style w:type="paragraph" w:styleId="Comment">
+    <w:name w:val="Comment"/>
+    <w:basedOn w:val="Normal"/>
+    <w:pPr>
+      <w:spacing w:lineRule="auto" w:line="240" w:before="56" w:after="0"/>
+      <w:ind w:hanging="0" w:left="57" w:right="57"/>
+    </w:pPr>
+    <w:rPr>
+      <w:color w:val="auto"/>
+      <w:sz w:val="20"/>
+      <w:szCs w:val="20"/>
     </w:rPr>
   </w:style>
 </w:styles>

</xml_diff>

<commit_message>
Fixed up grammar errors
</commit_message>
<xml_diff>
--- a/cv/Richard Clough cv.docx
+++ b/cv/Richard Clough cv.docx
@@ -987,43 +987,25 @@
           <w:sz w:val="20"/>
           <w:szCs w:val="20"/>
         </w:rPr>
-        <w:t xml:space="preserve">Applied human-centred design and GA4 A/B testing to redesign a high-traffic costs and pricing page. The </w:t>
-      </w:r>
-      <w:r>
-        <w:rPr>
-          <w:rFonts w:eastAsia="Arial" w:cs="Arial"/>
-          <w:color w:val="1A1A1A"/>
-          <w:sz w:val="20"/>
-          <w:szCs w:val="20"/>
-        </w:rPr>
-        <w:t xml:space="preserve">main issue was that the </w:t>
-      </w:r>
-      <w:r>
-        <w:rPr>
-          <w:rFonts w:eastAsia="Arial" w:cs="Arial"/>
-          <w:color w:val="1A1A1A"/>
-          <w:sz w:val="20"/>
-          <w:szCs w:val="20"/>
-        </w:rPr>
-        <w:t xml:space="preserve">original page was very long and </w:t>
-      </w:r>
-      <w:r>
-        <w:rPr>
-          <w:rFonts w:eastAsia="Arial" w:cs="Arial"/>
-          <w:color w:val="1A1A1A"/>
-          <w:sz w:val="20"/>
-          <w:szCs w:val="20"/>
-        </w:rPr>
-        <w:t>induced</w:t>
-      </w:r>
-      <w:r>
-        <w:rPr>
-          <w:rFonts w:eastAsia="Arial" w:cs="Arial"/>
-          <w:color w:val="1A1A1A"/>
-          <w:sz w:val="20"/>
-          <w:szCs w:val="20"/>
-        </w:rPr>
-        <w:t xml:space="preserve"> scroll fatigue, which is especially an issue on mobile devices (</w:t>
+        <w:t xml:space="preserve">Applied human-centred design and GA4 A/B testing to redesign a high-traffic costs and pricing page </w:t>
+      </w:r>
+      <w:r>
+        <w:rPr>
+          <w:rFonts w:eastAsia="Arial" w:cs="Arial"/>
+          <w:color w:val="1A1A1A"/>
+          <w:sz w:val="20"/>
+          <w:szCs w:val="20"/>
+        </w:rPr>
+        <w:t>that suffered from</w:t>
+      </w:r>
+      <w:r>
+        <w:rPr>
+          <w:rFonts w:eastAsia="Arial" w:cs="Arial"/>
+          <w:color w:val="1A1A1A"/>
+          <w:sz w:val="20"/>
+          <w:szCs w:val="20"/>
+        </w:rPr>
+        <w:t xml:space="preserve"> scroll fatigue (</w:t>
       </w:r>
       <w:hyperlink r:id="rId4">
         <w:r>
@@ -1289,37 +1271,45 @@
       </w:r>
       <w:r>
         <w:rPr>
-          <w:rStyle w:val="Hyperlink"/>
-          <w:rFonts w:eastAsia="Arial" w:cs="Arial"/>
-          <w:sz w:val="20"/>
-          <w:szCs w:val="20"/>
-        </w:rPr>
-        <w:instrText xml:space="preserve"> HYPERLINK "https://msiaustralia.org.au/translated-booklets/" \l "sedation-information"</w:instrText>
-      </w:r>
-      <w:r>
-        <w:rPr>
-          <w:rStyle w:val="Hyperlink"/>
-          <w:rFonts w:eastAsia="Arial" w:cs="Arial"/>
-          <w:sz w:val="20"/>
-          <w:szCs w:val="20"/>
+          <w:rStyle w:val="Style3"/>
+          <w:rFonts w:eastAsia="Arial" w:cs="Arial" w:ascii="Arial" w:hAnsi="Arial"/>
+          <w:color w:val="1155CC"/>
+          <w:sz w:val="20"/>
+          <w:szCs w:val="20"/>
+          <w:u w:val="single"/>
+        </w:rPr>
+        <w:instrText xml:space="preserve"> HYPERLINK "https://www.msiaustralia.org.au/contraception-services" \l "contraception-interactive"</w:instrText>
+      </w:r>
+      <w:r>
+        <w:rPr>
+          <w:rStyle w:val="Style3"/>
+          <w:rFonts w:eastAsia="Arial" w:cs="Arial" w:ascii="Arial" w:hAnsi="Arial"/>
+          <w:color w:val="1155CC"/>
+          <w:sz w:val="20"/>
+          <w:szCs w:val="20"/>
+          <w:u w:val="single"/>
         </w:rPr>
         <w:fldChar w:fldCharType="separate"/>
       </w:r>
       <w:r>
         <w:rPr>
-          <w:rStyle w:val="Hyperlink"/>
-          <w:rFonts w:eastAsia="Arial" w:cs="Arial"/>
-          <w:sz w:val="20"/>
-          <w:szCs w:val="20"/>
-        </w:rPr>
-        <w:t>https://msiaustralia.org.au/translated-booklets/#sedation-information</w:t>
-      </w:r>
-      <w:r>
-        <w:rPr>
-          <w:rStyle w:val="Hyperlink"/>
-          <w:rFonts w:eastAsia="Arial" w:cs="Arial"/>
-          <w:sz w:val="20"/>
-          <w:szCs w:val="20"/>
+          <w:rStyle w:val="Style3"/>
+          <w:rFonts w:eastAsia="Arial" w:cs="Arial" w:ascii="Arial" w:hAnsi="Arial"/>
+          <w:color w:val="1155CC"/>
+          <w:sz w:val="20"/>
+          <w:szCs w:val="20"/>
+          <w:u w:val="single"/>
+        </w:rPr>
+        <w:t>https://www.msiaustralia.org.au/contraception-services#contraception-interactive</w:t>
+      </w:r>
+      <w:r>
+        <w:rPr>
+          <w:rStyle w:val="Style3"/>
+          <w:rFonts w:eastAsia="Arial" w:cs="Arial" w:ascii="Arial" w:hAnsi="Arial"/>
+          <w:color w:val="1155CC"/>
+          <w:sz w:val="20"/>
+          <w:szCs w:val="20"/>
+          <w:u w:val="single"/>
         </w:rPr>
         <w:fldChar w:fldCharType="end"/>
       </w:r>
@@ -1353,7 +1343,7 @@
           <w:szCs w:val="20"/>
           <w:u w:val="none"/>
         </w:rPr>
-        <w:t>T</w:t>
+        <w:t>C</w:t>
       </w:r>
       <w:r>
         <w:rPr>
@@ -1364,7 +1354,7 @@
           <w:szCs w:val="20"/>
           <w:u w:val="none"/>
         </w:rPr>
-        <w:t>r</w:t>
+        <w:t>o</w:t>
       </w:r>
       <w:r>
         <w:rPr>
@@ -1375,7 +1365,7 @@
           <w:szCs w:val="20"/>
           <w:u w:val="none"/>
         </w:rPr>
-        <w:t>ansformed</w:t>
+        <w:t>m</w:t>
       </w:r>
       <w:r>
         <w:rPr>
@@ -1386,6 +1376,17 @@
           <w:szCs w:val="20"/>
           <w:u w:val="none"/>
         </w:rPr>
+        <w:t>pressed</w:t>
+      </w:r>
+      <w:r>
+        <w:rPr>
+          <w:rStyle w:val="Hyperlink"/>
+          <w:rFonts w:eastAsia="Arial" w:cs="Arial"/>
+          <w:color w:val="1A1A1A"/>
+          <w:sz w:val="20"/>
+          <w:szCs w:val="20"/>
+          <w:u w:val="none"/>
+        </w:rPr>
         <w:t xml:space="preserve"> long </w:t>
       </w:r>
       <w:r>
@@ -1430,7 +1431,7 @@
           <w:szCs w:val="20"/>
           <w:u w:val="none"/>
         </w:rPr>
-        <w:t>content into a Quick Guide and buil</w:t>
+        <w:t xml:space="preserve">content into a Quick Guide and </w:t>
       </w:r>
       <w:r>
         <w:rPr>
@@ -1441,7 +1442,7 @@
           <w:szCs w:val="20"/>
           <w:u w:val="none"/>
         </w:rPr>
-        <w:t>t</w:t>
+        <w:t>i</w:t>
       </w:r>
       <w:r>
         <w:rPr>
@@ -1452,6 +1453,28 @@
           <w:szCs w:val="20"/>
           <w:u w:val="none"/>
         </w:rPr>
+        <w:t>n</w:t>
+      </w:r>
+      <w:r>
+        <w:rPr>
+          <w:rStyle w:val="Hyperlink"/>
+          <w:rFonts w:eastAsia="Arial" w:cs="Arial"/>
+          <w:color w:val="1A1A1A"/>
+          <w:sz w:val="20"/>
+          <w:szCs w:val="20"/>
+          <w:u w:val="none"/>
+        </w:rPr>
+        <w:t>cluded</w:t>
+      </w:r>
+      <w:r>
+        <w:rPr>
+          <w:rStyle w:val="Hyperlink"/>
+          <w:rFonts w:eastAsia="Arial" w:cs="Arial"/>
+          <w:color w:val="1A1A1A"/>
+          <w:sz w:val="20"/>
+          <w:szCs w:val="20"/>
+          <w:u w:val="none"/>
+        </w:rPr>
         <w:t xml:space="preserve"> a</w:t>
       </w:r>
       <w:r>
@@ -1496,7 +1519,7 @@
           <w:szCs w:val="20"/>
           <w:u w:val="none"/>
         </w:rPr>
-        <w:t xml:space="preserve"> flowing animated interface to improve user engagement </w:t>
+        <w:t xml:space="preserve"> flowing animated interface, to improve user engagement </w:t>
       </w:r>
       <w:r>
         <w:rPr>
@@ -1962,7 +1985,7 @@
           <w:sz w:val="20"/>
           <w:szCs w:val="20"/>
         </w:rPr>
-        <w:t>Designed high-fidelity member portal interfaces in Figma from brand style guides, acting as in-house UX and accessibility advisor to cross-functional teams and applying WCAG standards across all digital outputs,</w:t>
+        <w:t>Designed high-fidelity member portal interfaces in Figma from brand style guides, acting as in-house UX and accessibility advisor to cross-functional teams and applying WCAG standards across all digital outputs.</w:t>
       </w:r>
     </w:p>
     <w:p>
@@ -1982,7 +2005,115 @@
           <w:sz w:val="20"/>
           <w:szCs w:val="20"/>
         </w:rPr>
-        <w:t xml:space="preserve">Designing and contributing to building org wide intranet in </w:t>
+        <w:t>Design</w:t>
+      </w:r>
+      <w:r>
+        <w:rPr>
+          <w:rFonts w:eastAsia="Arial" w:cs="Arial"/>
+          <w:color w:val="1A1A1A"/>
+          <w:sz w:val="20"/>
+          <w:szCs w:val="20"/>
+        </w:rPr>
+        <w:t>e</w:t>
+      </w:r>
+      <w:r>
+        <w:rPr>
+          <w:rFonts w:eastAsia="Arial" w:cs="Arial"/>
+          <w:color w:val="1A1A1A"/>
+          <w:sz w:val="20"/>
+          <w:szCs w:val="20"/>
+        </w:rPr>
+        <w:t>d</w:t>
+      </w:r>
+      <w:r>
+        <w:rPr>
+          <w:rFonts w:eastAsia="Arial" w:cs="Arial"/>
+          <w:color w:val="1A1A1A"/>
+          <w:sz w:val="20"/>
+          <w:szCs w:val="20"/>
+        </w:rPr>
+        <w:t xml:space="preserve"> and contribut</w:t>
+      </w:r>
+      <w:r>
+        <w:rPr>
+          <w:rFonts w:eastAsia="Arial" w:cs="Arial"/>
+          <w:color w:val="1A1A1A"/>
+          <w:sz w:val="20"/>
+          <w:szCs w:val="20"/>
+        </w:rPr>
+        <w:t>e</w:t>
+      </w:r>
+      <w:r>
+        <w:rPr>
+          <w:rFonts w:eastAsia="Arial" w:cs="Arial"/>
+          <w:color w:val="1A1A1A"/>
+          <w:sz w:val="20"/>
+          <w:szCs w:val="20"/>
+        </w:rPr>
+        <w:t>d</w:t>
+      </w:r>
+      <w:r>
+        <w:rPr>
+          <w:rFonts w:eastAsia="Arial" w:cs="Arial"/>
+          <w:color w:val="1A1A1A"/>
+          <w:sz w:val="20"/>
+          <w:szCs w:val="20"/>
+        </w:rPr>
+        <w:t xml:space="preserve"> to </w:t>
+      </w:r>
+      <w:r>
+        <w:rPr>
+          <w:rFonts w:eastAsia="Arial" w:cs="Arial"/>
+          <w:color w:val="1A1A1A"/>
+          <w:sz w:val="20"/>
+          <w:szCs w:val="20"/>
+        </w:rPr>
+        <w:t>t</w:t>
+      </w:r>
+      <w:r>
+        <w:rPr>
+          <w:rFonts w:eastAsia="Arial" w:cs="Arial"/>
+          <w:color w:val="1A1A1A"/>
+          <w:sz w:val="20"/>
+          <w:szCs w:val="20"/>
+        </w:rPr>
+        <w:t xml:space="preserve">he </w:t>
+      </w:r>
+      <w:r>
+        <w:rPr>
+          <w:rFonts w:eastAsia="Arial" w:cs="Arial"/>
+          <w:color w:val="1A1A1A"/>
+          <w:sz w:val="20"/>
+          <w:szCs w:val="20"/>
+        </w:rPr>
+        <w:t xml:space="preserve">building </w:t>
+      </w:r>
+      <w:r>
+        <w:rPr>
+          <w:rFonts w:eastAsia="Arial" w:cs="Arial"/>
+          <w:color w:val="1A1A1A"/>
+          <w:sz w:val="20"/>
+          <w:szCs w:val="20"/>
+        </w:rPr>
+        <w:t>o</w:t>
+      </w:r>
+      <w:r>
+        <w:rPr>
+          <w:rFonts w:eastAsia="Arial" w:cs="Arial"/>
+          <w:color w:val="1A1A1A"/>
+          <w:sz w:val="20"/>
+          <w:szCs w:val="20"/>
+        </w:rPr>
+        <w:t xml:space="preserve">f an </w:t>
+      </w:r>
+      <w:r>
+        <w:rPr>
+          <w:rFonts w:eastAsia="Arial" w:cs="Arial"/>
+          <w:color w:val="1A1A1A"/>
+          <w:sz w:val="20"/>
+          <w:szCs w:val="20"/>
+        </w:rPr>
+        <w:t xml:space="preserve">org wide intranet in </w:t>
       </w:r>
       <w:r>
         <w:rPr>

</xml_diff>

<commit_message>
Updated the summary to align with LinkedIn and Seek
</commit_message>
<xml_diff>
--- a/cv/Richard Clough cv.docx
+++ b/cv/Richard Clough cv.docx
@@ -139,55 +139,79 @@
           <w:sz w:val="20"/>
           <w:szCs w:val="20"/>
         </w:rPr>
-        <w:t xml:space="preserve">Digital Experience Designer and UI/UX practitioner with 7+ years delivering user-centred web solutions across Healthcare, Media, Retail, EdTech, and Not-for-Profit. Experienced in the full design and delivery cycle, from UX research, Figma prototyping, and information architecture through to hands-on front-end development, QA, and deployment. Equally comfortable owning digital platforms end-to-end as a Website Manager or embedded as a UI/UX designer within a cross-functional team. A natural problem-solver who identifies gaps in the user experience and builds practical, creative solutions, evidenced by a portfolio of live work at </w:t>
-      </w:r>
-      <w:r>
-        <w:fldChar w:fldCharType="begin"/>
-      </w:r>
-      <w:r>
-        <w:rPr>
-          <w:rStyle w:val="Hyperlink"/>
-          <w:rFonts w:eastAsia="Arial" w:cs="Arial"/>
-          <w:sz w:val="20"/>
-          <w:szCs w:val="20"/>
-        </w:rPr>
-        <w:instrText xml:space="preserve"> HYPERLINK "https://richardjclough.github.io/folio/" \l "web"</w:instrText>
-      </w:r>
-      <w:r>
-        <w:rPr>
-          <w:rStyle w:val="Hyperlink"/>
-          <w:rFonts w:eastAsia="Arial" w:cs="Arial"/>
-          <w:sz w:val="20"/>
-          <w:szCs w:val="20"/>
-        </w:rPr>
-        <w:fldChar w:fldCharType="separate"/>
-      </w:r>
-      <w:r>
-        <w:rPr>
-          <w:rStyle w:val="Hyperlink"/>
-          <w:rFonts w:eastAsia="Arial" w:cs="Arial"/>
-          <w:sz w:val="20"/>
-          <w:szCs w:val="20"/>
-        </w:rPr>
-        <w:t>https://richardjclough.github.io/folio/#web</w:t>
-      </w:r>
-      <w:r>
-        <w:rPr>
-          <w:rStyle w:val="Hyperlink"/>
-          <w:rFonts w:eastAsia="Arial" w:cs="Arial"/>
-          <w:sz w:val="20"/>
-          <w:szCs w:val="20"/>
-        </w:rPr>
-        <w:fldChar w:fldCharType="end"/>
-      </w:r>
-      <w:r>
-        <w:rPr>
-          <w:rFonts w:eastAsia="Arial" w:cs="Arial"/>
-          <w:color w:val="1A1A1A"/>
-          <w:sz w:val="20"/>
-          <w:szCs w:val="20"/>
-        </w:rPr>
-        <w:t>. Skilled across CMS platforms, accessibility standards (WCAG), SEO, GA4 analytics, and AI-assisted development, with a consistent focus on building digital experiences that genuinely work for the people using them.</w:t>
+        <w:t xml:space="preserve">Digital </w:t>
+      </w:r>
+      <w:r>
+        <w:rPr>
+          <w:rFonts w:eastAsia="Arial" w:cs="Arial"/>
+          <w:color w:val="1A1A1A"/>
+          <w:sz w:val="20"/>
+          <w:szCs w:val="20"/>
+        </w:rPr>
+        <w:t>E</w:t>
+      </w:r>
+      <w:r>
+        <w:rPr>
+          <w:rFonts w:eastAsia="Arial" w:cs="Arial"/>
+          <w:color w:val="1A1A1A"/>
+          <w:sz w:val="20"/>
+          <w:szCs w:val="20"/>
+        </w:rPr>
+        <w:t xml:space="preserve">xperience </w:t>
+      </w:r>
+      <w:r>
+        <w:rPr>
+          <w:rFonts w:eastAsia="Arial" w:cs="Arial"/>
+          <w:color w:val="1A1A1A"/>
+          <w:sz w:val="20"/>
+          <w:szCs w:val="20"/>
+        </w:rPr>
+        <w:t>D</w:t>
+      </w:r>
+      <w:r>
+        <w:rPr>
+          <w:rFonts w:eastAsia="Arial" w:cs="Arial"/>
+          <w:color w:val="1A1A1A"/>
+          <w:sz w:val="20"/>
+          <w:szCs w:val="20"/>
+        </w:rPr>
+        <w:t xml:space="preserve">esigner and </w:t>
+      </w:r>
+      <w:r>
+        <w:rPr>
+          <w:rFonts w:eastAsia="Arial" w:cs="Arial"/>
+          <w:color w:val="1A1A1A"/>
+          <w:sz w:val="20"/>
+          <w:szCs w:val="20"/>
+        </w:rPr>
+        <w:t>W</w:t>
+      </w:r>
+      <w:r>
+        <w:rPr>
+          <w:rFonts w:eastAsia="Arial" w:cs="Arial"/>
+          <w:color w:val="1A1A1A"/>
+          <w:sz w:val="20"/>
+          <w:szCs w:val="20"/>
+        </w:rPr>
+        <w:t xml:space="preserve">eb </w:t>
+      </w:r>
+      <w:r>
+        <w:rPr>
+          <w:rFonts w:eastAsia="Arial" w:cs="Arial"/>
+          <w:color w:val="1A1A1A"/>
+          <w:sz w:val="20"/>
+          <w:szCs w:val="20"/>
+        </w:rPr>
+        <w:t>S</w:t>
+      </w:r>
+      <w:r>
+        <w:rPr>
+          <w:rFonts w:eastAsia="Arial" w:cs="Arial"/>
+          <w:color w:val="1A1A1A"/>
+          <w:sz w:val="20"/>
+          <w:szCs w:val="20"/>
+        </w:rPr>
+        <w:t>pecialist with 7+ years across healthcare, media, retail, EdTech and not-for-profit. I combine UX, Figma prototyping and hands-on front-end development with CMS, SEO, analytics and accessibility skills to build digital experiences that genuinely work for the people using them.</w:t>
       </w:r>
     </w:p>
     <w:p>
@@ -254,7 +278,7 @@
         <w:pStyle w:val="ListParagraph"/>
         <w:numPr>
           <w:ilvl w:val="0"/>
-          <w:numId w:val="7"/>
+          <w:numId w:val="6"/>
         </w:numPr>
         <w:spacing w:before="0" w:after="40"/>
         <w:rPr/>
@@ -274,7 +298,7 @@
         <w:pStyle w:val="ListParagraph"/>
         <w:numPr>
           <w:ilvl w:val="0"/>
-          <w:numId w:val="7"/>
+          <w:numId w:val="6"/>
         </w:numPr>
         <w:spacing w:before="0" w:after="40"/>
         <w:rPr/>
@@ -294,7 +318,7 @@
         <w:pStyle w:val="ListParagraph"/>
         <w:numPr>
           <w:ilvl w:val="0"/>
-          <w:numId w:val="7"/>
+          <w:numId w:val="6"/>
         </w:numPr>
         <w:spacing w:before="0" w:after="40"/>
         <w:rPr/>
@@ -314,7 +338,7 @@
         <w:pStyle w:val="ListParagraph"/>
         <w:numPr>
           <w:ilvl w:val="0"/>
-          <w:numId w:val="7"/>
+          <w:numId w:val="6"/>
         </w:numPr>
         <w:spacing w:before="0" w:after="40"/>
         <w:rPr/>
@@ -334,7 +358,7 @@
         <w:pStyle w:val="ListParagraph"/>
         <w:numPr>
           <w:ilvl w:val="0"/>
-          <w:numId w:val="7"/>
+          <w:numId w:val="6"/>
         </w:numPr>
         <w:spacing w:before="0" w:after="40"/>
         <w:rPr/>
@@ -354,7 +378,7 @@
         <w:pStyle w:val="ListParagraph"/>
         <w:numPr>
           <w:ilvl w:val="0"/>
-          <w:numId w:val="7"/>
+          <w:numId w:val="6"/>
         </w:numPr>
         <w:spacing w:before="0" w:after="40"/>
         <w:rPr/>
@@ -374,7 +398,7 @@
         <w:pStyle w:val="ListParagraph"/>
         <w:numPr>
           <w:ilvl w:val="0"/>
-          <w:numId w:val="7"/>
+          <w:numId w:val="6"/>
         </w:numPr>
         <w:bidi w:val="0"/>
         <w:spacing w:before="0" w:after="40"/>
@@ -395,7 +419,7 @@
         <w:pStyle w:val="ListParagraph"/>
         <w:numPr>
           <w:ilvl w:val="0"/>
-          <w:numId w:val="7"/>
+          <w:numId w:val="6"/>
         </w:numPr>
         <w:spacing w:before="0" w:after="40"/>
         <w:rPr/>
@@ -415,7 +439,7 @@
         <w:pStyle w:val="ListParagraph"/>
         <w:numPr>
           <w:ilvl w:val="0"/>
-          <w:numId w:val="7"/>
+          <w:numId w:val="6"/>
         </w:numPr>
         <w:spacing w:before="0" w:after="40"/>
         <w:rPr/>
@@ -435,7 +459,7 @@
         <w:pStyle w:val="ListParagraph"/>
         <w:numPr>
           <w:ilvl w:val="0"/>
-          <w:numId w:val="7"/>
+          <w:numId w:val="6"/>
         </w:numPr>
         <w:spacing w:before="0" w:after="40"/>
         <w:rPr/>
@@ -455,7 +479,7 @@
         <w:pStyle w:val="ListParagraph"/>
         <w:numPr>
           <w:ilvl w:val="0"/>
-          <w:numId w:val="7"/>
+          <w:numId w:val="6"/>
         </w:numPr>
         <w:spacing w:before="0" w:after="40"/>
         <w:rPr/>
@@ -493,7 +517,7 @@
         <w:pStyle w:val="ListParagraph"/>
         <w:numPr>
           <w:ilvl w:val="0"/>
-          <w:numId w:val="4"/>
+          <w:numId w:val="3"/>
         </w:numPr>
         <w:spacing w:before="0" w:after="40"/>
         <w:rPr/>
@@ -513,7 +537,7 @@
         <w:pStyle w:val="ListParagraph"/>
         <w:numPr>
           <w:ilvl w:val="0"/>
-          <w:numId w:val="4"/>
+          <w:numId w:val="3"/>
         </w:numPr>
         <w:spacing w:before="0" w:after="40"/>
         <w:rPr/>
@@ -533,7 +557,7 @@
         <w:pStyle w:val="ListParagraph"/>
         <w:numPr>
           <w:ilvl w:val="0"/>
-          <w:numId w:val="4"/>
+          <w:numId w:val="3"/>
         </w:numPr>
         <w:spacing w:before="0" w:after="40"/>
         <w:rPr/>
@@ -553,7 +577,7 @@
         <w:pStyle w:val="ListParagraph"/>
         <w:numPr>
           <w:ilvl w:val="0"/>
-          <w:numId w:val="4"/>
+          <w:numId w:val="3"/>
         </w:numPr>
         <w:spacing w:before="0" w:after="40"/>
         <w:rPr/>
@@ -573,7 +597,7 @@
         <w:pStyle w:val="ListParagraph"/>
         <w:numPr>
           <w:ilvl w:val="0"/>
-          <w:numId w:val="4"/>
+          <w:numId w:val="3"/>
         </w:numPr>
         <w:spacing w:before="0" w:after="40"/>
         <w:rPr/>
@@ -593,7 +617,7 @@
         <w:pStyle w:val="ListParagraph"/>
         <w:numPr>
           <w:ilvl w:val="0"/>
-          <w:numId w:val="4"/>
+          <w:numId w:val="3"/>
         </w:numPr>
         <w:spacing w:before="0" w:after="40"/>
         <w:rPr/>
@@ -613,7 +637,7 @@
         <w:pStyle w:val="ListParagraph"/>
         <w:numPr>
           <w:ilvl w:val="0"/>
-          <w:numId w:val="4"/>
+          <w:numId w:val="3"/>
         </w:numPr>
         <w:spacing w:before="0" w:after="40"/>
         <w:rPr/>
@@ -633,7 +657,7 @@
         <w:pStyle w:val="ListParagraph"/>
         <w:numPr>
           <w:ilvl w:val="0"/>
-          <w:numId w:val="4"/>
+          <w:numId w:val="3"/>
         </w:numPr>
         <w:spacing w:before="0" w:after="40"/>
         <w:rPr/>
@@ -653,7 +677,7 @@
         <w:pStyle w:val="ListParagraph"/>
         <w:numPr>
           <w:ilvl w:val="0"/>
-          <w:numId w:val="4"/>
+          <w:numId w:val="3"/>
         </w:numPr>
         <w:spacing w:before="0" w:after="40"/>
         <w:rPr/>
@@ -673,7 +697,7 @@
         <w:pStyle w:val="ListParagraph"/>
         <w:numPr>
           <w:ilvl w:val="0"/>
-          <w:numId w:val="4"/>
+          <w:numId w:val="3"/>
         </w:numPr>
         <w:spacing w:before="0" w:after="40"/>
         <w:rPr/>
@@ -693,7 +717,7 @@
         <w:pStyle w:val="ListParagraph"/>
         <w:numPr>
           <w:ilvl w:val="0"/>
-          <w:numId w:val="4"/>
+          <w:numId w:val="3"/>
         </w:numPr>
         <w:spacing w:before="0" w:after="40"/>
         <w:rPr/>
@@ -713,7 +737,7 @@
         <w:pStyle w:val="ListParagraph"/>
         <w:numPr>
           <w:ilvl w:val="0"/>
-          <w:numId w:val="4"/>
+          <w:numId w:val="3"/>
         </w:numPr>
         <w:spacing w:before="0" w:after="40"/>
         <w:rPr/>
@@ -751,7 +775,7 @@
         <w:pStyle w:val="ListParagraph"/>
         <w:numPr>
           <w:ilvl w:val="0"/>
-          <w:numId w:val="5"/>
+          <w:numId w:val="4"/>
         </w:numPr>
         <w:spacing w:before="0" w:after="40"/>
         <w:rPr/>
@@ -771,7 +795,7 @@
         <w:pStyle w:val="ListParagraph"/>
         <w:numPr>
           <w:ilvl w:val="0"/>
-          <w:numId w:val="5"/>
+          <w:numId w:val="4"/>
         </w:numPr>
         <w:spacing w:before="0" w:after="40"/>
         <w:rPr/>
@@ -791,7 +815,7 @@
         <w:pStyle w:val="ListParagraph"/>
         <w:numPr>
           <w:ilvl w:val="0"/>
-          <w:numId w:val="5"/>
+          <w:numId w:val="4"/>
         </w:numPr>
         <w:spacing w:before="0" w:after="40"/>
         <w:rPr/>
@@ -811,7 +835,7 @@
         <w:pStyle w:val="ListParagraph"/>
         <w:numPr>
           <w:ilvl w:val="0"/>
-          <w:numId w:val="5"/>
+          <w:numId w:val="4"/>
         </w:numPr>
         <w:spacing w:before="0" w:after="40"/>
         <w:rPr/>
@@ -831,7 +855,7 @@
         <w:pStyle w:val="ListParagraph"/>
         <w:numPr>
           <w:ilvl w:val="0"/>
-          <w:numId w:val="5"/>
+          <w:numId w:val="4"/>
         </w:numPr>
         <w:spacing w:before="0" w:after="40"/>
         <w:rPr/>
@@ -843,15 +867,15 @@
           <w:sz w:val="20"/>
           <w:szCs w:val="20"/>
         </w:rPr>
-        <w:t>API integration (Google Maps API, REST APIs)</w:t>
-      </w:r>
-    </w:p>
-    <w:p>
-      <w:pPr>
-        <w:pStyle w:val="ListParagraph"/>
-        <w:numPr>
-          <w:ilvl w:val="0"/>
-          <w:numId w:val="5"/>
+        <w:t>API integration (Google Maps API, REST APIs, Google Apps Script)</w:t>
+      </w:r>
+    </w:p>
+    <w:p>
+      <w:pPr>
+        <w:pStyle w:val="ListParagraph"/>
+        <w:numPr>
+          <w:ilvl w:val="0"/>
+          <w:numId w:val="4"/>
         </w:numPr>
         <w:spacing w:before="0" w:after="40"/>
         <w:rPr/>
@@ -861,6 +885,15 @@
           <w:color w:val="000000"/>
         </w:rPr>
         <w:t>Balsamiq, Postman, Monday.com</w:t>
+      </w:r>
+      <w:r>
+        <w:rPr>
+          <w:color w:val="000000"/>
+        </w:rPr>
+        <w:t>s</w:t>
+      </w:r>
+      <w:r>
+        <w:br w:type="page"/>
       </w:r>
     </w:p>
     <w:p>
@@ -870,9 +903,6 @@
           <w:bottom w:val="single" w:sz="6" w:space="1" w:color="1F4E79"/>
         </w:pBdr>
         <w:spacing w:before="240" w:after="80"/>
-        <w:rPr/>
-      </w:pPr>
-      <w:r>
         <w:rPr>
           <w:rFonts w:eastAsia="Arial" w:cs="Arial"/>
           <w:b/>
@@ -881,6 +911,16 @@
           <w:sz w:val="24"/>
           <w:szCs w:val="24"/>
         </w:rPr>
+      </w:pPr>
+      <w:r>
+        <w:rPr>
+          <w:rFonts w:eastAsia="Arial" w:cs="Arial"/>
+          <w:b/>
+          <w:bCs/>
+          <w:color w:val="1F4E79"/>
+          <w:sz w:val="24"/>
+          <w:szCs w:val="24"/>
+        </w:rPr>
         <w:t>PROFESSIONAL EXPERIENCE</w:t>
       </w:r>
     </w:p>
@@ -943,7 +983,7 @@
         <w:pStyle w:val="ListParagraph"/>
         <w:numPr>
           <w:ilvl w:val="0"/>
-          <w:numId w:val="2"/>
+          <w:numId w:val="1"/>
         </w:numPr>
         <w:bidi w:val="0"/>
         <w:spacing w:before="40" w:after="40"/>
@@ -969,7 +1009,7 @@
         <w:pStyle w:val="ListParagraph"/>
         <w:numPr>
           <w:ilvl w:val="1"/>
-          <w:numId w:val="3"/>
+          <w:numId w:val="2"/>
         </w:numPr>
         <w:bidi w:val="0"/>
         <w:spacing w:before="40" w:after="40"/>
@@ -987,25 +1027,7 @@
           <w:sz w:val="20"/>
           <w:szCs w:val="20"/>
         </w:rPr>
-        <w:t xml:space="preserve">Applied human-centred design and GA4 A/B testing to redesign a high-traffic costs and pricing page </w:t>
-      </w:r>
-      <w:r>
-        <w:rPr>
-          <w:rFonts w:eastAsia="Arial" w:cs="Arial"/>
-          <w:color w:val="1A1A1A"/>
-          <w:sz w:val="20"/>
-          <w:szCs w:val="20"/>
-        </w:rPr>
-        <w:t>that suffered from</w:t>
-      </w:r>
-      <w:r>
-        <w:rPr>
-          <w:rFonts w:eastAsia="Arial" w:cs="Arial"/>
-          <w:color w:val="1A1A1A"/>
-          <w:sz w:val="20"/>
-          <w:szCs w:val="20"/>
-        </w:rPr>
-        <w:t xml:space="preserve"> scroll fatigue (</w:t>
+        <w:t>Applied human-centred design and GA4 A/B testing to redesign a high-traffic costs page that suffered from scroll fatigue (</w:t>
       </w:r>
       <w:hyperlink r:id="rId4">
         <w:r>
@@ -1026,7 +1048,34 @@
           <w:sz w:val="20"/>
           <w:szCs w:val="20"/>
         </w:rPr>
-        <w:t xml:space="preserve">). One of the improved variations is at </w:t>
+        <w:t xml:space="preserve">). One of the improved variations </w:t>
+      </w:r>
+      <w:r>
+        <w:rPr>
+          <w:rFonts w:eastAsia="Arial" w:cs="Arial"/>
+          <w:color w:val="1A1A1A"/>
+          <w:sz w:val="20"/>
+          <w:szCs w:val="20"/>
+        </w:rPr>
+        <w:t>t</w:t>
+      </w:r>
+      <w:r>
+        <w:rPr>
+          <w:rFonts w:eastAsia="Arial" w:cs="Arial"/>
+          <w:color w:val="1A1A1A"/>
+          <w:sz w:val="20"/>
+          <w:szCs w:val="20"/>
+        </w:rPr>
+        <w:t xml:space="preserve">hat has the exact same content </w:t>
+      </w:r>
+      <w:r>
+        <w:rPr>
+          <w:rFonts w:eastAsia="Arial" w:cs="Arial"/>
+          <w:color w:val="1A1A1A"/>
+          <w:sz w:val="20"/>
+          <w:szCs w:val="20"/>
+        </w:rPr>
+        <w:t xml:space="preserve">is at </w:t>
       </w:r>
       <w:r>
         <w:rPr>
@@ -1036,15 +1085,6 @@
           <w:szCs w:val="20"/>
         </w:rPr>
         <w:t>(</w:t>
-      </w:r>
-      <w:r>
-        <w:rPr>
-          <w:rStyle w:val="Hyperlink"/>
-          <w:rFonts w:eastAsia="Arial" w:cs="Arial"/>
-          <w:sz w:val="20"/>
-          <w:szCs w:val="20"/>
-        </w:rPr>
-        <w:t>h</w:t>
       </w:r>
       <w:hyperlink r:id="rId5">
         <w:r>
@@ -1054,7 +1094,7 @@
             <w:sz w:val="20"/>
             <w:szCs w:val="20"/>
           </w:rPr>
-          <w:t>ttps://dev.msiaustralia.org.au/costs-and-prices-button-tabs/</w:t>
+          <w:t>https://dev.msiaustralia.org.au/costs-and-prices-button-tabs/</w:t>
         </w:r>
       </w:hyperlink>
       <w:r>
@@ -1072,7 +1112,7 @@
         <w:pStyle w:val="ListParagraph"/>
         <w:numPr>
           <w:ilvl w:val="1"/>
-          <w:numId w:val="3"/>
+          <w:numId w:val="2"/>
         </w:numPr>
         <w:bidi w:val="0"/>
         <w:spacing w:before="40" w:after="40"/>
@@ -1133,7 +1173,7 @@
           <w:sz w:val="20"/>
           <w:szCs w:val="20"/>
         </w:rPr>
-        <w:t>)</w:t>
+        <w:t>).</w:t>
       </w:r>
     </w:p>
     <w:p>
@@ -1141,7 +1181,7 @@
         <w:pStyle w:val="ListParagraph"/>
         <w:numPr>
           <w:ilvl w:val="1"/>
-          <w:numId w:val="3"/>
+          <w:numId w:val="2"/>
         </w:numPr>
         <w:bidi w:val="0"/>
         <w:spacing w:before="40" w:after="40"/>
@@ -1182,7 +1222,7 @@
         <w:pStyle w:val="ListParagraph"/>
         <w:numPr>
           <w:ilvl w:val="1"/>
-          <w:numId w:val="3"/>
+          <w:numId w:val="2"/>
         </w:numPr>
         <w:bidi w:val="0"/>
         <w:spacing w:before="40" w:after="40"/>
@@ -1251,7 +1291,7 @@
         <w:pStyle w:val="ListParagraph"/>
         <w:numPr>
           <w:ilvl w:val="1"/>
-          <w:numId w:val="3"/>
+          <w:numId w:val="2"/>
         </w:numPr>
         <w:bidi w:val="0"/>
         <w:spacing w:before="40" w:after="40"/>
@@ -1272,7 +1312,7 @@
       <w:r>
         <w:rPr>
           <w:rStyle w:val="Style3"/>
-          <w:rFonts w:eastAsia="Arial" w:cs="Arial" w:ascii="Arial" w:hAnsi="Arial"/>
+          <w:rFonts w:eastAsia="Arial" w:cs="Arial"/>
           <w:color w:val="1155CC"/>
           <w:sz w:val="20"/>
           <w:szCs w:val="20"/>
@@ -1283,7 +1323,7 @@
       <w:r>
         <w:rPr>
           <w:rStyle w:val="Style3"/>
-          <w:rFonts w:eastAsia="Arial" w:cs="Arial" w:ascii="Arial" w:hAnsi="Arial"/>
+          <w:rFonts w:eastAsia="Arial" w:cs="Arial"/>
           <w:color w:val="1155CC"/>
           <w:sz w:val="20"/>
           <w:szCs w:val="20"/>
@@ -1294,7 +1334,7 @@
       <w:r>
         <w:rPr>
           <w:rStyle w:val="Style3"/>
-          <w:rFonts w:eastAsia="Arial" w:cs="Arial" w:ascii="Arial" w:hAnsi="Arial"/>
+          <w:rFonts w:eastAsia="Arial" w:cs="Arial"/>
           <w:color w:val="1155CC"/>
           <w:sz w:val="20"/>
           <w:szCs w:val="20"/>
@@ -1305,7 +1345,7 @@
       <w:r>
         <w:rPr>
           <w:rStyle w:val="Style3"/>
-          <w:rFonts w:eastAsia="Arial" w:cs="Arial" w:ascii="Arial" w:hAnsi="Arial"/>
+          <w:rFonts w:eastAsia="Arial" w:cs="Arial"/>
           <w:color w:val="1155CC"/>
           <w:sz w:val="20"/>
           <w:szCs w:val="20"/>
@@ -1320,7 +1360,7 @@
           <w:sz w:val="20"/>
           <w:szCs w:val="20"/>
         </w:rPr>
-        <w:t>)</w:t>
+        <w:t>).</w:t>
       </w:r>
     </w:p>
     <w:p>
@@ -1328,7 +1368,7 @@
         <w:pStyle w:val="ListParagraph"/>
         <w:numPr>
           <w:ilvl w:val="1"/>
-          <w:numId w:val="3"/>
+          <w:numId w:val="2"/>
         </w:numPr>
         <w:bidi w:val="0"/>
         <w:spacing w:before="40" w:after="40"/>
@@ -1343,243 +1383,56 @@
           <w:szCs w:val="20"/>
           <w:u w:val="none"/>
         </w:rPr>
-        <w:t>C</w:t>
+        <w:t>Compressed long page content into a Quick Guide and included a nice flowing animated interface, to improve user engagement (</w:t>
+      </w:r>
+      <w:r>
+        <w:fldChar w:fldCharType="begin"/>
       </w:r>
       <w:r>
         <w:rPr>
           <w:rStyle w:val="Hyperlink"/>
           <w:rFonts w:eastAsia="Arial" w:cs="Arial"/>
+          <w:sz w:val="20"/>
+          <w:szCs w:val="20"/>
+        </w:rPr>
+        <w:instrText xml:space="preserve"> HYPERLINK "https://www.vasectomy.org.au/faqs/vasectomy-your-comprehensive-guide/" \l "quickguide"</w:instrText>
+      </w:r>
+      <w:r>
+        <w:rPr>
+          <w:rStyle w:val="Hyperlink"/>
+          <w:rFonts w:eastAsia="Arial" w:cs="Arial"/>
+          <w:sz w:val="20"/>
+          <w:szCs w:val="20"/>
+        </w:rPr>
+        <w:fldChar w:fldCharType="separate"/>
+      </w:r>
+      <w:r>
+        <w:rPr>
+          <w:rStyle w:val="Hyperlink"/>
+          <w:rFonts w:eastAsia="Arial" w:cs="Arial"/>
+          <w:sz w:val="20"/>
+          <w:szCs w:val="20"/>
+        </w:rPr>
+        <w:t>https://www.vasectomy.org.au/faqs/vasectomy-your-comprehensive-guide/#quickguide</w:t>
+      </w:r>
+      <w:r>
+        <w:rPr>
+          <w:rStyle w:val="Hyperlink"/>
+          <w:rFonts w:eastAsia="Arial" w:cs="Arial"/>
+          <w:sz w:val="20"/>
+          <w:szCs w:val="20"/>
+        </w:rPr>
+        <w:fldChar w:fldCharType="end"/>
+      </w:r>
+      <w:r>
+        <w:rPr>
+          <w:rStyle w:val="Hyperlink"/>
+          <w:rFonts w:eastAsia="Arial" w:cs="Arial"/>
           <w:color w:val="1A1A1A"/>
           <w:sz w:val="20"/>
           <w:szCs w:val="20"/>
           <w:u w:val="none"/>
         </w:rPr>
-        <w:t>o</w:t>
-      </w:r>
-      <w:r>
-        <w:rPr>
-          <w:rStyle w:val="Hyperlink"/>
-          <w:rFonts w:eastAsia="Arial" w:cs="Arial"/>
-          <w:color w:val="1A1A1A"/>
-          <w:sz w:val="20"/>
-          <w:szCs w:val="20"/>
-          <w:u w:val="none"/>
-        </w:rPr>
-        <w:t>m</w:t>
-      </w:r>
-      <w:r>
-        <w:rPr>
-          <w:rStyle w:val="Hyperlink"/>
-          <w:rFonts w:eastAsia="Arial" w:cs="Arial"/>
-          <w:color w:val="1A1A1A"/>
-          <w:sz w:val="20"/>
-          <w:szCs w:val="20"/>
-          <w:u w:val="none"/>
-        </w:rPr>
-        <w:t>pressed</w:t>
-      </w:r>
-      <w:r>
-        <w:rPr>
-          <w:rStyle w:val="Hyperlink"/>
-          <w:rFonts w:eastAsia="Arial" w:cs="Arial"/>
-          <w:color w:val="1A1A1A"/>
-          <w:sz w:val="20"/>
-          <w:szCs w:val="20"/>
-          <w:u w:val="none"/>
-        </w:rPr>
-        <w:t xml:space="preserve"> long </w:t>
-      </w:r>
-      <w:r>
-        <w:rPr>
-          <w:rStyle w:val="Hyperlink"/>
-          <w:rFonts w:eastAsia="Arial" w:cs="Arial"/>
-          <w:color w:val="1A1A1A"/>
-          <w:sz w:val="20"/>
-          <w:szCs w:val="20"/>
-          <w:u w:val="none"/>
-        </w:rPr>
-        <w:t>p</w:t>
-      </w:r>
-      <w:r>
-        <w:rPr>
-          <w:rStyle w:val="Hyperlink"/>
-          <w:rFonts w:eastAsia="Arial" w:cs="Arial"/>
-          <w:color w:val="1A1A1A"/>
-          <w:sz w:val="20"/>
-          <w:szCs w:val="20"/>
-          <w:u w:val="none"/>
-        </w:rPr>
-        <w:t>a</w:t>
-      </w:r>
-      <w:r>
-        <w:rPr>
-          <w:rStyle w:val="Hyperlink"/>
-          <w:rFonts w:eastAsia="Arial" w:cs="Arial"/>
-          <w:color w:val="1A1A1A"/>
-          <w:sz w:val="20"/>
-          <w:szCs w:val="20"/>
-          <w:u w:val="none"/>
-        </w:rPr>
-        <w:t xml:space="preserve">ge </w:t>
-      </w:r>
-      <w:r>
-        <w:rPr>
-          <w:rStyle w:val="Hyperlink"/>
-          <w:rFonts w:eastAsia="Arial" w:cs="Arial"/>
-          <w:color w:val="1A1A1A"/>
-          <w:sz w:val="20"/>
-          <w:szCs w:val="20"/>
-          <w:u w:val="none"/>
-        </w:rPr>
-        <w:t xml:space="preserve">content into a Quick Guide and </w:t>
-      </w:r>
-      <w:r>
-        <w:rPr>
-          <w:rStyle w:val="Hyperlink"/>
-          <w:rFonts w:eastAsia="Arial" w:cs="Arial"/>
-          <w:color w:val="1A1A1A"/>
-          <w:sz w:val="20"/>
-          <w:szCs w:val="20"/>
-          <w:u w:val="none"/>
-        </w:rPr>
-        <w:t>i</w:t>
-      </w:r>
-      <w:r>
-        <w:rPr>
-          <w:rStyle w:val="Hyperlink"/>
-          <w:rFonts w:eastAsia="Arial" w:cs="Arial"/>
-          <w:color w:val="1A1A1A"/>
-          <w:sz w:val="20"/>
-          <w:szCs w:val="20"/>
-          <w:u w:val="none"/>
-        </w:rPr>
-        <w:t>n</w:t>
-      </w:r>
-      <w:r>
-        <w:rPr>
-          <w:rStyle w:val="Hyperlink"/>
-          <w:rFonts w:eastAsia="Arial" w:cs="Arial"/>
-          <w:color w:val="1A1A1A"/>
-          <w:sz w:val="20"/>
-          <w:szCs w:val="20"/>
-          <w:u w:val="none"/>
-        </w:rPr>
-        <w:t>cluded</w:t>
-      </w:r>
-      <w:r>
-        <w:rPr>
-          <w:rStyle w:val="Hyperlink"/>
-          <w:rFonts w:eastAsia="Arial" w:cs="Arial"/>
-          <w:color w:val="1A1A1A"/>
-          <w:sz w:val="20"/>
-          <w:szCs w:val="20"/>
-          <w:u w:val="none"/>
-        </w:rPr>
-        <w:t xml:space="preserve"> a</w:t>
-      </w:r>
-      <w:r>
-        <w:rPr>
-          <w:rStyle w:val="Hyperlink"/>
-          <w:rFonts w:eastAsia="Arial" w:cs="Arial"/>
-          <w:color w:val="1A1A1A"/>
-          <w:sz w:val="20"/>
-          <w:szCs w:val="20"/>
-          <w:u w:val="none"/>
-        </w:rPr>
-        <w:t xml:space="preserve"> </w:t>
-      </w:r>
-      <w:r>
-        <w:rPr>
-          <w:rStyle w:val="Hyperlink"/>
-          <w:rFonts w:eastAsia="Arial" w:cs="Arial"/>
-          <w:color w:val="1A1A1A"/>
-          <w:sz w:val="20"/>
-          <w:szCs w:val="20"/>
-          <w:u w:val="none"/>
-        </w:rPr>
-        <w:t>n</w:t>
-      </w:r>
-      <w:r>
-        <w:rPr>
-          <w:rStyle w:val="Hyperlink"/>
-          <w:rFonts w:eastAsia="Arial" w:cs="Arial"/>
-          <w:color w:val="1A1A1A"/>
-          <w:sz w:val="20"/>
-          <w:szCs w:val="20"/>
-          <w:u w:val="none"/>
-        </w:rPr>
-        <w:t>ice</w:t>
-      </w:r>
-      <w:r>
-        <w:rPr>
-          <w:rStyle w:val="Hyperlink"/>
-          <w:rFonts w:eastAsia="Arial" w:cs="Arial"/>
-          <w:color w:val="1A1A1A"/>
-          <w:sz w:val="20"/>
-          <w:szCs w:val="20"/>
-          <w:u w:val="none"/>
-        </w:rPr>
-        <w:t xml:space="preserve"> flowing animated interface, to improve user engagement </w:t>
-      </w:r>
-      <w:r>
-        <w:rPr>
-          <w:rStyle w:val="Hyperlink"/>
-          <w:rFonts w:eastAsia="Arial" w:cs="Arial"/>
-          <w:color w:val="1A1A1A"/>
-          <w:sz w:val="20"/>
-          <w:szCs w:val="20"/>
-          <w:u w:val="none"/>
-        </w:rPr>
-        <w:t>(</w:t>
-      </w:r>
-      <w:r>
-        <w:fldChar w:fldCharType="begin"/>
-      </w:r>
-      <w:r>
-        <w:rPr>
-          <w:rStyle w:val="Hyperlink"/>
-          <w:rFonts w:eastAsia="Arial" w:cs="Arial"/>
-          <w:sz w:val="20"/>
-          <w:szCs w:val="20"/>
-        </w:rPr>
-        <w:instrText xml:space="preserve"> HYPERLINK "https://www.vasectomy.org.au/faqs/vasectomy-your-comprehensive-guide/" \l "quickguide"</w:instrText>
-      </w:r>
-      <w:r>
-        <w:rPr>
-          <w:rStyle w:val="Hyperlink"/>
-          <w:rFonts w:eastAsia="Arial" w:cs="Arial"/>
-          <w:sz w:val="20"/>
-          <w:szCs w:val="20"/>
-        </w:rPr>
-        <w:fldChar w:fldCharType="separate"/>
-      </w:r>
-      <w:r>
-        <w:rPr>
-          <w:rStyle w:val="Hyperlink"/>
-          <w:rFonts w:eastAsia="Arial" w:cs="Arial"/>
-          <w:sz w:val="20"/>
-          <w:szCs w:val="20"/>
-        </w:rPr>
-        <w:t>https://www.vasectomy.org.au/faqs/vasectomy-your-comprehensive-guide/#quickguide</w:t>
-      </w:r>
-      <w:r>
-        <w:rPr>
-          <w:rStyle w:val="Hyperlink"/>
-          <w:rFonts w:eastAsia="Arial" w:cs="Arial"/>
-          <w:sz w:val="20"/>
-          <w:szCs w:val="20"/>
-        </w:rPr>
-        <w:fldChar w:fldCharType="end"/>
-      </w:r>
-      <w:r>
-        <w:rPr>
-          <w:rStyle w:val="Hyperlink"/>
-          <w:rFonts w:eastAsia="Arial" w:cs="Arial"/>
-          <w:color w:val="1A1A1A"/>
-          <w:sz w:val="20"/>
-          <w:szCs w:val="20"/>
-          <w:u w:val="none"/>
-        </w:rPr>
         <w:t>)</w:t>
       </w:r>
     </w:p>
@@ -1588,7 +1441,7 @@
         <w:pStyle w:val="ListParagraph"/>
         <w:numPr>
           <w:ilvl w:val="1"/>
-          <w:numId w:val="3"/>
+          <w:numId w:val="2"/>
         </w:numPr>
         <w:bidi w:val="0"/>
         <w:spacing w:before="40" w:after="40"/>
@@ -1633,7 +1486,7 @@
         <w:pStyle w:val="ListParagraph"/>
         <w:numPr>
           <w:ilvl w:val="1"/>
-          <w:numId w:val="3"/>
+          <w:numId w:val="2"/>
         </w:numPr>
         <w:bidi w:val="0"/>
         <w:spacing w:before="40" w:after="40"/>
@@ -1670,29 +1523,7 @@
           <w:szCs w:val="20"/>
           <w:u w:val="none"/>
         </w:rPr>
-        <w:t xml:space="preserve">) and the updated </w:t>
-      </w:r>
-      <w:r>
-        <w:rPr>
-          <w:rStyle w:val="Hyperlink"/>
-          <w:rFonts w:eastAsia="Arial" w:cs="Arial"/>
-          <w:color w:val="1A1A1A"/>
-          <w:sz w:val="20"/>
-          <w:szCs w:val="20"/>
-          <w:u w:val="none"/>
-        </w:rPr>
-        <w:t xml:space="preserve">current live </w:t>
-      </w:r>
-      <w:r>
-        <w:rPr>
-          <w:rStyle w:val="Hyperlink"/>
-          <w:rFonts w:eastAsia="Arial" w:cs="Arial"/>
-          <w:color w:val="1A1A1A"/>
-          <w:sz w:val="20"/>
-          <w:szCs w:val="20"/>
-          <w:u w:val="none"/>
-        </w:rPr>
-        <w:t>version is here (</w:t>
+        <w:t>) and the updated current live version is here (</w:t>
       </w:r>
       <w:hyperlink r:id="rId9">
         <w:r>
@@ -1714,15 +1545,15 @@
           <w:szCs w:val="20"/>
           <w:u w:val="none"/>
         </w:rPr>
-        <w:t xml:space="preserve">) </w:t>
-      </w:r>
-    </w:p>
-    <w:p>
-      <w:pPr>
-        <w:pStyle w:val="ListParagraph"/>
-        <w:numPr>
-          <w:ilvl w:val="0"/>
-          <w:numId w:val="2"/>
+        <w:t>).</w:t>
+      </w:r>
+    </w:p>
+    <w:p>
+      <w:pPr>
+        <w:pStyle w:val="ListParagraph"/>
+        <w:numPr>
+          <w:ilvl w:val="0"/>
+          <w:numId w:val="1"/>
         </w:numPr>
         <w:spacing w:before="40" w:after="40"/>
         <w:rPr/>
@@ -1742,7 +1573,7 @@
         <w:pStyle w:val="ListParagraph"/>
         <w:numPr>
           <w:ilvl w:val="0"/>
-          <w:numId w:val="2"/>
+          <w:numId w:val="1"/>
         </w:numPr>
         <w:spacing w:before="40" w:after="40"/>
         <w:rPr/>
@@ -1762,7 +1593,7 @@
         <w:pStyle w:val="ListParagraph"/>
         <w:numPr>
           <w:ilvl w:val="0"/>
-          <w:numId w:val="2"/>
+          <w:numId w:val="1"/>
         </w:numPr>
         <w:spacing w:before="40" w:after="40"/>
         <w:rPr/>
@@ -1782,7 +1613,7 @@
         <w:pStyle w:val="ListParagraph"/>
         <w:numPr>
           <w:ilvl w:val="0"/>
-          <w:numId w:val="2"/>
+          <w:numId w:val="1"/>
         </w:numPr>
         <w:spacing w:before="40" w:after="40"/>
         <w:rPr/>
@@ -1856,7 +1687,7 @@
         <w:pStyle w:val="ListParagraph"/>
         <w:numPr>
           <w:ilvl w:val="0"/>
-          <w:numId w:val="2"/>
+          <w:numId w:val="1"/>
         </w:numPr>
         <w:spacing w:before="40" w:after="40"/>
         <w:rPr/>
@@ -1876,7 +1707,7 @@
         <w:pStyle w:val="ListParagraph"/>
         <w:numPr>
           <w:ilvl w:val="0"/>
-          <w:numId w:val="2"/>
+          <w:numId w:val="1"/>
         </w:numPr>
         <w:spacing w:before="40" w:after="40"/>
         <w:rPr/>
@@ -1896,7 +1727,7 @@
         <w:pStyle w:val="ListParagraph"/>
         <w:numPr>
           <w:ilvl w:val="0"/>
-          <w:numId w:val="2"/>
+          <w:numId w:val="1"/>
         </w:numPr>
         <w:spacing w:before="40" w:after="40"/>
         <w:rPr/>
@@ -1968,7 +1799,7 @@
         <w:pStyle w:val="ListParagraph"/>
         <w:numPr>
           <w:ilvl w:val="0"/>
-          <w:numId w:val="2"/>
+          <w:numId w:val="1"/>
         </w:numPr>
         <w:spacing w:before="40" w:after="40"/>
         <w:rPr>
@@ -1993,7 +1824,7 @@
         <w:pStyle w:val="ListParagraph"/>
         <w:numPr>
           <w:ilvl w:val="0"/>
-          <w:numId w:val="2"/>
+          <w:numId w:val="1"/>
         </w:numPr>
         <w:spacing w:before="40" w:after="40"/>
         <w:rPr/>
@@ -2005,115 +1836,7 @@
           <w:sz w:val="20"/>
           <w:szCs w:val="20"/>
         </w:rPr>
-        <w:t>Design</w:t>
-      </w:r>
-      <w:r>
-        <w:rPr>
-          <w:rFonts w:eastAsia="Arial" w:cs="Arial"/>
-          <w:color w:val="1A1A1A"/>
-          <w:sz w:val="20"/>
-          <w:szCs w:val="20"/>
-        </w:rPr>
-        <w:t>e</w:t>
-      </w:r>
-      <w:r>
-        <w:rPr>
-          <w:rFonts w:eastAsia="Arial" w:cs="Arial"/>
-          <w:color w:val="1A1A1A"/>
-          <w:sz w:val="20"/>
-          <w:szCs w:val="20"/>
-        </w:rPr>
-        <w:t>d</w:t>
-      </w:r>
-      <w:r>
-        <w:rPr>
-          <w:rFonts w:eastAsia="Arial" w:cs="Arial"/>
-          <w:color w:val="1A1A1A"/>
-          <w:sz w:val="20"/>
-          <w:szCs w:val="20"/>
-        </w:rPr>
-        <w:t xml:space="preserve"> and contribut</w:t>
-      </w:r>
-      <w:r>
-        <w:rPr>
-          <w:rFonts w:eastAsia="Arial" w:cs="Arial"/>
-          <w:color w:val="1A1A1A"/>
-          <w:sz w:val="20"/>
-          <w:szCs w:val="20"/>
-        </w:rPr>
-        <w:t>e</w:t>
-      </w:r>
-      <w:r>
-        <w:rPr>
-          <w:rFonts w:eastAsia="Arial" w:cs="Arial"/>
-          <w:color w:val="1A1A1A"/>
-          <w:sz w:val="20"/>
-          <w:szCs w:val="20"/>
-        </w:rPr>
-        <w:t>d</w:t>
-      </w:r>
-      <w:r>
-        <w:rPr>
-          <w:rFonts w:eastAsia="Arial" w:cs="Arial"/>
-          <w:color w:val="1A1A1A"/>
-          <w:sz w:val="20"/>
-          <w:szCs w:val="20"/>
-        </w:rPr>
-        <w:t xml:space="preserve"> to </w:t>
-      </w:r>
-      <w:r>
-        <w:rPr>
-          <w:rFonts w:eastAsia="Arial" w:cs="Arial"/>
-          <w:color w:val="1A1A1A"/>
-          <w:sz w:val="20"/>
-          <w:szCs w:val="20"/>
-        </w:rPr>
-        <w:t>t</w:t>
-      </w:r>
-      <w:r>
-        <w:rPr>
-          <w:rFonts w:eastAsia="Arial" w:cs="Arial"/>
-          <w:color w:val="1A1A1A"/>
-          <w:sz w:val="20"/>
-          <w:szCs w:val="20"/>
-        </w:rPr>
-        <w:t xml:space="preserve">he </w:t>
-      </w:r>
-      <w:r>
-        <w:rPr>
-          <w:rFonts w:eastAsia="Arial" w:cs="Arial"/>
-          <w:color w:val="1A1A1A"/>
-          <w:sz w:val="20"/>
-          <w:szCs w:val="20"/>
-        </w:rPr>
-        <w:t xml:space="preserve">building </w:t>
-      </w:r>
-      <w:r>
-        <w:rPr>
-          <w:rFonts w:eastAsia="Arial" w:cs="Arial"/>
-          <w:color w:val="1A1A1A"/>
-          <w:sz w:val="20"/>
-          <w:szCs w:val="20"/>
-        </w:rPr>
-        <w:t>o</w:t>
-      </w:r>
-      <w:r>
-        <w:rPr>
-          <w:rFonts w:eastAsia="Arial" w:cs="Arial"/>
-          <w:color w:val="1A1A1A"/>
-          <w:sz w:val="20"/>
-          <w:szCs w:val="20"/>
-        </w:rPr>
-        <w:t xml:space="preserve">f an </w:t>
-      </w:r>
-      <w:r>
-        <w:rPr>
-          <w:rFonts w:eastAsia="Arial" w:cs="Arial"/>
-          <w:color w:val="1A1A1A"/>
-          <w:sz w:val="20"/>
-          <w:szCs w:val="20"/>
-        </w:rPr>
-        <w:t xml:space="preserve">org wide intranet in </w:t>
+        <w:t xml:space="preserve">Designed and contributed to the building of an org wide intranet in </w:t>
       </w:r>
       <w:r>
         <w:rPr>
@@ -2139,7 +1862,7 @@
         <w:pStyle w:val="ListParagraph"/>
         <w:numPr>
           <w:ilvl w:val="0"/>
-          <w:numId w:val="2"/>
+          <w:numId w:val="1"/>
         </w:numPr>
         <w:spacing w:before="40" w:after="40"/>
         <w:rPr/>
@@ -2159,7 +1882,7 @@
         <w:pStyle w:val="ListParagraph"/>
         <w:numPr>
           <w:ilvl w:val="0"/>
-          <w:numId w:val="2"/>
+          <w:numId w:val="1"/>
         </w:numPr>
         <w:spacing w:before="40" w:after="40"/>
         <w:rPr/>
@@ -2233,7 +1956,7 @@
         <w:pStyle w:val="ListParagraph"/>
         <w:numPr>
           <w:ilvl w:val="0"/>
-          <w:numId w:val="2"/>
+          <w:numId w:val="1"/>
         </w:numPr>
         <w:spacing w:before="40" w:after="40"/>
         <w:rPr/>
@@ -2301,7 +2024,7 @@
         <w:pStyle w:val="ListParagraph"/>
         <w:numPr>
           <w:ilvl w:val="0"/>
-          <w:numId w:val="2"/>
+          <w:numId w:val="1"/>
         </w:numPr>
         <w:spacing w:before="40" w:after="40"/>
         <w:rPr/>
@@ -2359,7 +2082,7 @@
         <w:pStyle w:val="ListParagraph"/>
         <w:numPr>
           <w:ilvl w:val="0"/>
-          <w:numId w:val="2"/>
+          <w:numId w:val="1"/>
         </w:numPr>
         <w:spacing w:before="40" w:after="40"/>
         <w:rPr/>
@@ -2379,7 +2102,7 @@
         <w:pStyle w:val="ListParagraph"/>
         <w:numPr>
           <w:ilvl w:val="0"/>
-          <w:numId w:val="2"/>
+          <w:numId w:val="1"/>
         </w:numPr>
         <w:spacing w:before="40" w:after="40"/>
         <w:rPr/>
@@ -2437,7 +2160,7 @@
         <w:pStyle w:val="ListParagraph"/>
         <w:numPr>
           <w:ilvl w:val="0"/>
-          <w:numId w:val="2"/>
+          <w:numId w:val="1"/>
         </w:numPr>
         <w:spacing w:before="40" w:after="40"/>
         <w:rPr/>
@@ -2457,7 +2180,7 @@
         <w:pStyle w:val="ListParagraph"/>
         <w:numPr>
           <w:ilvl w:val="0"/>
-          <w:numId w:val="2"/>
+          <w:numId w:val="1"/>
         </w:numPr>
         <w:spacing w:before="40" w:after="40"/>
         <w:rPr/>
@@ -2477,7 +2200,7 @@
         <w:pStyle w:val="ListParagraph"/>
         <w:numPr>
           <w:ilvl w:val="0"/>
-          <w:numId w:val="2"/>
+          <w:numId w:val="1"/>
         </w:numPr>
         <w:spacing w:before="40" w:after="40"/>
         <w:rPr/>
@@ -2497,7 +2220,7 @@
         <w:pStyle w:val="ListParagraph"/>
         <w:numPr>
           <w:ilvl w:val="0"/>
-          <w:numId w:val="2"/>
+          <w:numId w:val="1"/>
         </w:numPr>
         <w:spacing w:before="40" w:after="40"/>
         <w:rPr/>
@@ -2510,30 +2233,6 @@
           <w:szCs w:val="20"/>
         </w:rPr>
         <w:t>Salesforce: Built personalised campaign content for Bank of Melbourne, including EDM and SMS sends for Westpac.</w:t>
-      </w:r>
-    </w:p>
-    <w:p>
-      <w:pPr>
-        <w:pStyle w:val="Normal"/>
-        <w:spacing w:before="80" w:after="0"/>
-        <w:rPr>
-          <w:rFonts w:eastAsia="Arial" w:cs="Arial"/>
-          <w:i/>
-          <w:iCs/>
-          <w:color w:val="1A1A1A"/>
-          <w:sz w:val="20"/>
-          <w:szCs w:val="20"/>
-        </w:rPr>
-      </w:pPr>
-      <w:r>
-        <w:rPr>
-          <w:rFonts w:eastAsia="Arial" w:cs="Arial"/>
-          <w:i/>
-          <w:iCs/>
-          <w:color w:val="1A1A1A"/>
-          <w:sz w:val="20"/>
-          <w:szCs w:val="20"/>
-        </w:rPr>
       </w:r>
     </w:p>
     <w:p>
@@ -2731,23 +2430,148 @@
           <w:sz w:val="24"/>
           <w:szCs w:val="24"/>
         </w:rPr>
-        <w:t>VOLUNTEERING</w:t>
-      </w:r>
-    </w:p>
-    <w:p>
-      <w:pPr>
-        <w:pStyle w:val="Normal"/>
-        <w:spacing w:before="0" w:after="80"/>
-        <w:rPr/>
-      </w:pPr>
-      <w:r>
-        <w:rPr>
-          <w:rFonts w:eastAsia="Arial" w:cs="Arial"/>
-          <w:color w:val="1A1A1A"/>
-          <w:sz w:val="20"/>
-          <w:szCs w:val="20"/>
-        </w:rPr>
-        <w:t>Robyn's Nest Animal Rescue, Asylum Seekers Resource Centre (ASRC), Sudanese Australian Integrated Learning (SAIL), Melbourne Open House</w:t>
+        <w:t>SIDE PROJECTS</w:t>
+      </w:r>
+    </w:p>
+    <w:p>
+      <w:pPr>
+        <w:pStyle w:val="ListParagraph"/>
+        <w:numPr>
+          <w:ilvl w:val="0"/>
+          <w:numId w:val="1"/>
+        </w:numPr>
+        <w:bidi w:val="0"/>
+        <w:spacing w:before="40" w:after="40"/>
+        <w:rPr>
+          <w:rFonts w:eastAsia="Arial" w:cs="Arial"/>
+          <w:color w:val="1A1A1A"/>
+          <w:sz w:val="20"/>
+          <w:szCs w:val="20"/>
+        </w:rPr>
+      </w:pPr>
+      <w:r>
+        <w:rPr>
+          <w:rFonts w:eastAsia="Arial" w:cs="Arial"/>
+          <w:color w:val="1A1A1A"/>
+          <w:sz w:val="20"/>
+          <w:szCs w:val="20"/>
+        </w:rPr>
+        <w:t xml:space="preserve">Automated the construction and sending of a Formula 1 email based tipping reminder service using Google Apps Script. See the LinkedIn post </w:t>
+      </w:r>
+      <w:r>
+        <w:rPr>
+          <w:rFonts w:eastAsia="Arial" w:cs="Arial"/>
+          <w:color w:val="1A1A1A"/>
+          <w:sz w:val="20"/>
+          <w:szCs w:val="20"/>
+        </w:rPr>
+        <w:t xml:space="preserve">I </w:t>
+      </w:r>
+      <w:r>
+        <w:rPr>
+          <w:rFonts w:eastAsia="Arial" w:cs="Arial"/>
+          <w:color w:val="1A1A1A"/>
+          <w:sz w:val="20"/>
+          <w:szCs w:val="20"/>
+        </w:rPr>
+        <w:t>made about it</w:t>
+      </w:r>
+      <w:r>
+        <w:rPr>
+          <w:rFonts w:eastAsia="Arial" w:cs="Arial"/>
+          <w:color w:val="1A1A1A"/>
+          <w:sz w:val="20"/>
+          <w:szCs w:val="20"/>
+        </w:rPr>
+        <w:t xml:space="preserve"> </w:t>
+      </w:r>
+      <w:r>
+        <w:rPr>
+          <w:rStyle w:val="Hyperlink"/>
+          <w:rFonts w:eastAsia="Arial" w:cs="Arial"/>
+          <w:color w:val="1A1A1A"/>
+          <w:sz w:val="20"/>
+          <w:szCs w:val="20"/>
+        </w:rPr>
+        <w:t>(</w:t>
+      </w:r>
+      <w:hyperlink r:id="rId10">
+        <w:r>
+          <w:rPr>
+            <w:rStyle w:val="Hyperlink"/>
+            <w:rFonts w:eastAsia="Arial" w:cs="Arial"/>
+            <w:color w:val="1A1A1A"/>
+            <w:sz w:val="20"/>
+            <w:szCs w:val="20"/>
+          </w:rPr>
+          <w:t>https://lnkd.in/p/gXWdr_Ks</w:t>
+        </w:r>
+      </w:hyperlink>
+      <w:r>
+        <w:rPr>
+          <w:rStyle w:val="Hyperlink"/>
+          <w:rFonts w:eastAsia="Arial" w:cs="Arial"/>
+          <w:color w:val="1A1A1A"/>
+          <w:sz w:val="20"/>
+          <w:szCs w:val="20"/>
+        </w:rPr>
+        <w:t>)</w:t>
+      </w:r>
+      <w:r>
+        <w:rPr>
+          <w:rFonts w:eastAsia="Arial" w:cs="Arial"/>
+          <w:color w:val="1A1A1A"/>
+          <w:sz w:val="20"/>
+          <w:szCs w:val="20"/>
+        </w:rPr>
+        <w:t xml:space="preserve"> for more info.</w:t>
+      </w:r>
+    </w:p>
+    <w:p>
+      <w:pPr>
+        <w:pStyle w:val="ListParagraph"/>
+        <w:numPr>
+          <w:ilvl w:val="0"/>
+          <w:numId w:val="1"/>
+        </w:numPr>
+        <w:bidi w:val="0"/>
+        <w:spacing w:before="40" w:after="40"/>
+        <w:rPr>
+          <w:rFonts w:eastAsia="Arial" w:cs="Arial"/>
+          <w:color w:val="1A1A1A"/>
+          <w:sz w:val="20"/>
+          <w:szCs w:val="20"/>
+        </w:rPr>
+      </w:pPr>
+      <w:r>
+        <w:rPr>
+          <w:rFonts w:eastAsia="Arial" w:cs="Arial"/>
+          <w:color w:val="1A1A1A"/>
+          <w:sz w:val="20"/>
+          <w:szCs w:val="20"/>
+        </w:rPr>
+        <w:t>Running a media server on a Raspberry Pi (</w:t>
+      </w:r>
+      <w:hyperlink r:id="rId11">
+        <w:r>
+          <w:rPr>
+            <w:rStyle w:val="Hyperlink"/>
+            <w:rFonts w:eastAsia="Arial" w:cs="Arial"/>
+            <w:color w:val="1A1A1A"/>
+            <w:sz w:val="20"/>
+            <w:szCs w:val="20"/>
+          </w:rPr>
+          <w:t>https://kodi.wiki/view/HOW-TO:Install_Kodi_on_Raspberry_Pi</w:t>
+        </w:r>
+      </w:hyperlink>
+      <w:r>
+        <w:rPr>
+          <w:rFonts w:eastAsia="Arial" w:cs="Arial"/>
+          <w:color w:val="1A1A1A"/>
+          <w:sz w:val="20"/>
+          <w:szCs w:val="20"/>
+        </w:rPr>
+        <w:t>)</w:t>
       </w:r>
     </w:p>
     <w:p>
@@ -2757,9 +2581,6 @@
           <w:bottom w:val="single" w:sz="6" w:space="1" w:color="1F4E79"/>
         </w:pBdr>
         <w:spacing w:before="240" w:after="80"/>
-        <w:rPr/>
-      </w:pPr>
-      <w:r>
         <w:rPr>
           <w:rFonts w:eastAsia="Arial" w:cs="Arial"/>
           <w:b/>
@@ -2768,7 +2589,17 @@
           <w:sz w:val="24"/>
           <w:szCs w:val="24"/>
         </w:rPr>
-        <w:t>INTERESTS</w:t>
+      </w:pPr>
+      <w:r>
+        <w:rPr>
+          <w:rFonts w:eastAsia="Arial" w:cs="Arial"/>
+          <w:b/>
+          <w:bCs/>
+          <w:color w:val="1F4E79"/>
+          <w:sz w:val="24"/>
+          <w:szCs w:val="24"/>
+        </w:rPr>
+        <w:t>VOLUNTEERING</w:t>
       </w:r>
     </w:p>
     <w:p>
@@ -2784,7 +2615,7 @@
           <w:sz w:val="20"/>
           <w:szCs w:val="20"/>
         </w:rPr>
-        <w:t>Cycling, Surfing, Snowboarding, Hiking (Overland Track Tasmania) &amp; trekking (Annapurna Base Camp), Swimming, Marathon &amp; half marathon running (Melbourne Marathon 2013 and 2014)</w:t>
+        <w:t>Robyn's Nest Animal Rescue, Asylum Seekers Resource Centre (ASRC), Sudanese Australian Integrated Learning (SAIL), Melbourne Open House</w:t>
       </w:r>
     </w:p>
     <w:p>
@@ -2805,7 +2636,7 @@
           <w:sz w:val="24"/>
           <w:szCs w:val="24"/>
         </w:rPr>
-        <w:t>REFERENCES</w:t>
+        <w:t>INTERESTS</w:t>
       </w:r>
     </w:p>
     <w:p>
@@ -2821,7 +2652,7 @@
           <w:sz w:val="20"/>
           <w:szCs w:val="20"/>
         </w:rPr>
-        <w:t>Available on request.</w:t>
+        <w:t>Cycling, Surfing, Snowboarding, Hiking (Overland Track Tasmania) &amp; trekking (Annapurna Base Camp), Swimming, Marathon running (Melbourne Marathon 2013 and 2014)</w:t>
       </w:r>
     </w:p>
     <w:sectPr>
@@ -2842,6 +2673,794 @@
   <w:abstractNum w:abstractNumId="1">
     <w:lvl w:ilvl="0">
       <w:start w:val="1"/>
+      <w:numFmt w:val="bullet"/>
+      <w:lvlText w:val=""/>
+      <w:lvlJc w:val="left"/>
+      <w:pPr>
+        <w:tabs>
+          <w:tab w:val="num" w:pos="0"/>
+        </w:tabs>
+        <w:ind w:left="360" w:hanging="200"/>
+      </w:pPr>
+      <w:rPr>
+        <w:rFonts w:ascii="Symbol" w:hAnsi="Symbol" w:cs="Symbol" w:hint="default"/>
+      </w:rPr>
+    </w:lvl>
+    <w:lvl w:ilvl="1">
+      <w:start w:val="1"/>
+      <w:numFmt w:val="decimal"/>
+      <w:lvlText w:val="%2."/>
+      <w:lvlJc w:val="left"/>
+      <w:pPr>
+        <w:tabs>
+          <w:tab w:val="num" w:pos="1080"/>
+        </w:tabs>
+        <w:ind w:left="1080" w:hanging="360"/>
+      </w:pPr>
+      <w:rPr/>
+    </w:lvl>
+    <w:lvl w:ilvl="2">
+      <w:start w:val="1"/>
+      <w:numFmt w:val="decimal"/>
+      <w:lvlText w:val="%3."/>
+      <w:lvlJc w:val="left"/>
+      <w:pPr>
+        <w:tabs>
+          <w:tab w:val="num" w:pos="1440"/>
+        </w:tabs>
+        <w:ind w:left="1440" w:hanging="360"/>
+      </w:pPr>
+      <w:rPr/>
+    </w:lvl>
+    <w:lvl w:ilvl="3">
+      <w:start w:val="1"/>
+      <w:numFmt w:val="decimal"/>
+      <w:lvlText w:val="%4."/>
+      <w:lvlJc w:val="left"/>
+      <w:pPr>
+        <w:tabs>
+          <w:tab w:val="num" w:pos="1800"/>
+        </w:tabs>
+        <w:ind w:left="1800" w:hanging="360"/>
+      </w:pPr>
+      <w:rPr/>
+    </w:lvl>
+    <w:lvl w:ilvl="4">
+      <w:start w:val="1"/>
+      <w:numFmt w:val="decimal"/>
+      <w:lvlText w:val="%5."/>
+      <w:lvlJc w:val="left"/>
+      <w:pPr>
+        <w:tabs>
+          <w:tab w:val="num" w:pos="2160"/>
+        </w:tabs>
+        <w:ind w:left="2160" w:hanging="360"/>
+      </w:pPr>
+      <w:rPr/>
+    </w:lvl>
+    <w:lvl w:ilvl="5">
+      <w:start w:val="1"/>
+      <w:numFmt w:val="decimal"/>
+      <w:lvlText w:val="%6."/>
+      <w:lvlJc w:val="left"/>
+      <w:pPr>
+        <w:tabs>
+          <w:tab w:val="num" w:pos="2520"/>
+        </w:tabs>
+        <w:ind w:left="2520" w:hanging="360"/>
+      </w:pPr>
+      <w:rPr/>
+    </w:lvl>
+    <w:lvl w:ilvl="6">
+      <w:start w:val="1"/>
+      <w:numFmt w:val="decimal"/>
+      <w:lvlText w:val="%7."/>
+      <w:lvlJc w:val="left"/>
+      <w:pPr>
+        <w:tabs>
+          <w:tab w:val="num" w:pos="2880"/>
+        </w:tabs>
+        <w:ind w:left="2880" w:hanging="360"/>
+      </w:pPr>
+      <w:rPr/>
+    </w:lvl>
+    <w:lvl w:ilvl="7">
+      <w:start w:val="1"/>
+      <w:numFmt w:val="decimal"/>
+      <w:lvlText w:val="%8."/>
+      <w:lvlJc w:val="left"/>
+      <w:pPr>
+        <w:tabs>
+          <w:tab w:val="num" w:pos="3240"/>
+        </w:tabs>
+        <w:ind w:left="3240" w:hanging="360"/>
+      </w:pPr>
+      <w:rPr/>
+    </w:lvl>
+    <w:lvl w:ilvl="8">
+      <w:start w:val="1"/>
+      <w:numFmt w:val="decimal"/>
+      <w:lvlText w:val="%9."/>
+      <w:lvlJc w:val="left"/>
+      <w:pPr>
+        <w:tabs>
+          <w:tab w:val="num" w:pos="3600"/>
+        </w:tabs>
+        <w:ind w:left="3600" w:hanging="360"/>
+      </w:pPr>
+      <w:rPr/>
+    </w:lvl>
+  </w:abstractNum>
+  <w:abstractNum w:abstractNumId="2">
+    <w:lvl w:ilvl="0">
+      <w:start w:val="1"/>
+      <w:numFmt w:val="decimal"/>
+      <w:lvlText w:val="%1."/>
+      <w:lvlJc w:val="left"/>
+      <w:pPr>
+        <w:tabs>
+          <w:tab w:val="num" w:pos="520"/>
+        </w:tabs>
+        <w:ind w:left="520" w:hanging="360"/>
+      </w:pPr>
+      <w:rPr/>
+    </w:lvl>
+    <w:lvl w:ilvl="1">
+      <w:start w:val="1"/>
+      <w:numFmt w:val="decimal"/>
+      <w:lvlText w:val="%2."/>
+      <w:lvlJc w:val="left"/>
+      <w:pPr>
+        <w:tabs>
+          <w:tab w:val="num" w:pos="880"/>
+        </w:tabs>
+        <w:ind w:left="880" w:hanging="360"/>
+      </w:pPr>
+      <w:rPr/>
+    </w:lvl>
+    <w:lvl w:ilvl="2">
+      <w:start w:val="1"/>
+      <w:numFmt w:val="decimal"/>
+      <w:lvlText w:val="%3."/>
+      <w:lvlJc w:val="left"/>
+      <w:pPr>
+        <w:tabs>
+          <w:tab w:val="num" w:pos="1240"/>
+        </w:tabs>
+        <w:ind w:left="1240" w:hanging="360"/>
+      </w:pPr>
+      <w:rPr/>
+    </w:lvl>
+    <w:lvl w:ilvl="3">
+      <w:start w:val="1"/>
+      <w:numFmt w:val="decimal"/>
+      <w:lvlText w:val="%4."/>
+      <w:lvlJc w:val="left"/>
+      <w:pPr>
+        <w:tabs>
+          <w:tab w:val="num" w:pos="1600"/>
+        </w:tabs>
+        <w:ind w:left="1600" w:hanging="360"/>
+      </w:pPr>
+      <w:rPr/>
+    </w:lvl>
+    <w:lvl w:ilvl="4">
+      <w:start w:val="1"/>
+      <w:numFmt w:val="decimal"/>
+      <w:lvlText w:val="%5."/>
+      <w:lvlJc w:val="left"/>
+      <w:pPr>
+        <w:tabs>
+          <w:tab w:val="num" w:pos="1960"/>
+        </w:tabs>
+        <w:ind w:left="1960" w:hanging="360"/>
+      </w:pPr>
+      <w:rPr/>
+    </w:lvl>
+    <w:lvl w:ilvl="5">
+      <w:start w:val="1"/>
+      <w:numFmt w:val="decimal"/>
+      <w:lvlText w:val="%6."/>
+      <w:lvlJc w:val="left"/>
+      <w:pPr>
+        <w:tabs>
+          <w:tab w:val="num" w:pos="2320"/>
+        </w:tabs>
+        <w:ind w:left="2320" w:hanging="360"/>
+      </w:pPr>
+      <w:rPr/>
+    </w:lvl>
+    <w:lvl w:ilvl="6">
+      <w:start w:val="1"/>
+      <w:numFmt w:val="decimal"/>
+      <w:lvlText w:val="%7."/>
+      <w:lvlJc w:val="left"/>
+      <w:pPr>
+        <w:tabs>
+          <w:tab w:val="num" w:pos="2680"/>
+        </w:tabs>
+        <w:ind w:left="2680" w:hanging="360"/>
+      </w:pPr>
+      <w:rPr/>
+    </w:lvl>
+    <w:lvl w:ilvl="7">
+      <w:start w:val="1"/>
+      <w:numFmt w:val="decimal"/>
+      <w:lvlText w:val="%8."/>
+      <w:lvlJc w:val="left"/>
+      <w:pPr>
+        <w:tabs>
+          <w:tab w:val="num" w:pos="3040"/>
+        </w:tabs>
+        <w:ind w:left="3040" w:hanging="360"/>
+      </w:pPr>
+      <w:rPr/>
+    </w:lvl>
+    <w:lvl w:ilvl="8">
+      <w:start w:val="1"/>
+      <w:numFmt w:val="decimal"/>
+      <w:lvlText w:val="%9."/>
+      <w:lvlJc w:val="left"/>
+      <w:pPr>
+        <w:tabs>
+          <w:tab w:val="num" w:pos="3400"/>
+        </w:tabs>
+        <w:ind w:left="3400" w:hanging="360"/>
+      </w:pPr>
+      <w:rPr/>
+    </w:lvl>
+  </w:abstractNum>
+  <w:abstractNum w:abstractNumId="3">
+    <w:lvl w:ilvl="0">
+      <w:start w:val="1"/>
+      <w:numFmt w:val="bullet"/>
+      <w:lvlText w:val=""/>
+      <w:lvlJc w:val="left"/>
+      <w:pPr>
+        <w:tabs>
+          <w:tab w:val="num" w:pos="720"/>
+        </w:tabs>
+        <w:ind w:left="720" w:hanging="360"/>
+      </w:pPr>
+      <w:rPr>
+        <w:rFonts w:ascii="Symbol" w:hAnsi="Symbol" w:cs="Symbol" w:hint="default"/>
+      </w:rPr>
+    </w:lvl>
+    <w:lvl w:ilvl="1">
+      <w:start w:val="1"/>
+      <w:numFmt w:val="bullet"/>
+      <w:lvlText w:val="◦"/>
+      <w:lvlJc w:val="left"/>
+      <w:pPr>
+        <w:tabs>
+          <w:tab w:val="num" w:pos="1080"/>
+        </w:tabs>
+        <w:ind w:left="1080" w:hanging="360"/>
+      </w:pPr>
+      <w:rPr>
+        <w:rFonts w:ascii="OpenSymbol" w:hAnsi="OpenSymbol" w:cs="OpenSymbol" w:hint="default"/>
+      </w:rPr>
+    </w:lvl>
+    <w:lvl w:ilvl="2">
+      <w:start w:val="1"/>
+      <w:numFmt w:val="bullet"/>
+      <w:lvlText w:val="▪"/>
+      <w:lvlJc w:val="left"/>
+      <w:pPr>
+        <w:tabs>
+          <w:tab w:val="num" w:pos="1440"/>
+        </w:tabs>
+        <w:ind w:left="1440" w:hanging="360"/>
+      </w:pPr>
+      <w:rPr>
+        <w:rFonts w:ascii="OpenSymbol" w:hAnsi="OpenSymbol" w:cs="OpenSymbol" w:hint="default"/>
+      </w:rPr>
+    </w:lvl>
+    <w:lvl w:ilvl="3">
+      <w:start w:val="1"/>
+      <w:numFmt w:val="bullet"/>
+      <w:lvlText w:val=""/>
+      <w:lvlJc w:val="left"/>
+      <w:pPr>
+        <w:tabs>
+          <w:tab w:val="num" w:pos="1800"/>
+        </w:tabs>
+        <w:ind w:left="1800" w:hanging="360"/>
+      </w:pPr>
+      <w:rPr>
+        <w:rFonts w:ascii="Symbol" w:hAnsi="Symbol" w:cs="Symbol" w:hint="default"/>
+      </w:rPr>
+    </w:lvl>
+    <w:lvl w:ilvl="4">
+      <w:start w:val="1"/>
+      <w:numFmt w:val="bullet"/>
+      <w:lvlText w:val="◦"/>
+      <w:lvlJc w:val="left"/>
+      <w:pPr>
+        <w:tabs>
+          <w:tab w:val="num" w:pos="2160"/>
+        </w:tabs>
+        <w:ind w:left="2160" w:hanging="360"/>
+      </w:pPr>
+      <w:rPr>
+        <w:rFonts w:ascii="OpenSymbol" w:hAnsi="OpenSymbol" w:cs="OpenSymbol" w:hint="default"/>
+      </w:rPr>
+    </w:lvl>
+    <w:lvl w:ilvl="5">
+      <w:start w:val="1"/>
+      <w:numFmt w:val="bullet"/>
+      <w:lvlText w:val="▪"/>
+      <w:lvlJc w:val="left"/>
+      <w:pPr>
+        <w:tabs>
+          <w:tab w:val="num" w:pos="2520"/>
+        </w:tabs>
+        <w:ind w:left="2520" w:hanging="360"/>
+      </w:pPr>
+      <w:rPr>
+        <w:rFonts w:ascii="OpenSymbol" w:hAnsi="OpenSymbol" w:cs="OpenSymbol" w:hint="default"/>
+      </w:rPr>
+    </w:lvl>
+    <w:lvl w:ilvl="6">
+      <w:start w:val="1"/>
+      <w:numFmt w:val="bullet"/>
+      <w:lvlText w:val=""/>
+      <w:lvlJc w:val="left"/>
+      <w:pPr>
+        <w:tabs>
+          <w:tab w:val="num" w:pos="2880"/>
+        </w:tabs>
+        <w:ind w:left="2880" w:hanging="360"/>
+      </w:pPr>
+      <w:rPr>
+        <w:rFonts w:ascii="Symbol" w:hAnsi="Symbol" w:cs="Symbol" w:hint="default"/>
+      </w:rPr>
+    </w:lvl>
+    <w:lvl w:ilvl="7">
+      <w:start w:val="1"/>
+      <w:numFmt w:val="bullet"/>
+      <w:lvlText w:val="◦"/>
+      <w:lvlJc w:val="left"/>
+      <w:pPr>
+        <w:tabs>
+          <w:tab w:val="num" w:pos="3240"/>
+        </w:tabs>
+        <w:ind w:left="3240" w:hanging="360"/>
+      </w:pPr>
+      <w:rPr>
+        <w:rFonts w:ascii="OpenSymbol" w:hAnsi="OpenSymbol" w:cs="OpenSymbol" w:hint="default"/>
+      </w:rPr>
+    </w:lvl>
+    <w:lvl w:ilvl="8">
+      <w:start w:val="1"/>
+      <w:numFmt w:val="bullet"/>
+      <w:lvlText w:val="▪"/>
+      <w:lvlJc w:val="left"/>
+      <w:pPr>
+        <w:tabs>
+          <w:tab w:val="num" w:pos="3600"/>
+        </w:tabs>
+        <w:ind w:left="3600" w:hanging="360"/>
+      </w:pPr>
+      <w:rPr>
+        <w:rFonts w:ascii="OpenSymbol" w:hAnsi="OpenSymbol" w:cs="OpenSymbol" w:hint="default"/>
+      </w:rPr>
+    </w:lvl>
+  </w:abstractNum>
+  <w:abstractNum w:abstractNumId="4">
+    <w:lvl w:ilvl="0">
+      <w:start w:val="1"/>
+      <w:numFmt w:val="bullet"/>
+      <w:lvlText w:val=""/>
+      <w:lvlJc w:val="left"/>
+      <w:pPr>
+        <w:tabs>
+          <w:tab w:val="num" w:pos="720"/>
+        </w:tabs>
+        <w:ind w:left="720" w:hanging="360"/>
+      </w:pPr>
+      <w:rPr>
+        <w:rFonts w:ascii="Symbol" w:hAnsi="Symbol" w:cs="Symbol" w:hint="default"/>
+      </w:rPr>
+    </w:lvl>
+    <w:lvl w:ilvl="1">
+      <w:start w:val="1"/>
+      <w:numFmt w:val="bullet"/>
+      <w:lvlText w:val="◦"/>
+      <w:lvlJc w:val="left"/>
+      <w:pPr>
+        <w:tabs>
+          <w:tab w:val="num" w:pos="1080"/>
+        </w:tabs>
+        <w:ind w:left="1080" w:hanging="360"/>
+      </w:pPr>
+      <w:rPr>
+        <w:rFonts w:ascii="OpenSymbol" w:hAnsi="OpenSymbol" w:cs="OpenSymbol" w:hint="default"/>
+      </w:rPr>
+    </w:lvl>
+    <w:lvl w:ilvl="2">
+      <w:start w:val="1"/>
+      <w:numFmt w:val="bullet"/>
+      <w:lvlText w:val="▪"/>
+      <w:lvlJc w:val="left"/>
+      <w:pPr>
+        <w:tabs>
+          <w:tab w:val="num" w:pos="1440"/>
+        </w:tabs>
+        <w:ind w:left="1440" w:hanging="360"/>
+      </w:pPr>
+      <w:rPr>
+        <w:rFonts w:ascii="OpenSymbol" w:hAnsi="OpenSymbol" w:cs="OpenSymbol" w:hint="default"/>
+      </w:rPr>
+    </w:lvl>
+    <w:lvl w:ilvl="3">
+      <w:start w:val="1"/>
+      <w:numFmt w:val="bullet"/>
+      <w:lvlText w:val=""/>
+      <w:lvlJc w:val="left"/>
+      <w:pPr>
+        <w:tabs>
+          <w:tab w:val="num" w:pos="1800"/>
+        </w:tabs>
+        <w:ind w:left="1800" w:hanging="360"/>
+      </w:pPr>
+      <w:rPr>
+        <w:rFonts w:ascii="Symbol" w:hAnsi="Symbol" w:cs="Symbol" w:hint="default"/>
+      </w:rPr>
+    </w:lvl>
+    <w:lvl w:ilvl="4">
+      <w:start w:val="1"/>
+      <w:numFmt w:val="bullet"/>
+      <w:lvlText w:val="◦"/>
+      <w:lvlJc w:val="left"/>
+      <w:pPr>
+        <w:tabs>
+          <w:tab w:val="num" w:pos="2160"/>
+        </w:tabs>
+        <w:ind w:left="2160" w:hanging="360"/>
+      </w:pPr>
+      <w:rPr>
+        <w:rFonts w:ascii="OpenSymbol" w:hAnsi="OpenSymbol" w:cs="OpenSymbol" w:hint="default"/>
+      </w:rPr>
+    </w:lvl>
+    <w:lvl w:ilvl="5">
+      <w:start w:val="1"/>
+      <w:numFmt w:val="bullet"/>
+      <w:lvlText w:val="▪"/>
+      <w:lvlJc w:val="left"/>
+      <w:pPr>
+        <w:tabs>
+          <w:tab w:val="num" w:pos="2520"/>
+        </w:tabs>
+        <w:ind w:left="2520" w:hanging="360"/>
+      </w:pPr>
+      <w:rPr>
+        <w:rFonts w:ascii="OpenSymbol" w:hAnsi="OpenSymbol" w:cs="OpenSymbol" w:hint="default"/>
+      </w:rPr>
+    </w:lvl>
+    <w:lvl w:ilvl="6">
+      <w:start w:val="1"/>
+      <w:numFmt w:val="bullet"/>
+      <w:lvlText w:val=""/>
+      <w:lvlJc w:val="left"/>
+      <w:pPr>
+        <w:tabs>
+          <w:tab w:val="num" w:pos="2880"/>
+        </w:tabs>
+        <w:ind w:left="2880" w:hanging="360"/>
+      </w:pPr>
+      <w:rPr>
+        <w:rFonts w:ascii="Symbol" w:hAnsi="Symbol" w:cs="Symbol" w:hint="default"/>
+      </w:rPr>
+    </w:lvl>
+    <w:lvl w:ilvl="7">
+      <w:start w:val="1"/>
+      <w:numFmt w:val="bullet"/>
+      <w:lvlText w:val="◦"/>
+      <w:lvlJc w:val="left"/>
+      <w:pPr>
+        <w:tabs>
+          <w:tab w:val="num" w:pos="3240"/>
+        </w:tabs>
+        <w:ind w:left="3240" w:hanging="360"/>
+      </w:pPr>
+      <w:rPr>
+        <w:rFonts w:ascii="OpenSymbol" w:hAnsi="OpenSymbol" w:cs="OpenSymbol" w:hint="default"/>
+      </w:rPr>
+    </w:lvl>
+    <w:lvl w:ilvl="8">
+      <w:start w:val="1"/>
+      <w:numFmt w:val="bullet"/>
+      <w:lvlText w:val="▪"/>
+      <w:lvlJc w:val="left"/>
+      <w:pPr>
+        <w:tabs>
+          <w:tab w:val="num" w:pos="3600"/>
+        </w:tabs>
+        <w:ind w:left="3600" w:hanging="360"/>
+      </w:pPr>
+      <w:rPr>
+        <w:rFonts w:ascii="OpenSymbol" w:hAnsi="OpenSymbol" w:cs="OpenSymbol" w:hint="default"/>
+      </w:rPr>
+    </w:lvl>
+  </w:abstractNum>
+  <w:abstractNum w:abstractNumId="5">
+    <w:lvl w:ilvl="0">
+      <w:start w:val="1"/>
+      <w:numFmt w:val="bullet"/>
+      <w:lvlText w:val=""/>
+      <w:lvlJc w:val="left"/>
+      <w:pPr>
+        <w:tabs>
+          <w:tab w:val="num" w:pos="720"/>
+        </w:tabs>
+        <w:ind w:left="720" w:hanging="360"/>
+      </w:pPr>
+      <w:rPr>
+        <w:rFonts w:ascii="Symbol" w:hAnsi="Symbol" w:cs="Symbol" w:hint="default"/>
+      </w:rPr>
+    </w:lvl>
+    <w:lvl w:ilvl="1">
+      <w:start w:val="1"/>
+      <w:numFmt w:val="bullet"/>
+      <w:lvlText w:val="◦"/>
+      <w:lvlJc w:val="left"/>
+      <w:pPr>
+        <w:tabs>
+          <w:tab w:val="num" w:pos="1080"/>
+        </w:tabs>
+        <w:ind w:left="1080" w:hanging="360"/>
+      </w:pPr>
+      <w:rPr>
+        <w:rFonts w:ascii="OpenSymbol" w:hAnsi="OpenSymbol" w:cs="OpenSymbol" w:hint="default"/>
+      </w:rPr>
+    </w:lvl>
+    <w:lvl w:ilvl="2">
+      <w:start w:val="1"/>
+      <w:numFmt w:val="bullet"/>
+      <w:lvlText w:val="▪"/>
+      <w:lvlJc w:val="left"/>
+      <w:pPr>
+        <w:tabs>
+          <w:tab w:val="num" w:pos="1440"/>
+        </w:tabs>
+        <w:ind w:left="1440" w:hanging="360"/>
+      </w:pPr>
+      <w:rPr>
+        <w:rFonts w:ascii="OpenSymbol" w:hAnsi="OpenSymbol" w:cs="OpenSymbol" w:hint="default"/>
+      </w:rPr>
+    </w:lvl>
+    <w:lvl w:ilvl="3">
+      <w:start w:val="1"/>
+      <w:numFmt w:val="bullet"/>
+      <w:lvlText w:val=""/>
+      <w:lvlJc w:val="left"/>
+      <w:pPr>
+        <w:tabs>
+          <w:tab w:val="num" w:pos="1800"/>
+        </w:tabs>
+        <w:ind w:left="1800" w:hanging="360"/>
+      </w:pPr>
+      <w:rPr>
+        <w:rFonts w:ascii="Symbol" w:hAnsi="Symbol" w:cs="Symbol" w:hint="default"/>
+      </w:rPr>
+    </w:lvl>
+    <w:lvl w:ilvl="4">
+      <w:start w:val="1"/>
+      <w:numFmt w:val="bullet"/>
+      <w:lvlText w:val="◦"/>
+      <w:lvlJc w:val="left"/>
+      <w:pPr>
+        <w:tabs>
+          <w:tab w:val="num" w:pos="2160"/>
+        </w:tabs>
+        <w:ind w:left="2160" w:hanging="360"/>
+      </w:pPr>
+      <w:rPr>
+        <w:rFonts w:ascii="OpenSymbol" w:hAnsi="OpenSymbol" w:cs="OpenSymbol" w:hint="default"/>
+      </w:rPr>
+    </w:lvl>
+    <w:lvl w:ilvl="5">
+      <w:start w:val="1"/>
+      <w:numFmt w:val="bullet"/>
+      <w:lvlText w:val="▪"/>
+      <w:lvlJc w:val="left"/>
+      <w:pPr>
+        <w:tabs>
+          <w:tab w:val="num" w:pos="2520"/>
+        </w:tabs>
+        <w:ind w:left="2520" w:hanging="360"/>
+      </w:pPr>
+      <w:rPr>
+        <w:rFonts w:ascii="OpenSymbol" w:hAnsi="OpenSymbol" w:cs="OpenSymbol" w:hint="default"/>
+      </w:rPr>
+    </w:lvl>
+    <w:lvl w:ilvl="6">
+      <w:start w:val="1"/>
+      <w:numFmt w:val="bullet"/>
+      <w:lvlText w:val=""/>
+      <w:lvlJc w:val="left"/>
+      <w:pPr>
+        <w:tabs>
+          <w:tab w:val="num" w:pos="2880"/>
+        </w:tabs>
+        <w:ind w:left="2880" w:hanging="360"/>
+      </w:pPr>
+      <w:rPr>
+        <w:rFonts w:ascii="Symbol" w:hAnsi="Symbol" w:cs="Symbol" w:hint="default"/>
+      </w:rPr>
+    </w:lvl>
+    <w:lvl w:ilvl="7">
+      <w:start w:val="1"/>
+      <w:numFmt w:val="bullet"/>
+      <w:lvlText w:val="◦"/>
+      <w:lvlJc w:val="left"/>
+      <w:pPr>
+        <w:tabs>
+          <w:tab w:val="num" w:pos="3240"/>
+        </w:tabs>
+        <w:ind w:left="3240" w:hanging="360"/>
+      </w:pPr>
+      <w:rPr>
+        <w:rFonts w:ascii="OpenSymbol" w:hAnsi="OpenSymbol" w:cs="OpenSymbol" w:hint="default"/>
+      </w:rPr>
+    </w:lvl>
+    <w:lvl w:ilvl="8">
+      <w:start w:val="1"/>
+      <w:numFmt w:val="bullet"/>
+      <w:lvlText w:val="▪"/>
+      <w:lvlJc w:val="left"/>
+      <w:pPr>
+        <w:tabs>
+          <w:tab w:val="num" w:pos="3600"/>
+        </w:tabs>
+        <w:ind w:left="3600" w:hanging="360"/>
+      </w:pPr>
+      <w:rPr>
+        <w:rFonts w:ascii="OpenSymbol" w:hAnsi="OpenSymbol" w:cs="OpenSymbol" w:hint="default"/>
+      </w:rPr>
+    </w:lvl>
+  </w:abstractNum>
+  <w:abstractNum w:abstractNumId="6">
+    <w:lvl w:ilvl="0">
+      <w:start w:val="1"/>
+      <w:numFmt w:val="bullet"/>
+      <w:lvlText w:val=""/>
+      <w:lvlJc w:val="left"/>
+      <w:pPr>
+        <w:tabs>
+          <w:tab w:val="num" w:pos="720"/>
+        </w:tabs>
+        <w:ind w:left="720" w:hanging="360"/>
+      </w:pPr>
+      <w:rPr>
+        <w:rFonts w:ascii="Symbol" w:hAnsi="Symbol" w:cs="Symbol" w:hint="default"/>
+      </w:rPr>
+    </w:lvl>
+    <w:lvl w:ilvl="1">
+      <w:start w:val="1"/>
+      <w:numFmt w:val="bullet"/>
+      <w:lvlText w:val="◦"/>
+      <w:lvlJc w:val="left"/>
+      <w:pPr>
+        <w:tabs>
+          <w:tab w:val="num" w:pos="1080"/>
+        </w:tabs>
+        <w:ind w:left="1080" w:hanging="360"/>
+      </w:pPr>
+      <w:rPr>
+        <w:rFonts w:ascii="OpenSymbol" w:hAnsi="OpenSymbol" w:cs="OpenSymbol" w:hint="default"/>
+      </w:rPr>
+    </w:lvl>
+    <w:lvl w:ilvl="2">
+      <w:start w:val="1"/>
+      <w:numFmt w:val="bullet"/>
+      <w:lvlText w:val="▪"/>
+      <w:lvlJc w:val="left"/>
+      <w:pPr>
+        <w:tabs>
+          <w:tab w:val="num" w:pos="1440"/>
+        </w:tabs>
+        <w:ind w:left="1440" w:hanging="360"/>
+      </w:pPr>
+      <w:rPr>
+        <w:rFonts w:ascii="OpenSymbol" w:hAnsi="OpenSymbol" w:cs="OpenSymbol" w:hint="default"/>
+      </w:rPr>
+    </w:lvl>
+    <w:lvl w:ilvl="3">
+      <w:start w:val="1"/>
+      <w:numFmt w:val="bullet"/>
+      <w:lvlText w:val=""/>
+      <w:lvlJc w:val="left"/>
+      <w:pPr>
+        <w:tabs>
+          <w:tab w:val="num" w:pos="1800"/>
+        </w:tabs>
+        <w:ind w:left="1800" w:hanging="360"/>
+      </w:pPr>
+      <w:rPr>
+        <w:rFonts w:ascii="Symbol" w:hAnsi="Symbol" w:cs="Symbol" w:hint="default"/>
+      </w:rPr>
+    </w:lvl>
+    <w:lvl w:ilvl="4">
+      <w:start w:val="1"/>
+      <w:numFmt w:val="bullet"/>
+      <w:lvlText w:val="◦"/>
+      <w:lvlJc w:val="left"/>
+      <w:pPr>
+        <w:tabs>
+          <w:tab w:val="num" w:pos="2160"/>
+        </w:tabs>
+        <w:ind w:left="2160" w:hanging="360"/>
+      </w:pPr>
+      <w:rPr>
+        <w:rFonts w:ascii="OpenSymbol" w:hAnsi="OpenSymbol" w:cs="OpenSymbol" w:hint="default"/>
+      </w:rPr>
+    </w:lvl>
+    <w:lvl w:ilvl="5">
+      <w:start w:val="1"/>
+      <w:numFmt w:val="bullet"/>
+      <w:lvlText w:val="▪"/>
+      <w:lvlJc w:val="left"/>
+      <w:pPr>
+        <w:tabs>
+          <w:tab w:val="num" w:pos="2520"/>
+        </w:tabs>
+        <w:ind w:left="2520" w:hanging="360"/>
+      </w:pPr>
+      <w:rPr>
+        <w:rFonts w:ascii="OpenSymbol" w:hAnsi="OpenSymbol" w:cs="OpenSymbol" w:hint="default"/>
+      </w:rPr>
+    </w:lvl>
+    <w:lvl w:ilvl="6">
+      <w:start w:val="1"/>
+      <w:numFmt w:val="bullet"/>
+      <w:lvlText w:val=""/>
+      <w:lvlJc w:val="left"/>
+      <w:pPr>
+        <w:tabs>
+          <w:tab w:val="num" w:pos="2880"/>
+        </w:tabs>
+        <w:ind w:left="2880" w:hanging="360"/>
+      </w:pPr>
+      <w:rPr>
+        <w:rFonts w:ascii="Symbol" w:hAnsi="Symbol" w:cs="Symbol" w:hint="default"/>
+      </w:rPr>
+    </w:lvl>
+    <w:lvl w:ilvl="7">
+      <w:start w:val="1"/>
+      <w:numFmt w:val="bullet"/>
+      <w:lvlText w:val="◦"/>
+      <w:lvlJc w:val="left"/>
+      <w:pPr>
+        <w:tabs>
+          <w:tab w:val="num" w:pos="3240"/>
+        </w:tabs>
+        <w:ind w:left="3240" w:hanging="360"/>
+      </w:pPr>
+      <w:rPr>
+        <w:rFonts w:ascii="OpenSymbol" w:hAnsi="OpenSymbol" w:cs="OpenSymbol" w:hint="default"/>
+      </w:rPr>
+    </w:lvl>
+    <w:lvl w:ilvl="8">
+      <w:start w:val="1"/>
+      <w:numFmt w:val="bullet"/>
+      <w:lvlText w:val="▪"/>
+      <w:lvlJc w:val="left"/>
+      <w:pPr>
+        <w:tabs>
+          <w:tab w:val="num" w:pos="3600"/>
+        </w:tabs>
+        <w:ind w:left="3600" w:hanging="360"/>
+      </w:pPr>
+      <w:rPr>
+        <w:rFonts w:ascii="OpenSymbol" w:hAnsi="OpenSymbol" w:cs="OpenSymbol" w:hint="default"/>
+      </w:rPr>
+    </w:lvl>
+  </w:abstractNum>
+  <w:abstractNum w:abstractNumId="7">
+    <w:lvl w:ilvl="0">
+      <w:start w:val="1"/>
       <w:numFmt w:val="none"/>
       <w:suff w:val="nothing"/>
       <w:lvlText w:val=""/>
@@ -2956,794 +3575,6 @@
         </w:tabs>
         <w:ind w:left="0" w:hanging="0"/>
       </w:pPr>
-    </w:lvl>
-  </w:abstractNum>
-  <w:abstractNum w:abstractNumId="2">
-    <w:lvl w:ilvl="0">
-      <w:start w:val="1"/>
-      <w:numFmt w:val="bullet"/>
-      <w:lvlText w:val=""/>
-      <w:lvlJc w:val="left"/>
-      <w:pPr>
-        <w:tabs>
-          <w:tab w:val="num" w:pos="0"/>
-        </w:tabs>
-        <w:ind w:left="360" w:hanging="200"/>
-      </w:pPr>
-      <w:rPr>
-        <w:rFonts w:ascii="Symbol" w:hAnsi="Symbol" w:cs="Symbol" w:hint="default"/>
-      </w:rPr>
-    </w:lvl>
-    <w:lvl w:ilvl="1">
-      <w:start w:val="1"/>
-      <w:numFmt w:val="decimal"/>
-      <w:lvlText w:val="%2."/>
-      <w:lvlJc w:val="left"/>
-      <w:pPr>
-        <w:tabs>
-          <w:tab w:val="num" w:pos="1080"/>
-        </w:tabs>
-        <w:ind w:left="1080" w:hanging="360"/>
-      </w:pPr>
-      <w:rPr/>
-    </w:lvl>
-    <w:lvl w:ilvl="2">
-      <w:start w:val="1"/>
-      <w:numFmt w:val="decimal"/>
-      <w:lvlText w:val="%3."/>
-      <w:lvlJc w:val="left"/>
-      <w:pPr>
-        <w:tabs>
-          <w:tab w:val="num" w:pos="1440"/>
-        </w:tabs>
-        <w:ind w:left="1440" w:hanging="360"/>
-      </w:pPr>
-      <w:rPr/>
-    </w:lvl>
-    <w:lvl w:ilvl="3">
-      <w:start w:val="1"/>
-      <w:numFmt w:val="decimal"/>
-      <w:lvlText w:val="%4."/>
-      <w:lvlJc w:val="left"/>
-      <w:pPr>
-        <w:tabs>
-          <w:tab w:val="num" w:pos="1800"/>
-        </w:tabs>
-        <w:ind w:left="1800" w:hanging="360"/>
-      </w:pPr>
-      <w:rPr/>
-    </w:lvl>
-    <w:lvl w:ilvl="4">
-      <w:start w:val="1"/>
-      <w:numFmt w:val="decimal"/>
-      <w:lvlText w:val="%5."/>
-      <w:lvlJc w:val="left"/>
-      <w:pPr>
-        <w:tabs>
-          <w:tab w:val="num" w:pos="2160"/>
-        </w:tabs>
-        <w:ind w:left="2160" w:hanging="360"/>
-      </w:pPr>
-      <w:rPr/>
-    </w:lvl>
-    <w:lvl w:ilvl="5">
-      <w:start w:val="1"/>
-      <w:numFmt w:val="decimal"/>
-      <w:lvlText w:val="%6."/>
-      <w:lvlJc w:val="left"/>
-      <w:pPr>
-        <w:tabs>
-          <w:tab w:val="num" w:pos="2520"/>
-        </w:tabs>
-        <w:ind w:left="2520" w:hanging="360"/>
-      </w:pPr>
-      <w:rPr/>
-    </w:lvl>
-    <w:lvl w:ilvl="6">
-      <w:start w:val="1"/>
-      <w:numFmt w:val="decimal"/>
-      <w:lvlText w:val="%7."/>
-      <w:lvlJc w:val="left"/>
-      <w:pPr>
-        <w:tabs>
-          <w:tab w:val="num" w:pos="2880"/>
-        </w:tabs>
-        <w:ind w:left="2880" w:hanging="360"/>
-      </w:pPr>
-      <w:rPr/>
-    </w:lvl>
-    <w:lvl w:ilvl="7">
-      <w:start w:val="1"/>
-      <w:numFmt w:val="decimal"/>
-      <w:lvlText w:val="%8."/>
-      <w:lvlJc w:val="left"/>
-      <w:pPr>
-        <w:tabs>
-          <w:tab w:val="num" w:pos="3240"/>
-        </w:tabs>
-        <w:ind w:left="3240" w:hanging="360"/>
-      </w:pPr>
-      <w:rPr/>
-    </w:lvl>
-    <w:lvl w:ilvl="8">
-      <w:start w:val="1"/>
-      <w:numFmt w:val="decimal"/>
-      <w:lvlText w:val="%9."/>
-      <w:lvlJc w:val="left"/>
-      <w:pPr>
-        <w:tabs>
-          <w:tab w:val="num" w:pos="3600"/>
-        </w:tabs>
-        <w:ind w:left="3600" w:hanging="360"/>
-      </w:pPr>
-      <w:rPr/>
-    </w:lvl>
-  </w:abstractNum>
-  <w:abstractNum w:abstractNumId="3">
-    <w:lvl w:ilvl="0">
-      <w:start w:val="1"/>
-      <w:numFmt w:val="decimal"/>
-      <w:lvlText w:val="%1."/>
-      <w:lvlJc w:val="left"/>
-      <w:pPr>
-        <w:tabs>
-          <w:tab w:val="num" w:pos="520"/>
-        </w:tabs>
-        <w:ind w:left="520" w:hanging="360"/>
-      </w:pPr>
-      <w:rPr/>
-    </w:lvl>
-    <w:lvl w:ilvl="1">
-      <w:start w:val="1"/>
-      <w:numFmt w:val="decimal"/>
-      <w:lvlText w:val="%2."/>
-      <w:lvlJc w:val="left"/>
-      <w:pPr>
-        <w:tabs>
-          <w:tab w:val="num" w:pos="880"/>
-        </w:tabs>
-        <w:ind w:left="880" w:hanging="360"/>
-      </w:pPr>
-      <w:rPr/>
-    </w:lvl>
-    <w:lvl w:ilvl="2">
-      <w:start w:val="1"/>
-      <w:numFmt w:val="decimal"/>
-      <w:lvlText w:val="%3."/>
-      <w:lvlJc w:val="left"/>
-      <w:pPr>
-        <w:tabs>
-          <w:tab w:val="num" w:pos="1240"/>
-        </w:tabs>
-        <w:ind w:left="1240" w:hanging="360"/>
-      </w:pPr>
-      <w:rPr/>
-    </w:lvl>
-    <w:lvl w:ilvl="3">
-      <w:start w:val="1"/>
-      <w:numFmt w:val="decimal"/>
-      <w:lvlText w:val="%4."/>
-      <w:lvlJc w:val="left"/>
-      <w:pPr>
-        <w:tabs>
-          <w:tab w:val="num" w:pos="1600"/>
-        </w:tabs>
-        <w:ind w:left="1600" w:hanging="360"/>
-      </w:pPr>
-      <w:rPr/>
-    </w:lvl>
-    <w:lvl w:ilvl="4">
-      <w:start w:val="1"/>
-      <w:numFmt w:val="decimal"/>
-      <w:lvlText w:val="%5."/>
-      <w:lvlJc w:val="left"/>
-      <w:pPr>
-        <w:tabs>
-          <w:tab w:val="num" w:pos="1960"/>
-        </w:tabs>
-        <w:ind w:left="1960" w:hanging="360"/>
-      </w:pPr>
-      <w:rPr/>
-    </w:lvl>
-    <w:lvl w:ilvl="5">
-      <w:start w:val="1"/>
-      <w:numFmt w:val="decimal"/>
-      <w:lvlText w:val="%6."/>
-      <w:lvlJc w:val="left"/>
-      <w:pPr>
-        <w:tabs>
-          <w:tab w:val="num" w:pos="2320"/>
-        </w:tabs>
-        <w:ind w:left="2320" w:hanging="360"/>
-      </w:pPr>
-      <w:rPr/>
-    </w:lvl>
-    <w:lvl w:ilvl="6">
-      <w:start w:val="1"/>
-      <w:numFmt w:val="decimal"/>
-      <w:lvlText w:val="%7."/>
-      <w:lvlJc w:val="left"/>
-      <w:pPr>
-        <w:tabs>
-          <w:tab w:val="num" w:pos="2680"/>
-        </w:tabs>
-        <w:ind w:left="2680" w:hanging="360"/>
-      </w:pPr>
-      <w:rPr/>
-    </w:lvl>
-    <w:lvl w:ilvl="7">
-      <w:start w:val="1"/>
-      <w:numFmt w:val="decimal"/>
-      <w:lvlText w:val="%8."/>
-      <w:lvlJc w:val="left"/>
-      <w:pPr>
-        <w:tabs>
-          <w:tab w:val="num" w:pos="3040"/>
-        </w:tabs>
-        <w:ind w:left="3040" w:hanging="360"/>
-      </w:pPr>
-      <w:rPr/>
-    </w:lvl>
-    <w:lvl w:ilvl="8">
-      <w:start w:val="1"/>
-      <w:numFmt w:val="decimal"/>
-      <w:lvlText w:val="%9."/>
-      <w:lvlJc w:val="left"/>
-      <w:pPr>
-        <w:tabs>
-          <w:tab w:val="num" w:pos="3400"/>
-        </w:tabs>
-        <w:ind w:left="3400" w:hanging="360"/>
-      </w:pPr>
-      <w:rPr/>
-    </w:lvl>
-  </w:abstractNum>
-  <w:abstractNum w:abstractNumId="4">
-    <w:lvl w:ilvl="0">
-      <w:start w:val="1"/>
-      <w:numFmt w:val="bullet"/>
-      <w:lvlText w:val=""/>
-      <w:lvlJc w:val="left"/>
-      <w:pPr>
-        <w:tabs>
-          <w:tab w:val="num" w:pos="720"/>
-        </w:tabs>
-        <w:ind w:left="720" w:hanging="360"/>
-      </w:pPr>
-      <w:rPr>
-        <w:rFonts w:ascii="Symbol" w:hAnsi="Symbol" w:cs="Symbol" w:hint="default"/>
-      </w:rPr>
-    </w:lvl>
-    <w:lvl w:ilvl="1">
-      <w:start w:val="1"/>
-      <w:numFmt w:val="bullet"/>
-      <w:lvlText w:val="◦"/>
-      <w:lvlJc w:val="left"/>
-      <w:pPr>
-        <w:tabs>
-          <w:tab w:val="num" w:pos="1080"/>
-        </w:tabs>
-        <w:ind w:left="1080" w:hanging="360"/>
-      </w:pPr>
-      <w:rPr>
-        <w:rFonts w:ascii="OpenSymbol" w:hAnsi="OpenSymbol" w:cs="OpenSymbol" w:hint="default"/>
-      </w:rPr>
-    </w:lvl>
-    <w:lvl w:ilvl="2">
-      <w:start w:val="1"/>
-      <w:numFmt w:val="bullet"/>
-      <w:lvlText w:val="▪"/>
-      <w:lvlJc w:val="left"/>
-      <w:pPr>
-        <w:tabs>
-          <w:tab w:val="num" w:pos="1440"/>
-        </w:tabs>
-        <w:ind w:left="1440" w:hanging="360"/>
-      </w:pPr>
-      <w:rPr>
-        <w:rFonts w:ascii="OpenSymbol" w:hAnsi="OpenSymbol" w:cs="OpenSymbol" w:hint="default"/>
-      </w:rPr>
-    </w:lvl>
-    <w:lvl w:ilvl="3">
-      <w:start w:val="1"/>
-      <w:numFmt w:val="bullet"/>
-      <w:lvlText w:val=""/>
-      <w:lvlJc w:val="left"/>
-      <w:pPr>
-        <w:tabs>
-          <w:tab w:val="num" w:pos="1800"/>
-        </w:tabs>
-        <w:ind w:left="1800" w:hanging="360"/>
-      </w:pPr>
-      <w:rPr>
-        <w:rFonts w:ascii="Symbol" w:hAnsi="Symbol" w:cs="Symbol" w:hint="default"/>
-      </w:rPr>
-    </w:lvl>
-    <w:lvl w:ilvl="4">
-      <w:start w:val="1"/>
-      <w:numFmt w:val="bullet"/>
-      <w:lvlText w:val="◦"/>
-      <w:lvlJc w:val="left"/>
-      <w:pPr>
-        <w:tabs>
-          <w:tab w:val="num" w:pos="2160"/>
-        </w:tabs>
-        <w:ind w:left="2160" w:hanging="360"/>
-      </w:pPr>
-      <w:rPr>
-        <w:rFonts w:ascii="OpenSymbol" w:hAnsi="OpenSymbol" w:cs="OpenSymbol" w:hint="default"/>
-      </w:rPr>
-    </w:lvl>
-    <w:lvl w:ilvl="5">
-      <w:start w:val="1"/>
-      <w:numFmt w:val="bullet"/>
-      <w:lvlText w:val="▪"/>
-      <w:lvlJc w:val="left"/>
-      <w:pPr>
-        <w:tabs>
-          <w:tab w:val="num" w:pos="2520"/>
-        </w:tabs>
-        <w:ind w:left="2520" w:hanging="360"/>
-      </w:pPr>
-      <w:rPr>
-        <w:rFonts w:ascii="OpenSymbol" w:hAnsi="OpenSymbol" w:cs="OpenSymbol" w:hint="default"/>
-      </w:rPr>
-    </w:lvl>
-    <w:lvl w:ilvl="6">
-      <w:start w:val="1"/>
-      <w:numFmt w:val="bullet"/>
-      <w:lvlText w:val=""/>
-      <w:lvlJc w:val="left"/>
-      <w:pPr>
-        <w:tabs>
-          <w:tab w:val="num" w:pos="2880"/>
-        </w:tabs>
-        <w:ind w:left="2880" w:hanging="360"/>
-      </w:pPr>
-      <w:rPr>
-        <w:rFonts w:ascii="Symbol" w:hAnsi="Symbol" w:cs="Symbol" w:hint="default"/>
-      </w:rPr>
-    </w:lvl>
-    <w:lvl w:ilvl="7">
-      <w:start w:val="1"/>
-      <w:numFmt w:val="bullet"/>
-      <w:lvlText w:val="◦"/>
-      <w:lvlJc w:val="left"/>
-      <w:pPr>
-        <w:tabs>
-          <w:tab w:val="num" w:pos="3240"/>
-        </w:tabs>
-        <w:ind w:left="3240" w:hanging="360"/>
-      </w:pPr>
-      <w:rPr>
-        <w:rFonts w:ascii="OpenSymbol" w:hAnsi="OpenSymbol" w:cs="OpenSymbol" w:hint="default"/>
-      </w:rPr>
-    </w:lvl>
-    <w:lvl w:ilvl="8">
-      <w:start w:val="1"/>
-      <w:numFmt w:val="bullet"/>
-      <w:lvlText w:val="▪"/>
-      <w:lvlJc w:val="left"/>
-      <w:pPr>
-        <w:tabs>
-          <w:tab w:val="num" w:pos="3600"/>
-        </w:tabs>
-        <w:ind w:left="3600" w:hanging="360"/>
-      </w:pPr>
-      <w:rPr>
-        <w:rFonts w:ascii="OpenSymbol" w:hAnsi="OpenSymbol" w:cs="OpenSymbol" w:hint="default"/>
-      </w:rPr>
-    </w:lvl>
-  </w:abstractNum>
-  <w:abstractNum w:abstractNumId="5">
-    <w:lvl w:ilvl="0">
-      <w:start w:val="1"/>
-      <w:numFmt w:val="bullet"/>
-      <w:lvlText w:val=""/>
-      <w:lvlJc w:val="left"/>
-      <w:pPr>
-        <w:tabs>
-          <w:tab w:val="num" w:pos="720"/>
-        </w:tabs>
-        <w:ind w:left="720" w:hanging="360"/>
-      </w:pPr>
-      <w:rPr>
-        <w:rFonts w:ascii="Symbol" w:hAnsi="Symbol" w:cs="Symbol" w:hint="default"/>
-      </w:rPr>
-    </w:lvl>
-    <w:lvl w:ilvl="1">
-      <w:start w:val="1"/>
-      <w:numFmt w:val="bullet"/>
-      <w:lvlText w:val="◦"/>
-      <w:lvlJc w:val="left"/>
-      <w:pPr>
-        <w:tabs>
-          <w:tab w:val="num" w:pos="1080"/>
-        </w:tabs>
-        <w:ind w:left="1080" w:hanging="360"/>
-      </w:pPr>
-      <w:rPr>
-        <w:rFonts w:ascii="OpenSymbol" w:hAnsi="OpenSymbol" w:cs="OpenSymbol" w:hint="default"/>
-      </w:rPr>
-    </w:lvl>
-    <w:lvl w:ilvl="2">
-      <w:start w:val="1"/>
-      <w:numFmt w:val="bullet"/>
-      <w:lvlText w:val="▪"/>
-      <w:lvlJc w:val="left"/>
-      <w:pPr>
-        <w:tabs>
-          <w:tab w:val="num" w:pos="1440"/>
-        </w:tabs>
-        <w:ind w:left="1440" w:hanging="360"/>
-      </w:pPr>
-      <w:rPr>
-        <w:rFonts w:ascii="OpenSymbol" w:hAnsi="OpenSymbol" w:cs="OpenSymbol" w:hint="default"/>
-      </w:rPr>
-    </w:lvl>
-    <w:lvl w:ilvl="3">
-      <w:start w:val="1"/>
-      <w:numFmt w:val="bullet"/>
-      <w:lvlText w:val=""/>
-      <w:lvlJc w:val="left"/>
-      <w:pPr>
-        <w:tabs>
-          <w:tab w:val="num" w:pos="1800"/>
-        </w:tabs>
-        <w:ind w:left="1800" w:hanging="360"/>
-      </w:pPr>
-      <w:rPr>
-        <w:rFonts w:ascii="Symbol" w:hAnsi="Symbol" w:cs="Symbol" w:hint="default"/>
-      </w:rPr>
-    </w:lvl>
-    <w:lvl w:ilvl="4">
-      <w:start w:val="1"/>
-      <w:numFmt w:val="bullet"/>
-      <w:lvlText w:val="◦"/>
-      <w:lvlJc w:val="left"/>
-      <w:pPr>
-        <w:tabs>
-          <w:tab w:val="num" w:pos="2160"/>
-        </w:tabs>
-        <w:ind w:left="2160" w:hanging="360"/>
-      </w:pPr>
-      <w:rPr>
-        <w:rFonts w:ascii="OpenSymbol" w:hAnsi="OpenSymbol" w:cs="OpenSymbol" w:hint="default"/>
-      </w:rPr>
-    </w:lvl>
-    <w:lvl w:ilvl="5">
-      <w:start w:val="1"/>
-      <w:numFmt w:val="bullet"/>
-      <w:lvlText w:val="▪"/>
-      <w:lvlJc w:val="left"/>
-      <w:pPr>
-        <w:tabs>
-          <w:tab w:val="num" w:pos="2520"/>
-        </w:tabs>
-        <w:ind w:left="2520" w:hanging="360"/>
-      </w:pPr>
-      <w:rPr>
-        <w:rFonts w:ascii="OpenSymbol" w:hAnsi="OpenSymbol" w:cs="OpenSymbol" w:hint="default"/>
-      </w:rPr>
-    </w:lvl>
-    <w:lvl w:ilvl="6">
-      <w:start w:val="1"/>
-      <w:numFmt w:val="bullet"/>
-      <w:lvlText w:val=""/>
-      <w:lvlJc w:val="left"/>
-      <w:pPr>
-        <w:tabs>
-          <w:tab w:val="num" w:pos="2880"/>
-        </w:tabs>
-        <w:ind w:left="2880" w:hanging="360"/>
-      </w:pPr>
-      <w:rPr>
-        <w:rFonts w:ascii="Symbol" w:hAnsi="Symbol" w:cs="Symbol" w:hint="default"/>
-      </w:rPr>
-    </w:lvl>
-    <w:lvl w:ilvl="7">
-      <w:start w:val="1"/>
-      <w:numFmt w:val="bullet"/>
-      <w:lvlText w:val="◦"/>
-      <w:lvlJc w:val="left"/>
-      <w:pPr>
-        <w:tabs>
-          <w:tab w:val="num" w:pos="3240"/>
-        </w:tabs>
-        <w:ind w:left="3240" w:hanging="360"/>
-      </w:pPr>
-      <w:rPr>
-        <w:rFonts w:ascii="OpenSymbol" w:hAnsi="OpenSymbol" w:cs="OpenSymbol" w:hint="default"/>
-      </w:rPr>
-    </w:lvl>
-    <w:lvl w:ilvl="8">
-      <w:start w:val="1"/>
-      <w:numFmt w:val="bullet"/>
-      <w:lvlText w:val="▪"/>
-      <w:lvlJc w:val="left"/>
-      <w:pPr>
-        <w:tabs>
-          <w:tab w:val="num" w:pos="3600"/>
-        </w:tabs>
-        <w:ind w:left="3600" w:hanging="360"/>
-      </w:pPr>
-      <w:rPr>
-        <w:rFonts w:ascii="OpenSymbol" w:hAnsi="OpenSymbol" w:cs="OpenSymbol" w:hint="default"/>
-      </w:rPr>
-    </w:lvl>
-  </w:abstractNum>
-  <w:abstractNum w:abstractNumId="6">
-    <w:lvl w:ilvl="0">
-      <w:start w:val="1"/>
-      <w:numFmt w:val="bullet"/>
-      <w:lvlText w:val=""/>
-      <w:lvlJc w:val="left"/>
-      <w:pPr>
-        <w:tabs>
-          <w:tab w:val="num" w:pos="720"/>
-        </w:tabs>
-        <w:ind w:left="720" w:hanging="360"/>
-      </w:pPr>
-      <w:rPr>
-        <w:rFonts w:ascii="Symbol" w:hAnsi="Symbol" w:cs="Symbol" w:hint="default"/>
-      </w:rPr>
-    </w:lvl>
-    <w:lvl w:ilvl="1">
-      <w:start w:val="1"/>
-      <w:numFmt w:val="bullet"/>
-      <w:lvlText w:val="◦"/>
-      <w:lvlJc w:val="left"/>
-      <w:pPr>
-        <w:tabs>
-          <w:tab w:val="num" w:pos="1080"/>
-        </w:tabs>
-        <w:ind w:left="1080" w:hanging="360"/>
-      </w:pPr>
-      <w:rPr>
-        <w:rFonts w:ascii="OpenSymbol" w:hAnsi="OpenSymbol" w:cs="OpenSymbol" w:hint="default"/>
-      </w:rPr>
-    </w:lvl>
-    <w:lvl w:ilvl="2">
-      <w:start w:val="1"/>
-      <w:numFmt w:val="bullet"/>
-      <w:lvlText w:val="▪"/>
-      <w:lvlJc w:val="left"/>
-      <w:pPr>
-        <w:tabs>
-          <w:tab w:val="num" w:pos="1440"/>
-        </w:tabs>
-        <w:ind w:left="1440" w:hanging="360"/>
-      </w:pPr>
-      <w:rPr>
-        <w:rFonts w:ascii="OpenSymbol" w:hAnsi="OpenSymbol" w:cs="OpenSymbol" w:hint="default"/>
-      </w:rPr>
-    </w:lvl>
-    <w:lvl w:ilvl="3">
-      <w:start w:val="1"/>
-      <w:numFmt w:val="bullet"/>
-      <w:lvlText w:val=""/>
-      <w:lvlJc w:val="left"/>
-      <w:pPr>
-        <w:tabs>
-          <w:tab w:val="num" w:pos="1800"/>
-        </w:tabs>
-        <w:ind w:left="1800" w:hanging="360"/>
-      </w:pPr>
-      <w:rPr>
-        <w:rFonts w:ascii="Symbol" w:hAnsi="Symbol" w:cs="Symbol" w:hint="default"/>
-      </w:rPr>
-    </w:lvl>
-    <w:lvl w:ilvl="4">
-      <w:start w:val="1"/>
-      <w:numFmt w:val="bullet"/>
-      <w:lvlText w:val="◦"/>
-      <w:lvlJc w:val="left"/>
-      <w:pPr>
-        <w:tabs>
-          <w:tab w:val="num" w:pos="2160"/>
-        </w:tabs>
-        <w:ind w:left="2160" w:hanging="360"/>
-      </w:pPr>
-      <w:rPr>
-        <w:rFonts w:ascii="OpenSymbol" w:hAnsi="OpenSymbol" w:cs="OpenSymbol" w:hint="default"/>
-      </w:rPr>
-    </w:lvl>
-    <w:lvl w:ilvl="5">
-      <w:start w:val="1"/>
-      <w:numFmt w:val="bullet"/>
-      <w:lvlText w:val="▪"/>
-      <w:lvlJc w:val="left"/>
-      <w:pPr>
-        <w:tabs>
-          <w:tab w:val="num" w:pos="2520"/>
-        </w:tabs>
-        <w:ind w:left="2520" w:hanging="360"/>
-      </w:pPr>
-      <w:rPr>
-        <w:rFonts w:ascii="OpenSymbol" w:hAnsi="OpenSymbol" w:cs="OpenSymbol" w:hint="default"/>
-      </w:rPr>
-    </w:lvl>
-    <w:lvl w:ilvl="6">
-      <w:start w:val="1"/>
-      <w:numFmt w:val="bullet"/>
-      <w:lvlText w:val=""/>
-      <w:lvlJc w:val="left"/>
-      <w:pPr>
-        <w:tabs>
-          <w:tab w:val="num" w:pos="2880"/>
-        </w:tabs>
-        <w:ind w:left="2880" w:hanging="360"/>
-      </w:pPr>
-      <w:rPr>
-        <w:rFonts w:ascii="Symbol" w:hAnsi="Symbol" w:cs="Symbol" w:hint="default"/>
-      </w:rPr>
-    </w:lvl>
-    <w:lvl w:ilvl="7">
-      <w:start w:val="1"/>
-      <w:numFmt w:val="bullet"/>
-      <w:lvlText w:val="◦"/>
-      <w:lvlJc w:val="left"/>
-      <w:pPr>
-        <w:tabs>
-          <w:tab w:val="num" w:pos="3240"/>
-        </w:tabs>
-        <w:ind w:left="3240" w:hanging="360"/>
-      </w:pPr>
-      <w:rPr>
-        <w:rFonts w:ascii="OpenSymbol" w:hAnsi="OpenSymbol" w:cs="OpenSymbol" w:hint="default"/>
-      </w:rPr>
-    </w:lvl>
-    <w:lvl w:ilvl="8">
-      <w:start w:val="1"/>
-      <w:numFmt w:val="bullet"/>
-      <w:lvlText w:val="▪"/>
-      <w:lvlJc w:val="left"/>
-      <w:pPr>
-        <w:tabs>
-          <w:tab w:val="num" w:pos="3600"/>
-        </w:tabs>
-        <w:ind w:left="3600" w:hanging="360"/>
-      </w:pPr>
-      <w:rPr>
-        <w:rFonts w:ascii="OpenSymbol" w:hAnsi="OpenSymbol" w:cs="OpenSymbol" w:hint="default"/>
-      </w:rPr>
-    </w:lvl>
-  </w:abstractNum>
-  <w:abstractNum w:abstractNumId="7">
-    <w:lvl w:ilvl="0">
-      <w:start w:val="1"/>
-      <w:numFmt w:val="bullet"/>
-      <w:lvlText w:val=""/>
-      <w:lvlJc w:val="left"/>
-      <w:pPr>
-        <w:tabs>
-          <w:tab w:val="num" w:pos="720"/>
-        </w:tabs>
-        <w:ind w:left="720" w:hanging="360"/>
-      </w:pPr>
-      <w:rPr>
-        <w:rFonts w:ascii="Symbol" w:hAnsi="Symbol" w:cs="Symbol" w:hint="default"/>
-      </w:rPr>
-    </w:lvl>
-    <w:lvl w:ilvl="1">
-      <w:start w:val="1"/>
-      <w:numFmt w:val="bullet"/>
-      <w:lvlText w:val="◦"/>
-      <w:lvlJc w:val="left"/>
-      <w:pPr>
-        <w:tabs>
-          <w:tab w:val="num" w:pos="1080"/>
-        </w:tabs>
-        <w:ind w:left="1080" w:hanging="360"/>
-      </w:pPr>
-      <w:rPr>
-        <w:rFonts w:ascii="OpenSymbol" w:hAnsi="OpenSymbol" w:cs="OpenSymbol" w:hint="default"/>
-      </w:rPr>
-    </w:lvl>
-    <w:lvl w:ilvl="2">
-      <w:start w:val="1"/>
-      <w:numFmt w:val="bullet"/>
-      <w:lvlText w:val="▪"/>
-      <w:lvlJc w:val="left"/>
-      <w:pPr>
-        <w:tabs>
-          <w:tab w:val="num" w:pos="1440"/>
-        </w:tabs>
-        <w:ind w:left="1440" w:hanging="360"/>
-      </w:pPr>
-      <w:rPr>
-        <w:rFonts w:ascii="OpenSymbol" w:hAnsi="OpenSymbol" w:cs="OpenSymbol" w:hint="default"/>
-      </w:rPr>
-    </w:lvl>
-    <w:lvl w:ilvl="3">
-      <w:start w:val="1"/>
-      <w:numFmt w:val="bullet"/>
-      <w:lvlText w:val=""/>
-      <w:lvlJc w:val="left"/>
-      <w:pPr>
-        <w:tabs>
-          <w:tab w:val="num" w:pos="1800"/>
-        </w:tabs>
-        <w:ind w:left="1800" w:hanging="360"/>
-      </w:pPr>
-      <w:rPr>
-        <w:rFonts w:ascii="Symbol" w:hAnsi="Symbol" w:cs="Symbol" w:hint="default"/>
-      </w:rPr>
-    </w:lvl>
-    <w:lvl w:ilvl="4">
-      <w:start w:val="1"/>
-      <w:numFmt w:val="bullet"/>
-      <w:lvlText w:val="◦"/>
-      <w:lvlJc w:val="left"/>
-      <w:pPr>
-        <w:tabs>
-          <w:tab w:val="num" w:pos="2160"/>
-        </w:tabs>
-        <w:ind w:left="2160" w:hanging="360"/>
-      </w:pPr>
-      <w:rPr>
-        <w:rFonts w:ascii="OpenSymbol" w:hAnsi="OpenSymbol" w:cs="OpenSymbol" w:hint="default"/>
-      </w:rPr>
-    </w:lvl>
-    <w:lvl w:ilvl="5">
-      <w:start w:val="1"/>
-      <w:numFmt w:val="bullet"/>
-      <w:lvlText w:val="▪"/>
-      <w:lvlJc w:val="left"/>
-      <w:pPr>
-        <w:tabs>
-          <w:tab w:val="num" w:pos="2520"/>
-        </w:tabs>
-        <w:ind w:left="2520" w:hanging="360"/>
-      </w:pPr>
-      <w:rPr>
-        <w:rFonts w:ascii="OpenSymbol" w:hAnsi="OpenSymbol" w:cs="OpenSymbol" w:hint="default"/>
-      </w:rPr>
-    </w:lvl>
-    <w:lvl w:ilvl="6">
-      <w:start w:val="1"/>
-      <w:numFmt w:val="bullet"/>
-      <w:lvlText w:val=""/>
-      <w:lvlJc w:val="left"/>
-      <w:pPr>
-        <w:tabs>
-          <w:tab w:val="num" w:pos="2880"/>
-        </w:tabs>
-        <w:ind w:left="2880" w:hanging="360"/>
-      </w:pPr>
-      <w:rPr>
-        <w:rFonts w:ascii="Symbol" w:hAnsi="Symbol" w:cs="Symbol" w:hint="default"/>
-      </w:rPr>
-    </w:lvl>
-    <w:lvl w:ilvl="7">
-      <w:start w:val="1"/>
-      <w:numFmt w:val="bullet"/>
-      <w:lvlText w:val="◦"/>
-      <w:lvlJc w:val="left"/>
-      <w:pPr>
-        <w:tabs>
-          <w:tab w:val="num" w:pos="3240"/>
-        </w:tabs>
-        <w:ind w:left="3240" w:hanging="360"/>
-      </w:pPr>
-      <w:rPr>
-        <w:rFonts w:ascii="OpenSymbol" w:hAnsi="OpenSymbol" w:cs="OpenSymbol" w:hint="default"/>
-      </w:rPr>
-    </w:lvl>
-    <w:lvl w:ilvl="8">
-      <w:start w:val="1"/>
-      <w:numFmt w:val="bullet"/>
-      <w:lvlText w:val="▪"/>
-      <w:lvlJc w:val="left"/>
-      <w:pPr>
-        <w:tabs>
-          <w:tab w:val="num" w:pos="3600"/>
-        </w:tabs>
-        <w:ind w:left="3600" w:hanging="360"/>
-      </w:pPr>
-      <w:rPr>
-        <w:rFonts w:ascii="OpenSymbol" w:hAnsi="OpenSymbol" w:cs="OpenSymbol" w:hint="default"/>
-      </w:rPr>
     </w:lvl>
   </w:abstractNum>
   <w:num w:numId="1">
@@ -3768,7 +3599,7 @@
     <w:abstractNumId w:val="7"/>
   </w:num>
   <w:num w:numId="8">
-    <w:abstractNumId w:val="7"/>
+    <w:abstractNumId w:val="6"/>
     <w:lvlOverride w:ilvl="0">
       <w:startOverride w:val="1"/>
     </w:lvlOverride>
@@ -3880,8 +3711,8 @@
       <w:u w:val="single"/>
     </w:rPr>
   </w:style>
-  <w:style w:type="character" w:styleId="FootnoteCharactersuser">
-    <w:name w:val="Footnote Characters (user)"/>
+  <w:style w:type="character" w:styleId="FootnoteCharacters">
+    <w:name w:val="Footnote Characters"/>
     <w:uiPriority w:val="99"/>
     <w:semiHidden/>
     <w:unhideWhenUsed/>
@@ -3889,8 +3720,8 @@
       <w:vertAlign w:val="superscript"/>
     </w:rPr>
   </w:style>
-  <w:style w:type="character" w:styleId="FootnoteCharacters">
-    <w:name w:val="Footnote Characters"/>
+  <w:style w:type="character" w:styleId="FootnoteCharactersuser">
+    <w:name w:val="Footnote Characters (user)"/>
     <w:rPr>
       <w:vertAlign w:val="superscript"/>
     </w:rPr>
@@ -3912,8 +3743,8 @@
       <w:szCs w:val="20"/>
     </w:rPr>
   </w:style>
-  <w:style w:type="character" w:styleId="EndnoteCharactersuser">
-    <w:name w:val="Endnote Characters (user)"/>
+  <w:style w:type="character" w:styleId="EndnoteCharacters">
+    <w:name w:val="Endnote Characters"/>
     <w:uiPriority w:val="99"/>
     <w:semiHidden/>
     <w:unhideWhenUsed/>
@@ -3921,8 +3752,8 @@
       <w:vertAlign w:val="superscript"/>
     </w:rPr>
   </w:style>
-  <w:style w:type="character" w:styleId="EndnoteCharacters">
-    <w:name w:val="Endnote Characters"/>
+  <w:style w:type="character" w:styleId="EndnoteCharactersuser">
+    <w:name w:val="Endnote Characters (user)"/>
     <w:rPr>
       <w:vertAlign w:val="superscript"/>
     </w:rPr>
@@ -3951,8 +3782,8 @@
       <w:u w:val="single"/>
     </w:rPr>
   </w:style>
-  <w:style w:type="character" w:styleId="Bullets">
-    <w:name w:val="Bullets"/>
+  <w:style w:type="character" w:styleId="Bulletsuser">
+    <w:name w:val="Bullets (user)"/>
     <w:rPr>
       <w:rFonts w:ascii="OpenSymbol" w:hAnsi="OpenSymbol" w:eastAsia="OpenSymbol" w:cs="OpenSymbol"/>
     </w:rPr>

</xml_diff>

<commit_message>
Fixed typo in Monday.com
</commit_message>
<xml_diff>
--- a/cv/Richard Clough cv.docx
+++ b/cv/Richard Clough cv.docx
@@ -878,19 +878,15 @@
           <w:numId w:val="4"/>
         </w:numPr>
         <w:spacing w:before="0" w:after="40"/>
-        <w:rPr/>
-      </w:pPr>
-      <w:r>
         <w:rPr>
           <w:color w:val="000000"/>
         </w:rPr>
+      </w:pPr>
+      <w:r>
+        <w:rPr>
+          <w:color w:val="000000"/>
+        </w:rPr>
         <w:t>Balsamiq, Postman, Monday.com</w:t>
-      </w:r>
-      <w:r>
-        <w:rPr>
-          <w:color w:val="000000"/>
-        </w:rPr>
-        <w:t>s</w:t>
       </w:r>
       <w:r>
         <w:br w:type="page"/>

</xml_diff>